<commit_message>
Playbook: incluye Las Colinas en los textos de marca
Co-Authored-By: Claude Opus 5.5 <noreply@anthropic.com>
Claude-Session: https://claude.ai/code/session_0111i7vn9WWo4QxCQbucWbrF
</commit_message>
<xml_diff>
--- a/playbook/salida/Playbook_Comercial_Cremacion_Vangrupo.docx
+++ b/playbook/salida/Playbook_Comercial_Cremacion_Vangrupo.docx
@@ -135,7 +135,7 @@
                 <w:color w:val="C5A059"/>
                 <w:sz w:val="21"/>
               </w:rPr>
-              <w:t>La Auxiliadora · Hogar de las Memorias · Vangrupo</w:t>
+              <w:t>La Auxiliadora · Hogar de las Memorias · Las Colinas · Vangrupo</w:t>
             </w:r>
           </w:p>
         </w:tc>
@@ -978,7 +978,7 @@
           <w:color w:val="2C3E50"/>
           <w:sz w:val="21"/>
         </w:rPr>
-        <w:t>En La Auxiliadora y Hogar de las Memorias, empresas de Vangrupo, no vendemos nichos, parcelas ni servicios: acompañamos a las familias salvadoreñas a honrar la memoria de quienes aman. La cremación es una decisión cada vez más elegida, y nuestros nuevos jardines de cenizas responden a una pregunta que muchas familias se hacen y pocas se atreven a decir: «¿y después de la cremación, dónde las visitamos?».</w:t>
+        <w:t>En La Auxiliadora, Hogar de las Memorias y Parque Memorial Las Colinas, empresas de Vangrupo, no vendemos nichos, parcelas ni servicios: acompañamos a las familias salvadoreñas a honrar la memoria de quienes aman. La cremación es una decisión cada vez más elegida, y nuestros nuevos jardines de cenizas responden a una pregunta que muchas familias se hacen y pocas se atreven a decir: «¿y después de la cremación, dónde las visitamos?».</w:t>
       </w:r>
     </w:p>
     <w:p>
@@ -9986,7 +9986,7 @@
                 <w:color w:val="2C3E50"/>
                 <w:sz w:val="20"/>
               </w:rPr>
-              <w:t>Somos La Auxiliadora y Hogar de las Memorias, empresas de Vangrupo con trayectoria en El Salvador. El contrato es transparente y puede visitar el jardín cuando quiera.</w:t>
+              <w:t>Somos La Auxiliadora, Hogar de las Memorias y Las Colinas, empresas de Vangrupo con trayectoria en El Salvador. El contrato es transparente y puede visitar el jardín cuando quiera.</w:t>
             </w:r>
           </w:p>
         </w:tc>
@@ -14352,7 +14352,7 @@
                 <w:color w:val="C5A059"/>
                 <w:sz w:val="19"/>
               </w:rPr>
-              <w:t>La Auxiliadora · Hogar de las Memorias · Vangrupo</w:t>
+              <w:t>La Auxiliadora · Hogar de las Memorias · Las Colinas · Vangrupo</w:t>
             </w:r>
           </w:p>
         </w:tc>
@@ -14385,7 +14385,7 @@
         <w:color w:val="7A8794"/>
         <w:sz w:val="16"/>
       </w:rPr>
-      <w:t>Playbook Comercial · La Auxiliadora · Hogar de las Memorias · Vangrupo · Uso interno</w:t>
+      <w:t>Playbook Comercial · La Auxiliadora · Hogar de las Memorias · Las Colinas · Vangrupo · Uso interno</w:t>
     </w:r>
   </w:p>
 </w:ftr>

</xml_diff>

<commit_message>
Quita los valores de cuota mensual: pago en hasta 120 meses con intereses
- Ficha técnica: sin cuota aprox. en condiciones, precio de lanzamiento ni cuota referencial
- Comisiones: quita el valor estimado de las 10 primeras cuotas
- Playbook: speech, objeción, tabla de precios y herramientas sin valor de cuota

Co-Authored-By: Claude Opus 5.5 <noreply@anthropic.com>
Claude-Session: https://claude.ai/code/session_0111i7vn9WWo4QxCQbucWbrF
</commit_message>
<xml_diff>
--- a/playbook/salida/Playbook_Comercial_Cremacion_Vangrupo.docx
+++ b/playbook/salida/Playbook_Comercial_Cremacion_Vangrupo.docx
@@ -3251,7 +3251,7 @@
           <w:color w:val="7A8794"/>
           <w:sz w:val="19"/>
         </w:rPr>
-        <w:t>Hasta 120 cuotas mensuales (≈ US$ 8,50/mes)</w:t>
+        <w:t>Pago en hasta 120 meses, con intereses</w:t>
       </w:r>
     </w:p>
     <w:p>
@@ -3670,7 +3670,7 @@
                 <w:color w:val="2C3E50"/>
                 <w:sz w:val="21"/>
               </w:rPr>
-              <w:t>«Usted ya protegió a su familia con su plan. Por menos de lo que cuesta un refresco a la semana, alrededor de ocho dólares al mes, puede sumar la cremación completa, con urna, trámites y un año de columbario incluido. Así nadie tendrá que decidir ni pagar de golpe en un momento difícil.»</w:t>
+              <w:t>«Usted ya protegió a su familia con su plan. Pagando en hasta 120 meses, puede sumar la cremación completa, con urna, trámites y un año de columbario incluido. Así nadie tendrá que decidir ni pagar de golpe en un momento difícil.»</w:t>
             </w:r>
           </w:p>
         </w:tc>
@@ -8874,7 +8874,7 @@
                 <w:color w:val="2C3E50"/>
                 <w:sz w:val="20"/>
               </w:rPr>
-              <w:t>En la urgencia los costos son mayores y se pagan de golpe. Hoy fija el precio y lo paga en cuotas: la Solución Modular cuesta alrededor de US$ 8,50 al mes.</w:t>
+              <w:t>En la urgencia los costos son mayores y se pagan de golpe. Hoy fija el precio y lo paga en cuotas: la Solución Modular se paga en hasta 120 meses.</w:t>
             </w:r>
           </w:p>
         </w:tc>
@@ -8951,7 +8951,7 @@
                 <w:color w:val="2C3E50"/>
                 <w:sz w:val="20"/>
               </w:rPr>
-              <w:t>«¿Qué cuota mensual le resultaría cómoda?»</w:t>
+              <w:t>«¿Le resulta más cómodo pagarlo en cuotas mensuales?»</w:t>
             </w:r>
           </w:p>
         </w:tc>
@@ -10375,7 +10375,7 @@
                 <w:color w:val="2C3E50"/>
                 <w:sz w:val="19"/>
               </w:rPr>
-              <w:t>Hasta 120 cuotas (≈ US$ 8,50/mes)</w:t>
+              <w:t>Hasta 120 meses, con intereses</w:t>
             </w:r>
           </w:p>
         </w:tc>
@@ -14006,7 +14006,7 @@
                 <w:color w:val="1B365D"/>
                 <w:sz w:val="19"/>
               </w:rPr>
-              <w:t>Simulación de cuotas</w:t>
+              <w:t>Plazo de pago</w:t>
             </w:r>
           </w:p>
         </w:tc>
@@ -14039,7 +14039,7 @@
                 <w:color w:val="2C3E50"/>
                 <w:sz w:val="19"/>
               </w:rPr>
-              <w:t>Calcule la cuota con el cliente: transparencia genera confianza.</w:t>
+              <w:t>Explique que se paga en hasta 120 meses con intereses; no prometa un valor de cuota.</w:t>
             </w:r>
           </w:p>
         </w:tc>

</xml_diff>

<commit_message>
Playbook: actualización completa según la ficha técnica
- Precio de lanzamiento (−20%) en cada producto, tabla y regla de descuentos
- Individual y Familiar: 30 años desde la primera inhumación, renovables
- Mantenimiento Familiar US$ 24
- Mascotas: US$ 550 con cremación y urna; placa memorial incluida en ambas opciones
- Columbario de la Solución Modular en Hogar de las Memorias
- Versión 1.1

Co-Authored-By: Claude Opus 5.5 <noreply@anthropic.com>
Claude-Session: https://claude.ai/code/session_0111i7vn9WWo4QxCQbucWbrF
</commit_message>
<xml_diff>
--- a/playbook/salida/Playbook_Comercial_Cremacion_Vangrupo.docx
+++ b/playbook/salida/Playbook_Comercial_Cremacion_Vangrupo.docx
@@ -175,7 +175,7 @@
           <w:color w:val="7A8794"/>
           <w:sz w:val="18"/>
         </w:rPr>
-        <w:t>Versión 1.0 · Octubre 2026 · Uso interno del equipo comercial</w:t>
+        <w:t>Versión 1.1 · Octubre 2026 · Uso interno del equipo comercial</w:t>
       </w:r>
     </w:p>
     <w:p>
@@ -260,7 +260,7 @@
                 <w:color w:val="1B365D"/>
                 <w:sz w:val="18"/>
               </w:rPr>
-              <w:t>PENDIENTES DE VALIDACIÓN (VERSIÓN 1.0)</w:t>
+              <w:t>PENDIENTES DE VALIDACIÓN (VERSIÓN 1.1)</w:t>
             </w:r>
           </w:p>
           <w:p>
@@ -286,31 +286,6 @@
                 <w:sz w:val="20"/>
               </w:rPr>
               <w:t>Política de comisiones: 8% en todos los productos. Confirmar con el Gerente Comercial antes de aplicar.</w:t>
-            </w:r>
-          </w:p>
-          <w:p>
-            <w:pPr>
-              <w:spacing w:after="60"/>
-            </w:pPr>
-            <w:r>
-              <w:rPr>
-                <w:rFonts w:ascii="Montserrat" w:hAnsi="Montserrat" w:eastAsia="Montserrat"/>
-                <w:b w:val="0"/>
-                <w:i w:val="0"/>
-                <w:color w:val="C5A059"/>
-                <w:sz w:val="15"/>
-              </w:rPr>
-              <w:t xml:space="preserve">■  </w:t>
-            </w:r>
-            <w:r>
-              <w:rPr>
-                <w:rFonts w:ascii="Montserrat" w:hAnsi="Montserrat" w:eastAsia="Montserrat"/>
-                <w:b w:val="0"/>
-                <w:i w:val="0"/>
-                <w:color w:val="2C3E50"/>
-                <w:sz w:val="20"/>
-              </w:rPr>
-              <w:t>Jardín de Mascotas: confirmar si la urna biodegradable está incluida en el precio.</w:t>
             </w:r>
           </w:p>
           <w:p>
@@ -989,7 +964,7 @@
       <w:r>
         <w:drawing>
           <wp:inline xmlns:a="http://schemas.openxmlformats.org/drawingml/2006/main" xmlns:pic="http://schemas.openxmlformats.org/drawingml/2006/picture">
-            <wp:extent cx="6120000" cy="2664750"/>
+            <wp:extent cx="6120000" cy="2766750"/>
             <wp:docPr id="2" name="Picture 2"/>
             <wp:cNvGraphicFramePr>
               <a:graphicFrameLocks noChangeAspect="1"/>
@@ -1010,7 +985,7 @@
                   <pic:spPr>
                     <a:xfrm>
                       <a:off x="0" y="0"/>
-                      <a:ext cx="6120000" cy="2664750"/>
+                      <a:ext cx="6120000" cy="2766750"/>
                     </a:xfrm>
                     <a:prstGeom prst="rect"/>
                   </pic:spPr>
@@ -1163,7 +1138,7 @@
                 <w:color w:val="2C3E50"/>
                 <w:sz w:val="20"/>
               </w:rPr>
-              <w:t>Desde US$ 400 y con financiamiento: un destino final al alcance de más familias.</w:t>
+              <w:t>Desde US$ 320 en lanzamiento y con financiamiento: un destino final al alcance de más familias.</w:t>
             </w:r>
           </w:p>
         </w:tc>
@@ -3251,7 +3226,7 @@
           <w:color w:val="7A8794"/>
           <w:sz w:val="19"/>
         </w:rPr>
-        <w:t>Pago en hasta 120 meses, con intereses</w:t>
+        <w:t>Lanzamiento (−20%): US$ 800 · Pago en hasta 120 meses, con intereses</w:t>
       </w:r>
     </w:p>
     <w:p>
@@ -3455,7 +3430,7 @@
                 <w:color w:val="2C3E50"/>
                 <w:sz w:val="19"/>
               </w:rPr>
-              <w:t>Alquiler temporal de columbario por 1 año (nivel 1, Hogar de las Memorias)</w:t>
+              <w:t>Alquiler temporal de columbario por 1 año en Hogar de las Memorias</w:t>
             </w:r>
           </w:p>
         </w:tc>
@@ -4043,7 +4018,7 @@
           <w:color w:val="7A8794"/>
           <w:sz w:val="19"/>
         </w:rPr>
-        <w:t>Pago único o financiado · Mantenimiento US$ 15/año</w:t>
+        <w:t>Lanzamiento (−20%): US$ 480 · Pago único o financiado · Mantenimiento US$ 15/año</w:t>
       </w:r>
     </w:p>
     <w:p>
@@ -4068,7 +4043,7 @@
           <w:color w:val="2C3E50"/>
           <w:sz w:val="21"/>
         </w:rPr>
-        <w:t>Inhumación de la urna en un contenedor enterrado con tapa de granito grabada, en un jardín de plantas de sombra: un lugar permanente para visitar.</w:t>
+        <w:t>Inhumación de la urna en un contenedor enterrado con tapa de granito grabada, en un jardín de plantas de sombra: un lugar para visitar por 30 años desde la primera inhumación, renovable.</w:t>
       </w:r>
     </w:p>
     <w:p>
@@ -4093,7 +4068,7 @@
           <w:color w:val="2C3E50"/>
           <w:sz w:val="21"/>
         </w:rPr>
-        <w:t>Familias que quieren un lugar permanente para visitar, con una inversión moderada.</w:t>
+        <w:t>Familias que quieren un lugar propio para visitar, con una inversión moderada.</w:t>
       </w:r>
     </w:p>
     <w:tbl>
@@ -4338,7 +4313,7 @@
                 <w:color w:val="2C3E50"/>
                 <w:sz w:val="19"/>
               </w:rPr>
-              <w:t>Cuota de mantenimiento anual: US$ 15.</w:t>
+              <w:t>Cuota de mantenimiento anual: US$ 15. Permanencia: 30 años desde la primera inhumación, renovable.</w:t>
             </w:r>
           </w:p>
           <w:p>
@@ -4809,7 +4784,7 @@
           <w:color w:val="7A8794"/>
           <w:sz w:val="19"/>
         </w:rPr>
-        <w:t>Pago único o financiado · Mantenimiento US$ 25/año</w:t>
+        <w:t>Lanzamiento (−20%): US$ 1.600 · Pago único o financiado · Mantenimiento US$ 24/año</w:t>
       </w:r>
     </w:p>
     <w:p>
@@ -4834,7 +4809,7 @@
           <w:color w:val="2C3E50"/>
           <w:sz w:val="21"/>
         </w:rPr>
-        <w:t>Parcela familiar en el Jardín 1 con cuatro contenedores agrupados, cada uno con tapa de granito grabada. Sin plazo de permanencia.</w:t>
+        <w:t>Parcela familiar en el Jardín 1 con cuatro contenedores agrupados, cada uno con tapa de granito grabada. Permanencia de 30 años desde la primera inhumación, renovable.</w:t>
       </w:r>
     </w:p>
     <w:p>
@@ -4859,7 +4834,7 @@
           <w:color w:val="2C3E50"/>
           <w:sz w:val="21"/>
         </w:rPr>
-        <w:t>Familias que buscan un espacio propio y permanente para varias generaciones.</w:t>
+        <w:t>Familias que buscan un espacio propio para varias generaciones.</w:t>
       </w:r>
     </w:p>
     <w:tbl>
@@ -5013,7 +4988,7 @@
                 <w:color w:val="2C3E50"/>
                 <w:sz w:val="19"/>
               </w:rPr>
-              <w:t>Lugar permanente de homenaje familiar, sin plazo</w:t>
+              <w:t>Lugar de homenaje familiar por 30 años, renovable por igual período</w:t>
             </w:r>
           </w:p>
         </w:tc>
@@ -5104,7 +5079,7 @@
                 <w:color w:val="2C3E50"/>
                 <w:sz w:val="19"/>
               </w:rPr>
-              <w:t>Permanencia: sin plazo.</w:t>
+              <w:t>Permanencia: 30 años desde la primera inhumación, renovable por igual período.</w:t>
             </w:r>
           </w:p>
           <w:p>
@@ -5130,7 +5105,7 @@
                 <w:color w:val="2C3E50"/>
                 <w:sz w:val="19"/>
               </w:rPr>
-              <w:t>Cuota de mantenimiento anual: US$ 25 por parcela.</w:t>
+              <w:t>Cuota de mantenimiento anual: US$ 24 por parcela.</w:t>
             </w:r>
           </w:p>
         </w:tc>
@@ -5202,7 +5177,7 @@
                 <w:color w:val="2C3E50"/>
                 <w:sz w:val="21"/>
               </w:rPr>
-              <w:t>«Así como una familia comparte una casa, también puede compartir un lugar de memoria. La parcela familiar reúne hasta cuatro seres queridos en un mismo espacio, para siempre, y cuesta US$ 500 por espacio, menos que comprarlos por separado.»</w:t>
+              <w:t>«Así como una familia comparte una casa, también puede compartir un lugar de memoria. La parcela familiar reúne hasta cuatro seres queridos en un mismo espacio, por 30 años renovables, y cuesta US$ 500 por espacio (US$ 400 con el precio de lanzamiento), menos que comprarlos por separado.»</w:t>
             </w:r>
           </w:p>
         </w:tc>
@@ -5575,7 +5550,7 @@
           <w:color w:val="7A8794"/>
           <w:sz w:val="19"/>
         </w:rPr>
-        <w:t>Pago único o financiado · Placa memorial incluida</w:t>
+        <w:t>Lanzamiento (−20%): US$ 600 · Pago único o financiado · Placa memorial incluida</w:t>
       </w:r>
     </w:p>
     <w:p>
@@ -6423,7 +6398,7 @@
           <w:color w:val="7A8794"/>
           <w:sz w:val="19"/>
         </w:rPr>
-        <w:t>US$ 400 solo espacio · US$ 550 con placa memorial incluida</w:t>
+        <w:t>Lanzamiento (−20%): US$ 320 / US$ 440 · US$ 400 solo espacio · US$ 550 con cremación</w:t>
       </w:r>
     </w:p>
     <w:p>
@@ -6448,7 +6423,7 @@
           <w:color w:val="2C3E50"/>
           <w:sz w:val="21"/>
         </w:rPr>
-        <w:t>Inhumación ecológica de las cenizas de la mascota: la urna biodegradable se entierra en el jardín y se identifica con una placa de madera.</w:t>
+        <w:t>Inhumación ecológica de las cenizas de la mascota: la urna biodegradable se entierra en el jardín y se identifica con una placa de madera. La opción de US$ 550 incluye también la cremación de la mascota.</w:t>
       </w:r>
     </w:p>
     <w:p>
@@ -6549,7 +6524,7 @@
                 <w:color w:val="2C3E50"/>
                 <w:sz w:val="19"/>
               </w:rPr>
-              <w:t>Inhumación ecológica en el jardín de mascotas</w:t>
+              <w:t>Inhumación ecológica en el jardín de mascotas; cremación y urna biodegradable en la opción de US$ 550</w:t>
             </w:r>
           </w:p>
           <w:p>
@@ -6627,7 +6602,7 @@
                 <w:color w:val="2C3E50"/>
                 <w:sz w:val="19"/>
               </w:rPr>
-              <w:t>Placa memorial en el monumento al término del plazo (opción US$ 550)</w:t>
+              <w:t>Placa memorial en el monumento al término del plazo (incluida)</w:t>
             </w:r>
           </w:p>
         </w:tc>
@@ -6744,7 +6719,7 @@
                 <w:color w:val="2C3E50"/>
                 <w:sz w:val="19"/>
               </w:rPr>
-              <w:t>Placa memorial en el monumento: incluida solo en la opción de US$ 550.</w:t>
+              <w:t>Placa memorial incluida. Urna biodegradable incluida solo con cremación (US$ 550); con solo espacio (US$ 400) se compra aparte.</w:t>
             </w:r>
           </w:p>
           <w:p>
@@ -6917,7 +6892,7 @@
           <w:color w:val="2C3E50"/>
           <w:sz w:val="20"/>
         </w:rPr>
-        <w:t>¿Les gustaría que su nombre quede para siempre en el monumento memorial?</w:t>
+        <w:t>¿Ya se realizó la cremación o necesitan también ese servicio?</w:t>
       </w:r>
     </w:p>
     <w:p>
@@ -6973,7 +6948,7 @@
           <w:color w:val="1B365D"/>
           <w:sz w:val="21"/>
         </w:rPr>
-        <w:t>«¿Prefieren la opción con placa memorial incluida, para que su nombre quede siempre en el jardín?»</w:t>
+        <w:t>«¿Prefieren la opción con cremación incluida, para resolver todo en un solo paso?»</w:t>
       </w:r>
     </w:p>
     <w:p>
@@ -9708,7 +9683,7 @@
                 <w:color w:val="2C3E50"/>
                 <w:sz w:val="20"/>
               </w:rPr>
-              <w:t>La cuota (US$ 15 o US$ 25 al año) mantiene el jardín siempre cuidado: poda, riego y limpieza. Es lo que garantiza que el lugar luzca digno en cada visita.</w:t>
+              <w:t>La cuota (US$ 15 o US$ 24 al año) mantiene el jardín siempre cuidado: poda, riego y limpieza. Es lo que garantiza que el lugar luzca digno en cada visita.</w:t>
             </w:r>
           </w:p>
         </w:tc>
@@ -10342,7 +10317,7 @@
                 <w:color w:val="2C3E50"/>
                 <w:sz w:val="19"/>
               </w:rPr>
-              <w:t>US$ 1.000</w:t>
+              <w:t>US$ 1.000 · lanz. US$ 800</w:t>
             </w:r>
           </w:p>
         </w:tc>
@@ -10509,7 +10484,7 @@
                 <w:color w:val="2C3E50"/>
                 <w:sz w:val="19"/>
               </w:rPr>
-              <w:t>US$ 600</w:t>
+              <w:t>US$ 600 · lanz. US$ 480</w:t>
             </w:r>
           </w:p>
         </w:tc>
@@ -10608,7 +10583,7 @@
                 <w:color w:val="2C3E50"/>
                 <w:sz w:val="19"/>
               </w:rPr>
-              <w:t>Sin plazo</w:t>
+              <w:t>30 años, renovable</w:t>
             </w:r>
           </w:p>
         </w:tc>
@@ -10676,7 +10651,7 @@
                 <w:color w:val="2C3E50"/>
                 <w:sz w:val="19"/>
               </w:rPr>
-              <w:t>US$ 2.000</w:t>
+              <w:t>US$ 2.000 · lanz. US$ 1.600</w:t>
             </w:r>
           </w:p>
         </w:tc>
@@ -10742,7 +10717,7 @@
                 <w:color w:val="2C3E50"/>
                 <w:sz w:val="19"/>
               </w:rPr>
-              <w:t>US$ 25/año</w:t>
+              <w:t>US$ 24/año</w:t>
             </w:r>
           </w:p>
         </w:tc>
@@ -10775,7 +10750,7 @@
                 <w:color w:val="2C3E50"/>
                 <w:sz w:val="19"/>
               </w:rPr>
-              <w:t>Hasta 4 espacios, sin plazo</w:t>
+              <w:t>Hasta 4 espacios · 30 años, renovable</w:t>
             </w:r>
           </w:p>
         </w:tc>
@@ -10843,7 +10818,7 @@
                 <w:color w:val="2C3E50"/>
                 <w:sz w:val="19"/>
               </w:rPr>
-              <w:t>US$ 750</w:t>
+              <w:t>US$ 750 · lanz. US$ 600</w:t>
             </w:r>
           </w:p>
         </w:tc>
@@ -11010,7 +10985,7 @@
                 <w:color w:val="2C3E50"/>
                 <w:sz w:val="19"/>
               </w:rPr>
-              <w:t>US$ 400 / 550</w:t>
+              <w:t>US$ 400 / 550 · lanz. US$ 320 / 440</w:t>
             </w:r>
           </w:p>
         </w:tc>
@@ -11109,7 +11084,7 @@
                 <w:color w:val="2C3E50"/>
                 <w:sz w:val="19"/>
               </w:rPr>
-              <w:t>3 años · placa incluida en la opción de US$ 550</w:t>
+              <w:t>3 años · placa incluida · cremación y urna en la opción de US$ 550</w:t>
             </w:r>
           </w:p>
         </w:tc>
@@ -11501,7 +11476,7 @@
                 <w:color w:val="2C3E50"/>
                 <w:sz w:val="19"/>
               </w:rPr>
-              <w:t>Prenecesidad: hasta 20% según la campaña del mes. Emergencia: máximo 5%. Siempre con autorización del supervisor.</w:t>
+              <w:t>Precio de lanzamiento: 20% de descuento especial en todos los productos (ver Ficha Técnica). Cualquier otro descuento, solo con autorización del supervisor (emergencia: máximo 5%).</w:t>
             </w:r>
           </w:p>
         </w:tc>
@@ -11569,7 +11544,7 @@
                 <w:color w:val="2C3E50"/>
                 <w:sz w:val="19"/>
               </w:rPr>
-              <w:t>Individual US$ 15/año y Familiar US$ 25/año. No es opcional: se explica antes de firmar.</w:t>
+              <w:t>Individual US$ 15/año y Familiar US$ 24/año. No es opcional: se explica antes de firmar.</w:t>
             </w:r>
           </w:p>
         </w:tc>
@@ -11604,7 +11579,7 @@
                 <w:color w:val="1B365D"/>
                 <w:sz w:val="19"/>
               </w:rPr>
-              <w:t>Plazo de 3 años</w:t>
+              <w:t>Plazos</w:t>
             </w:r>
           </w:p>
         </w:tc>
@@ -11637,7 +11612,7 @@
                 <w:color w:val="2C3E50"/>
                 <w:sz w:val="19"/>
               </w:rPr>
-              <w:t>Ecológico y Mascotas: se explica con total transparencia en la primera conversación.</w:t>
+              <w:t>Individual y Familiar: 30 años desde la primera inhumación, renovables. Ecológico y Mascotas: 3 años. Se explica con total transparencia en la primera conversación.</w:t>
             </w:r>
           </w:p>
         </w:tc>
@@ -11705,7 +11680,7 @@
                 <w:color w:val="2C3E50"/>
                 <w:sz w:val="19"/>
               </w:rPr>
-              <w:t>Incluida en el Jardín Ecológico (US$ 750) y en la opción de Mascotas de US$ 550.</w:t>
+              <w:t>Incluida en el Jardín Ecológico y en el Jardín de Mascotas.</w:t>
             </w:r>
           </w:p>
         </w:tc>
@@ -13107,7 +13082,7 @@
                 <w:color w:val="1B365D"/>
                 <w:sz w:val="19"/>
               </w:rPr>
-              <w:t>Mascotas · con placa</w:t>
+              <w:t>Mascotas · jardín + cremación</w:t>
             </w:r>
           </w:p>
         </w:tc>
@@ -13508,7 +13483,7 @@
           <w:color w:val="2C3E50"/>
           <w:sz w:val="21"/>
         </w:rPr>
-        <w:t>No generan comisión: cuotas de mantenimiento anual (US$ 15 / US$ 25).</w:t>
+        <w:t>No generan comisión: cuotas de mantenimiento anual (US$ 15 / US$ 24).</w:t>
       </w:r>
     </w:p>
     <w:p>
@@ -14039,7 +14014,7 @@
                 <w:color w:val="2C3E50"/>
                 <w:sz w:val="19"/>
               </w:rPr>
-              <w:t>Explique que se paga en hasta 120 meses con intereses; no prometa un valor de cuota.</w:t>
+              <w:t>Comunique que se paga en hasta 120 meses con intereses; no prometa un valor de cuota.</w:t>
             </w:r>
           </w:p>
         </w:tc>
@@ -14181,7 +14156,7 @@
           <w:color w:val="2C3E50"/>
           <w:sz w:val="21"/>
         </w:rPr>
-        <w:t>Expliqué la cuota de mantenimiento o el plazo de 3 años, según el caso.</w:t>
+        <w:t>Expliqué la cuota de mantenimiento y el plazo (30 años renovables o 3 años), según el caso.</w:t>
       </w:r>
     </w:p>
     <w:p>

</xml_diff>

<commit_message>
Playbook: agrega el portafolio existente de columbarios
Cinco columbarios (Supremo Plus, Mármol o Cristal, Ónix, Obra de Arte y
Bella Vista) con discurso, reglas y tabla de precios; −15% en Finados y
noviembre, pago hasta 120 meses y comisión a definir.

Co-Authored-By: Claude Opus 5.5 <noreply@anthropic.com>
Claude-Session: https://claude.ai/code/session_0111i7vn9WWo4QxCQbucWbrF
</commit_message>
<xml_diff>
--- a/playbook/salida/Playbook_Comercial_Cremacion_Vangrupo.docx
+++ b/playbook/salida/Playbook_Comercial_Cremacion_Vangrupo.docx
@@ -3573,7 +3573,7 @@
                 <w:color w:val="2C3E50"/>
                 <w:sz w:val="19"/>
               </w:rPr>
-              <w:t>El columbario temporal es por 12 meses; al término, la familia elige destino final (oportunidad para ofrecer un Jardín de Cenizas).</w:t>
+              <w:t>El columbario temporal es por 12 meses; al término, la familia elige destino final (oportunidad para ofrecer un Jardín de Cenizas o un columbario).</w:t>
             </w:r>
           </w:p>
         </w:tc>
@@ -7722,6 +7722,3705 @@
     </w:p>
     <w:p>
       <w:pPr>
+        <w:pStyle w:val="Heading2"/>
+        <w:spacing w:before="0" w:after="80"/>
+      </w:pPr>
+      <w:r>
+        <w:rPr>
+          <w:rFonts w:ascii="Playfair Display" w:hAnsi="Playfair Display" w:eastAsia="Playfair Display"/>
+          <w:b/>
+          <w:i w:val="0"/>
+          <w:color w:val="1B365D"/>
+          <w:sz w:val="28"/>
+        </w:rPr>
+        <w:t>Portafolio existente: columbarios (−15% en Finados y noviembre)</w:t>
+      </w:r>
+    </w:p>
+    <w:p>
+      <w:pPr>
+        <w:spacing w:before="0" w:after="120" w:line="276" w:lineRule="auto"/>
+      </w:pPr>
+      <w:r>
+        <w:rPr>
+          <w:rFonts w:ascii="Montserrat" w:hAnsi="Montserrat" w:eastAsia="Montserrat"/>
+          <w:b w:val="0"/>
+          <w:i w:val="0"/>
+          <w:color w:val="2C3E50"/>
+          <w:sz w:val="21"/>
+        </w:rPr>
+        <w:t>Además de los lanzamientos, el portafolio de cremación incluye los columbarios que ya vendemos en El Hogar de las Memorias y en el mausoleo vertical Bella Vista. En Finados y durante noviembre tienen 15% de descuento. Se pagan al contado o financiados en hasta 120 meses, con intereses.</w:t>
+      </w:r>
+    </w:p>
+    <w:tbl>
+      <w:tblPr>
+        <w:tblW w:type="auto" w:w="0"/>
+        <w:jc w:val="center"/>
+        <w:tblLayout w:type="fixed"/>
+        <w:tblLook w:firstColumn="1" w:firstRow="1" w:lastColumn="0" w:lastRow="0" w:noHBand="0" w:noVBand="1" w:val="04A0"/>
+      </w:tblPr>
+      <w:tblGrid>
+        <w:gridCol w:w="9746"/>
+      </w:tblGrid>
+      <w:tr>
+        <w:tc>
+          <w:tcPr>
+            <w:tcW w:type="dxa" w:w="9638"/>
+            <w:tcMar>
+              <w:top w:w="124" w:type="dxa"/>
+              <w:left w:w="124" w:type="dxa"/>
+              <w:bottom w:w="124" w:type="dxa"/>
+              <w:right w:w="124" w:type="dxa"/>
+            </w:tcMar>
+            <w:shd w:val="clear" w:color="auto" w:fill="FBF3E1"/>
+            <w:tcBorders>
+              <w:top w:val="nil"/>
+              <w:left w:val="single" w:sz="36" w:color="C5A059"/>
+              <w:bottom w:val="nil"/>
+              <w:right w:val="nil"/>
+            </w:tcBorders>
+            <w:tcMar>
+              <w:top w:w="198" w:type="dxa"/>
+              <w:left w:w="198" w:type="dxa"/>
+              <w:bottom w:w="198" w:type="dxa"/>
+              <w:right w:w="198" w:type="dxa"/>
+            </w:tcMar>
+          </w:tcPr>
+          <w:p>
+            <w:pPr>
+              <w:spacing w:after="40"/>
+            </w:pPr>
+            <w:r>
+              <w:rPr>
+                <w:rFonts w:ascii="Montserrat" w:hAnsi="Montserrat" w:eastAsia="Montserrat"/>
+                <w:b/>
+                <w:i w:val="0"/>
+                <w:color w:val="1B365D"/>
+                <w:sz w:val="18"/>
+              </w:rPr>
+              <w:t>UBICACIÓN DEFINIDA O A FUTURO</w:t>
+            </w:r>
+          </w:p>
+          <w:p>
+            <w:pPr>
+              <w:spacing w:after="40"/>
+            </w:pPr>
+            <w:r>
+              <w:rPr>
+                <w:rFonts w:ascii="Montserrat" w:hAnsi="Montserrat" w:eastAsia="Montserrat"/>
+                <w:b w:val="0"/>
+                <w:i w:val="0"/>
+                <w:color w:val="2C3E50"/>
+                <w:sz w:val="21"/>
+              </w:rPr>
+              <w:t>Ubicación definida: el nicho se elige al contratar. Ubicación a futuro: se compra hoy y el nicho se asigna más adelante. El precio varía según la fila y el nivel.</w:t>
+            </w:r>
+          </w:p>
+        </w:tc>
+      </w:tr>
+    </w:tbl>
+    <w:p>
+      <w:pPr>
+        <w:spacing w:before="0" w:after="80" w:line="276" w:lineRule="auto"/>
+      </w:pPr>
+    </w:p>
+    <w:tbl>
+      <w:tblPr>
+        <w:tblW w:type="auto" w:w="0"/>
+        <w:jc w:val="center"/>
+        <w:tblLayout w:type="fixed"/>
+        <w:tblLook w:firstColumn="1" w:firstRow="1" w:lastColumn="0" w:lastRow="0" w:noHBand="0" w:noVBand="1" w:val="04A0"/>
+      </w:tblPr>
+      <w:tblGrid>
+        <w:gridCol w:w="4873"/>
+        <w:gridCol w:w="4873"/>
+      </w:tblGrid>
+      <w:tr>
+        <w:tc>
+          <w:tcPr>
+            <w:tcW w:type="dxa" w:w="6520"/>
+            <w:tcMar>
+              <w:top w:w="124" w:type="dxa"/>
+              <w:left w:w="124" w:type="dxa"/>
+              <w:bottom w:w="124" w:type="dxa"/>
+              <w:right w:w="124" w:type="dxa"/>
+            </w:tcMar>
+            <w:shd w:val="clear" w:color="auto" w:fill="1B365D"/>
+            <w:tcBorders>
+              <w:top w:val="nil"/>
+              <w:left w:val="nil"/>
+              <w:bottom w:val="single" w:sz="36" w:color="C5A059"/>
+              <w:right w:val="nil"/>
+            </w:tcBorders>
+            <w:tcMar>
+              <w:top w:w="226" w:type="dxa"/>
+              <w:left w:w="226" w:type="dxa"/>
+              <w:bottom w:w="226" w:type="dxa"/>
+              <w:right w:w="226" w:type="dxa"/>
+            </w:tcMar>
+          </w:tcPr>
+          <w:p>
+            <w:pPr>
+              <w:spacing w:after="40"/>
+            </w:pPr>
+            <w:r>
+              <w:rPr>
+                <w:rFonts w:ascii="Montserrat" w:hAnsi="Montserrat" w:eastAsia="Montserrat"/>
+                <w:b/>
+                <w:i w:val="0"/>
+                <w:color w:val="C5A059"/>
+                <w:sz w:val="17"/>
+              </w:rPr>
+              <w:t>HOGAR DE LAS MEMORIAS · FUNERAL + CREMACIÓN + COLUMBARIO</w:t>
+            </w:r>
+          </w:p>
+          <w:p>
+            <w:r>
+              <w:rPr>
+                <w:rFonts w:ascii="Playfair Display" w:hAnsi="Playfair Display" w:eastAsia="Playfair Display"/>
+                <w:b/>
+                <w:i w:val="0"/>
+                <w:color w:val="FFFFFF"/>
+                <w:sz w:val="36"/>
+              </w:rPr>
+              <w:t>Columbario Supremo Plus</w:t>
+            </w:r>
+          </w:p>
+        </w:tc>
+        <w:tc>
+          <w:tcPr>
+            <w:tcW w:type="dxa" w:w="3118"/>
+            <w:tcMar>
+              <w:top w:w="124" w:type="dxa"/>
+              <w:left w:w="124" w:type="dxa"/>
+              <w:bottom w:w="124" w:type="dxa"/>
+              <w:right w:w="124" w:type="dxa"/>
+            </w:tcMar>
+            <w:shd w:val="clear" w:color="auto" w:fill="1B365D"/>
+            <w:tcBorders>
+              <w:top w:val="nil"/>
+              <w:left w:val="nil"/>
+              <w:bottom w:val="single" w:sz="36" w:color="C5A059"/>
+              <w:right w:val="nil"/>
+            </w:tcBorders>
+            <w:tcMar>
+              <w:top w:w="226" w:type="dxa"/>
+              <w:left w:w="226" w:type="dxa"/>
+              <w:bottom w:w="226" w:type="dxa"/>
+              <w:right w:w="226" w:type="dxa"/>
+            </w:tcMar>
+          </w:tcPr>
+          <w:p>
+            <w:pPr>
+              <w:spacing w:after="40"/>
+              <w:jc w:val="right"/>
+            </w:pPr>
+            <w:r>
+              <w:rPr>
+                <w:rFonts w:ascii="Montserrat" w:hAnsi="Montserrat" w:eastAsia="Montserrat"/>
+                <w:b/>
+                <w:i w:val="0"/>
+                <w:color w:val="C5A059"/>
+                <w:sz w:val="17"/>
+              </w:rPr>
+              <w:t>PRECIO SEGÚN UBICACIÓN</w:t>
+            </w:r>
+          </w:p>
+          <w:p>
+            <w:pPr>
+              <w:jc w:val="right"/>
+            </w:pPr>
+            <w:r>
+              <w:rPr>
+                <w:rFonts w:ascii="Montserrat" w:hAnsi="Montserrat" w:eastAsia="Montserrat"/>
+                <w:b/>
+                <w:i w:val="0"/>
+                <w:color w:val="FFFFFF"/>
+                <w:sz w:val="36"/>
+              </w:rPr>
+              <w:t>US$ 2.700 – 3.900</w:t>
+            </w:r>
+          </w:p>
+        </w:tc>
+      </w:tr>
+    </w:tbl>
+    <w:p>
+      <w:pPr>
+        <w:spacing w:before="80" w:after="160" w:line="276" w:lineRule="auto"/>
+      </w:pPr>
+      <w:r>
+        <w:rPr>
+          <w:rFonts w:ascii="Montserrat" w:hAnsi="Montserrat" w:eastAsia="Montserrat"/>
+          <w:b w:val="0"/>
+          <w:i/>
+          <w:color w:val="7A8794"/>
+          <w:sz w:val="19"/>
+        </w:rPr>
+        <w:t>Finados y noviembre (−15%): desde US$ 2.295 · Pago único o hasta 120 meses, con intereses</w:t>
+      </w:r>
+    </w:p>
+    <w:p>
+      <w:pPr>
+        <w:spacing w:before="0" w:after="120" w:line="276" w:lineRule="auto"/>
+      </w:pPr>
+      <w:r>
+        <w:rPr>
+          <w:rFonts w:ascii="Montserrat" w:hAnsi="Montserrat" w:eastAsia="Montserrat"/>
+          <w:b/>
+          <w:i w:val="0"/>
+          <w:color w:val="1B365D"/>
+          <w:sz w:val="21"/>
+        </w:rPr>
+        <w:t xml:space="preserve">Qué es. </w:t>
+      </w:r>
+      <w:r>
+        <w:rPr>
+          <w:rFonts w:ascii="Montserrat" w:hAnsi="Montserrat" w:eastAsia="Montserrat"/>
+          <w:b w:val="0"/>
+          <w:i w:val="0"/>
+          <w:color w:val="2C3E50"/>
+          <w:sz w:val="21"/>
+        </w:rPr>
+        <w:t>La solución más completa: servicio funerario, dos cremaciones y un columbario permanente de cristal o mármol para hasta dos urnas, en El Hogar de las Memorias.</w:t>
+      </w:r>
+    </w:p>
+    <w:p>
+      <w:pPr>
+        <w:spacing w:before="0" w:after="160" w:line="276" w:lineRule="auto"/>
+      </w:pPr>
+      <w:r>
+        <w:rPr>
+          <w:rFonts w:ascii="Montserrat" w:hAnsi="Montserrat" w:eastAsia="Montserrat"/>
+          <w:b/>
+          <w:i w:val="0"/>
+          <w:color w:val="1B365D"/>
+          <w:sz w:val="21"/>
+        </w:rPr>
+        <w:t xml:space="preserve">Para quién. </w:t>
+      </w:r>
+      <w:r>
+        <w:rPr>
+          <w:rFonts w:ascii="Montserrat" w:hAnsi="Montserrat" w:eastAsia="Montserrat"/>
+          <w:b w:val="0"/>
+          <w:i w:val="0"/>
+          <w:color w:val="2C3E50"/>
+          <w:sz w:val="21"/>
+        </w:rPr>
+        <w:t>Familias que quieren resolver en una sola compra el funeral, la cremación y un lugar permanente para dos seres queridos.</w:t>
+      </w:r>
+    </w:p>
+    <w:tbl>
+      <w:tblPr>
+        <w:tblW w:type="auto" w:w="0"/>
+        <w:jc w:val="center"/>
+        <w:tblLayout w:type="fixed"/>
+        <w:tblLook w:firstColumn="1" w:firstRow="1" w:lastColumn="0" w:lastRow="0" w:noHBand="0" w:noVBand="1" w:val="04A0"/>
+      </w:tblPr>
+      <w:tblGrid>
+        <w:gridCol w:w="4873"/>
+        <w:gridCol w:w="4873"/>
+      </w:tblGrid>
+      <w:tr>
+        <w:tc>
+          <w:tcPr>
+            <w:tcW w:type="dxa" w:w="4819"/>
+            <w:tcMar>
+              <w:top w:w="124" w:type="dxa"/>
+              <w:left w:w="124" w:type="dxa"/>
+              <w:bottom w:w="124" w:type="dxa"/>
+              <w:right w:w="124" w:type="dxa"/>
+            </w:tcMar>
+            <w:shd w:val="clear" w:color="auto" w:fill="F4F7FA"/>
+            <w:tcBorders>
+              <w:top w:val="single" w:sz="24" w:color="C5A059"/>
+              <w:left w:val="single" w:sz="24" w:color="FFFFFF"/>
+              <w:bottom w:val="nil"/>
+              <w:right w:val="single" w:sz="24" w:color="FFFFFF"/>
+            </w:tcBorders>
+            <w:tcMar>
+              <w:top w:w="170" w:type="dxa"/>
+              <w:left w:w="170" w:type="dxa"/>
+              <w:bottom w:w="170" w:type="dxa"/>
+              <w:right w:w="170" w:type="dxa"/>
+            </w:tcMar>
+          </w:tcPr>
+          <w:p>
+            <w:pPr>
+              <w:spacing w:after="40"/>
+            </w:pPr>
+            <w:r>
+              <w:rPr>
+                <w:rFonts w:ascii="Montserrat" w:hAnsi="Montserrat" w:eastAsia="Montserrat"/>
+                <w:b/>
+                <w:i w:val="0"/>
+                <w:color w:val="1B365D"/>
+                <w:sz w:val="17"/>
+              </w:rPr>
+              <w:t>QUÉ INCLUYE</w:t>
+            </w:r>
+          </w:p>
+          <w:p>
+            <w:pPr>
+              <w:spacing w:after="40"/>
+              <w:ind w:left="255" w:hanging="255"/>
+            </w:pPr>
+            <w:r>
+              <w:rPr>
+                <w:rFonts w:ascii="Montserrat" w:hAnsi="Montserrat" w:eastAsia="Montserrat"/>
+                <w:b/>
+                <w:i w:val="0"/>
+                <w:color w:val="4F7A5A"/>
+                <w:sz w:val="18"/>
+              </w:rPr>
+              <w:t xml:space="preserve">✓  </w:t>
+            </w:r>
+            <w:r>
+              <w:rPr>
+                <w:rFonts w:ascii="Montserrat" w:hAnsi="Montserrat" w:eastAsia="Montserrat"/>
+                <w:b w:val="0"/>
+                <w:i w:val="0"/>
+                <w:color w:val="2C3E50"/>
+                <w:sz w:val="19"/>
+              </w:rPr>
+              <w:t>Columbario estándar permanente de cristal o mármol, para hasta 2 urnas</w:t>
+            </w:r>
+          </w:p>
+          <w:p>
+            <w:pPr>
+              <w:spacing w:after="40"/>
+              <w:ind w:left="255" w:hanging="255"/>
+            </w:pPr>
+            <w:r>
+              <w:rPr>
+                <w:rFonts w:ascii="Montserrat" w:hAnsi="Montserrat" w:eastAsia="Montserrat"/>
+                <w:b/>
+                <w:i w:val="0"/>
+                <w:color w:val="4F7A5A"/>
+                <w:sz w:val="18"/>
+              </w:rPr>
+              <w:t xml:space="preserve">✓  </w:t>
+            </w:r>
+            <w:r>
+              <w:rPr>
+                <w:rFonts w:ascii="Montserrat" w:hAnsi="Montserrat" w:eastAsia="Montserrat"/>
+                <w:b w:val="0"/>
+                <w:i w:val="0"/>
+                <w:color w:val="2C3E50"/>
+                <w:sz w:val="19"/>
+              </w:rPr>
+              <w:t>2 cremaciones con certificado y 2 urnas cinerarias básicas</w:t>
+            </w:r>
+          </w:p>
+          <w:p>
+            <w:pPr>
+              <w:spacing w:after="40"/>
+              <w:ind w:left="255" w:hanging="255"/>
+            </w:pPr>
+            <w:r>
+              <w:rPr>
+                <w:rFonts w:ascii="Montserrat" w:hAnsi="Montserrat" w:eastAsia="Montserrat"/>
+                <w:b/>
+                <w:i w:val="0"/>
+                <w:color w:val="4F7A5A"/>
+                <w:sz w:val="18"/>
+              </w:rPr>
+              <w:t xml:space="preserve">✓  </w:t>
+            </w:r>
+            <w:r>
+              <w:rPr>
+                <w:rFonts w:ascii="Montserrat" w:hAnsi="Montserrat" w:eastAsia="Montserrat"/>
+                <w:b w:val="0"/>
+                <w:i w:val="0"/>
+                <w:color w:val="2C3E50"/>
+                <w:sz w:val="19"/>
+              </w:rPr>
+              <w:t>Sala de velación 24 h, ataúd ceremonial y carroza tradicional</w:t>
+            </w:r>
+          </w:p>
+          <w:p>
+            <w:pPr>
+              <w:spacing w:after="40"/>
+              <w:ind w:left="255" w:hanging="255"/>
+            </w:pPr>
+            <w:r>
+              <w:rPr>
+                <w:rFonts w:ascii="Montserrat" w:hAnsi="Montserrat" w:eastAsia="Montserrat"/>
+                <w:b/>
+                <w:i w:val="0"/>
+                <w:color w:val="4F7A5A"/>
+                <w:sz w:val="18"/>
+              </w:rPr>
+              <w:t xml:space="preserve">✓  </w:t>
+            </w:r>
+            <w:r>
+              <w:rPr>
+                <w:rFonts w:ascii="Montserrat" w:hAnsi="Montserrat" w:eastAsia="Montserrat"/>
+                <w:b w:val="0"/>
+                <w:i w:val="0"/>
+                <w:color w:val="2C3E50"/>
+                <w:sz w:val="19"/>
+              </w:rPr>
+              <w:t>Traslados, preparación y resguardo hasta 5 días, y Programa Vive de acompañamiento en el duelo</w:t>
+            </w:r>
+          </w:p>
+        </w:tc>
+        <w:tc>
+          <w:tcPr>
+            <w:tcW w:type="dxa" w:w="4819"/>
+            <w:tcMar>
+              <w:top w:w="124" w:type="dxa"/>
+              <w:left w:w="124" w:type="dxa"/>
+              <w:bottom w:w="124" w:type="dxa"/>
+              <w:right w:w="124" w:type="dxa"/>
+            </w:tcMar>
+            <w:shd w:val="clear" w:color="auto" w:fill="F4F7FA"/>
+            <w:tcBorders>
+              <w:top w:val="single" w:sz="24" w:color="C5A059"/>
+              <w:left w:val="single" w:sz="24" w:color="FFFFFF"/>
+              <w:bottom w:val="nil"/>
+              <w:right w:val="single" w:sz="24" w:color="FFFFFF"/>
+            </w:tcBorders>
+            <w:tcMar>
+              <w:top w:w="170" w:type="dxa"/>
+              <w:left w:w="170" w:type="dxa"/>
+              <w:bottom w:w="170" w:type="dxa"/>
+              <w:right w:w="170" w:type="dxa"/>
+            </w:tcMar>
+          </w:tcPr>
+          <w:p>
+            <w:pPr>
+              <w:spacing w:after="40"/>
+            </w:pPr>
+            <w:r>
+              <w:rPr>
+                <w:rFonts w:ascii="Montserrat" w:hAnsi="Montserrat" w:eastAsia="Montserrat"/>
+                <w:b/>
+                <w:i w:val="0"/>
+                <w:color w:val="1B365D"/>
+                <w:sz w:val="17"/>
+              </w:rPr>
+              <w:t>REGLAS DEL PRODUCTO</w:t>
+            </w:r>
+          </w:p>
+          <w:p>
+            <w:pPr>
+              <w:spacing w:after="40"/>
+              <w:ind w:left="255" w:hanging="255"/>
+            </w:pPr>
+            <w:r>
+              <w:rPr>
+                <w:rFonts w:ascii="Montserrat" w:hAnsi="Montserrat" w:eastAsia="Montserrat"/>
+                <w:b/>
+                <w:i w:val="0"/>
+                <w:color w:val="C5A059"/>
+                <w:sz w:val="18"/>
+              </w:rPr>
+              <w:t xml:space="preserve">■  </w:t>
+            </w:r>
+            <w:r>
+              <w:rPr>
+                <w:rFonts w:ascii="Montserrat" w:hAnsi="Montserrat" w:eastAsia="Montserrat"/>
+                <w:b w:val="0"/>
+                <w:i w:val="0"/>
+                <w:color w:val="2C3E50"/>
+                <w:sz w:val="19"/>
+              </w:rPr>
+              <w:t>Capacidad: hasta 2 urnas; incluye 2 cremaciones.</w:t>
+            </w:r>
+          </w:p>
+          <w:p>
+            <w:pPr>
+              <w:spacing w:after="40"/>
+              <w:ind w:left="255" w:hanging="255"/>
+            </w:pPr>
+            <w:r>
+              <w:rPr>
+                <w:rFonts w:ascii="Montserrat" w:hAnsi="Montserrat" w:eastAsia="Montserrat"/>
+                <w:b/>
+                <w:i w:val="0"/>
+                <w:color w:val="C5A059"/>
+                <w:sz w:val="18"/>
+              </w:rPr>
+              <w:t xml:space="preserve">■  </w:t>
+            </w:r>
+            <w:r>
+              <w:rPr>
+                <w:rFonts w:ascii="Montserrat" w:hAnsi="Montserrat" w:eastAsia="Montserrat"/>
+                <w:b w:val="0"/>
+                <w:i w:val="0"/>
+                <w:color w:val="2C3E50"/>
+                <w:sz w:val="19"/>
+              </w:rPr>
+              <w:t>Ubicación definida: US$ 3.400 – 3.900. Ubicación a futuro: US$ 2.700 – 3.200 (según fila y nivel).</w:t>
+            </w:r>
+          </w:p>
+          <w:p>
+            <w:pPr>
+              <w:spacing w:after="40"/>
+              <w:ind w:left="255" w:hanging="255"/>
+            </w:pPr>
+            <w:r>
+              <w:rPr>
+                <w:rFonts w:ascii="Montserrat" w:hAnsi="Montserrat" w:eastAsia="Montserrat"/>
+                <w:b/>
+                <w:i w:val="0"/>
+                <w:color w:val="C5A059"/>
+                <w:sz w:val="18"/>
+              </w:rPr>
+              <w:t xml:space="preserve">■  </w:t>
+            </w:r>
+            <w:r>
+              <w:rPr>
+                <w:rFonts w:ascii="Montserrat" w:hAnsi="Montserrat" w:eastAsia="Montserrat"/>
+                <w:b w:val="0"/>
+                <w:i w:val="0"/>
+                <w:color w:val="2C3E50"/>
+                <w:sz w:val="19"/>
+              </w:rPr>
+              <w:t>Velación en La Auxiliadora (Capilla Maquilishuat o Básica) o en Capillas Memoriales (Las Camelias o Básica).</w:t>
+            </w:r>
+          </w:p>
+        </w:tc>
+      </w:tr>
+    </w:tbl>
+    <w:p>
+      <w:pPr>
+        <w:spacing w:before="0" w:after="80" w:line="276" w:lineRule="auto"/>
+      </w:pPr>
+    </w:p>
+    <w:p>
+      <w:pPr>
+        <w:spacing w:before="120" w:after="40" w:line="276" w:lineRule="auto"/>
+      </w:pPr>
+      <w:r>
+        <w:rPr>
+          <w:rFonts w:ascii="Montserrat" w:hAnsi="Montserrat" w:eastAsia="Montserrat"/>
+          <w:b/>
+          <w:i w:val="0"/>
+          <w:color w:val="C5A059"/>
+          <w:sz w:val="17"/>
+        </w:rPr>
+        <w:t>SPEECH SUGERIDO</w:t>
+      </w:r>
+    </w:p>
+    <w:tbl>
+      <w:tblPr>
+        <w:tblW w:type="auto" w:w="0"/>
+        <w:jc w:val="center"/>
+        <w:tblLayout w:type="fixed"/>
+        <w:tblLook w:firstColumn="1" w:firstRow="1" w:lastColumn="0" w:lastRow="0" w:noHBand="0" w:noVBand="1" w:val="04A0"/>
+      </w:tblPr>
+      <w:tblGrid>
+        <w:gridCol w:w="9746"/>
+      </w:tblGrid>
+      <w:tr>
+        <w:tc>
+          <w:tcPr>
+            <w:tcW w:type="dxa" w:w="9638"/>
+            <w:tcMar>
+              <w:top w:w="124" w:type="dxa"/>
+              <w:left w:w="124" w:type="dxa"/>
+              <w:bottom w:w="124" w:type="dxa"/>
+              <w:right w:w="124" w:type="dxa"/>
+            </w:tcMar>
+            <w:shd w:val="clear" w:color="auto" w:fill="FBF3E1"/>
+            <w:tcBorders>
+              <w:top w:val="nil"/>
+              <w:left w:val="single" w:sz="36" w:color="C5A059"/>
+              <w:bottom w:val="nil"/>
+              <w:right w:val="nil"/>
+            </w:tcBorders>
+            <w:tcMar>
+              <w:top w:w="198" w:type="dxa"/>
+              <w:left w:w="198" w:type="dxa"/>
+              <w:bottom w:w="198" w:type="dxa"/>
+              <w:right w:w="198" w:type="dxa"/>
+            </w:tcMar>
+          </w:tcPr>
+          <w:p>
+            <w:pPr>
+              <w:spacing w:after="40"/>
+            </w:pPr>
+            <w:r>
+              <w:rPr>
+                <w:rFonts w:ascii="Montserrat" w:hAnsi="Montserrat" w:eastAsia="Montserrat"/>
+                <w:b w:val="0"/>
+                <w:i w:val="0"/>
+                <w:color w:val="2C3E50"/>
+                <w:sz w:val="21"/>
+              </w:rPr>
+              <w:t>«Con el Supremo Plus su familia no tendrá que coordinar nada: el servicio funerario, la cremación y el lugar donde descansarán las cenizas quedan resueltos en un solo contrato, para dos personas y para siempre.»</w:t>
+            </w:r>
+          </w:p>
+        </w:tc>
+      </w:tr>
+    </w:tbl>
+    <w:p>
+      <w:pPr>
+        <w:spacing w:before="0" w:after="80" w:line="276" w:lineRule="auto"/>
+      </w:pPr>
+    </w:p>
+    <w:p>
+      <w:pPr>
+        <w:spacing w:before="120" w:after="40" w:line="276" w:lineRule="auto"/>
+      </w:pPr>
+      <w:r>
+        <w:rPr>
+          <w:rFonts w:ascii="Montserrat" w:hAnsi="Montserrat" w:eastAsia="Montserrat"/>
+          <w:b/>
+          <w:i w:val="0"/>
+          <w:color w:val="C5A059"/>
+          <w:sz w:val="17"/>
+        </w:rPr>
+        <w:t>PREGUNTAS DE DESCUBRIMIENTO</w:t>
+      </w:r>
+    </w:p>
+    <w:p>
+      <w:pPr>
+        <w:spacing w:before="0" w:after="60" w:line="276" w:lineRule="auto"/>
+        <w:ind w:left="340" w:hanging="340"/>
+      </w:pPr>
+      <w:r>
+        <w:rPr>
+          <w:rFonts w:ascii="Montserrat" w:hAnsi="Montserrat" w:eastAsia="Montserrat"/>
+          <w:b w:val="0"/>
+          <w:i w:val="0"/>
+          <w:color w:val="C5A059"/>
+          <w:sz w:val="14"/>
+        </w:rPr>
+        <w:t xml:space="preserve">?  </w:t>
+      </w:r>
+      <w:r>
+        <w:rPr>
+          <w:rFonts w:ascii="Montserrat" w:hAnsi="Montserrat" w:eastAsia="Montserrat"/>
+          <w:b w:val="0"/>
+          <w:i w:val="0"/>
+          <w:color w:val="2C3E50"/>
+          <w:sz w:val="20"/>
+        </w:rPr>
+        <w:t>¿Han pensado dónde quedarían las cenizas después de la cremación?</w:t>
+      </w:r>
+    </w:p>
+    <w:p>
+      <w:pPr>
+        <w:spacing w:before="0" w:after="60" w:line="276" w:lineRule="auto"/>
+        <w:ind w:left="340" w:hanging="340"/>
+      </w:pPr>
+      <w:r>
+        <w:rPr>
+          <w:rFonts w:ascii="Montserrat" w:hAnsi="Montserrat" w:eastAsia="Montserrat"/>
+          <w:b w:val="0"/>
+          <w:i w:val="0"/>
+          <w:color w:val="C5A059"/>
+          <w:sz w:val="14"/>
+        </w:rPr>
+        <w:t xml:space="preserve">?  </w:t>
+      </w:r>
+      <w:r>
+        <w:rPr>
+          <w:rFonts w:ascii="Montserrat" w:hAnsi="Montserrat" w:eastAsia="Montserrat"/>
+          <w:b w:val="0"/>
+          <w:i w:val="0"/>
+          <w:color w:val="2C3E50"/>
+          <w:sz w:val="20"/>
+        </w:rPr>
+        <w:t>¿Lo considera para usted y su pareja, o para sus padres?</w:t>
+      </w:r>
+    </w:p>
+    <w:p>
+      <w:pPr>
+        <w:spacing w:before="0" w:after="60" w:line="276" w:lineRule="auto"/>
+        <w:ind w:left="340" w:hanging="340"/>
+      </w:pPr>
+      <w:r>
+        <w:rPr>
+          <w:rFonts w:ascii="Montserrat" w:hAnsi="Montserrat" w:eastAsia="Montserrat"/>
+          <w:b w:val="0"/>
+          <w:i w:val="0"/>
+          <w:color w:val="C5A059"/>
+          <w:sz w:val="14"/>
+        </w:rPr>
+        <w:t xml:space="preserve">?  </w:t>
+      </w:r>
+      <w:r>
+        <w:rPr>
+          <w:rFonts w:ascii="Montserrat" w:hAnsi="Montserrat" w:eastAsia="Montserrat"/>
+          <w:b w:val="0"/>
+          <w:i w:val="0"/>
+          <w:color w:val="2C3E50"/>
+          <w:sz w:val="20"/>
+        </w:rPr>
+        <w:t>¿Prefiere elegir hoy el nicho o dejar la ubicación para más adelante?</w:t>
+      </w:r>
+    </w:p>
+    <w:p>
+      <w:pPr>
+        <w:spacing w:before="120" w:after="40" w:line="276" w:lineRule="auto"/>
+      </w:pPr>
+      <w:r>
+        <w:rPr>
+          <w:rFonts w:ascii="Montserrat" w:hAnsi="Montserrat" w:eastAsia="Montserrat"/>
+          <w:b/>
+          <w:i w:val="0"/>
+          <w:color w:val="C5A059"/>
+          <w:sz w:val="17"/>
+        </w:rPr>
+        <w:t>FRASE DE CIERRE</w:t>
+      </w:r>
+    </w:p>
+    <w:p>
+      <w:pPr>
+        <w:spacing w:before="0" w:after="120" w:line="276" w:lineRule="auto"/>
+      </w:pPr>
+      <w:r>
+        <w:rPr>
+          <w:rFonts w:ascii="Montserrat" w:hAnsi="Montserrat" w:eastAsia="Montserrat"/>
+          <w:b w:val="0"/>
+          <w:i/>
+          <w:color w:val="1B365D"/>
+          <w:sz w:val="21"/>
+        </w:rPr>
+        <w:t>«¿Aprovechamos el precio de noviembre y elegimos hoy la ubicación?»</w:t>
+      </w:r>
+    </w:p>
+    <w:p>
+      <w:pPr>
+        <w:spacing w:before="120" w:after="40" w:line="276" w:lineRule="auto"/>
+      </w:pPr>
+      <w:r>
+        <w:rPr>
+          <w:rFonts w:ascii="Montserrat" w:hAnsi="Montserrat" w:eastAsia="Montserrat"/>
+          <w:b/>
+          <w:i w:val="0"/>
+          <w:color w:val="C5A059"/>
+          <w:sz w:val="17"/>
+        </w:rPr>
+        <w:t>OBJECIÓN TÍPICA</w:t>
+      </w:r>
+    </w:p>
+    <w:p>
+      <w:pPr>
+        <w:spacing w:before="0" w:after="120" w:line="276" w:lineRule="auto"/>
+      </w:pPr>
+      <w:r>
+        <w:rPr>
+          <w:rFonts w:ascii="Montserrat" w:hAnsi="Montserrat" w:eastAsia="Montserrat"/>
+          <w:b w:val="0"/>
+          <w:i w:val="0"/>
+          <w:color w:val="2C3E50"/>
+          <w:sz w:val="20"/>
+        </w:rPr>
+        <w:t>«Es una inversión alta.» → «Incluye todo para dos personas: funeral, dos cremaciones y el columbario permanente. Y puede pagarse en hasta 120 meses.»</w:t>
+      </w:r>
+    </w:p>
+    <w:tbl>
+      <w:tblPr>
+        <w:tblW w:type="auto" w:w="0"/>
+        <w:jc w:val="center"/>
+        <w:tblLayout w:type="fixed"/>
+        <w:tblLook w:firstColumn="1" w:firstRow="1" w:lastColumn="0" w:lastRow="0" w:noHBand="0" w:noVBand="1" w:val="04A0"/>
+      </w:tblPr>
+      <w:tblGrid>
+        <w:gridCol w:w="9746"/>
+      </w:tblGrid>
+      <w:tr>
+        <w:tc>
+          <w:tcPr>
+            <w:tcW w:type="dxa" w:w="9638"/>
+            <w:tcMar>
+              <w:top w:w="124" w:type="dxa"/>
+              <w:left w:w="124" w:type="dxa"/>
+              <w:bottom w:w="124" w:type="dxa"/>
+              <w:right w:w="124" w:type="dxa"/>
+            </w:tcMar>
+            <w:shd w:val="clear" w:color="auto" w:fill="F4F7FA"/>
+            <w:tcBorders>
+              <w:top w:val="nil"/>
+              <w:left w:val="single" w:sz="36" w:color="4F7A5A"/>
+              <w:bottom w:val="nil"/>
+              <w:right w:val="nil"/>
+            </w:tcBorders>
+            <w:tcMar>
+              <w:top w:w="198" w:type="dxa"/>
+              <w:left w:w="198" w:type="dxa"/>
+              <w:bottom w:w="198" w:type="dxa"/>
+              <w:right w:w="198" w:type="dxa"/>
+            </w:tcMar>
+          </w:tcPr>
+          <w:p>
+            <w:pPr>
+              <w:spacing w:after="40"/>
+            </w:pPr>
+            <w:r>
+              <w:rPr>
+                <w:rFonts w:ascii="Montserrat" w:hAnsi="Montserrat" w:eastAsia="Montserrat"/>
+                <w:b/>
+                <w:i w:val="0"/>
+                <w:color w:val="4F7A5A"/>
+                <w:sz w:val="18"/>
+              </w:rPr>
+              <w:t>TIP DEL ASESOR</w:t>
+            </w:r>
+          </w:p>
+          <w:p>
+            <w:pPr>
+              <w:spacing w:after="40"/>
+            </w:pPr>
+            <w:r>
+              <w:rPr>
+                <w:rFonts w:ascii="Montserrat" w:hAnsi="Montserrat" w:eastAsia="Montserrat"/>
+                <w:b w:val="0"/>
+                <w:i w:val="0"/>
+                <w:color w:val="2C3E50"/>
+                <w:sz w:val="21"/>
+              </w:rPr>
+              <w:t>Si el presupuesto no alcanza para la ubicación definida, ofrezca la ubicación a futuro: el mismo producto, a menor precio.</w:t>
+            </w:r>
+          </w:p>
+        </w:tc>
+      </w:tr>
+    </w:tbl>
+    <w:p>
+      <w:pPr>
+        <w:spacing w:before="0" w:after="80" w:line="276" w:lineRule="auto"/>
+      </w:pPr>
+    </w:p>
+    <w:p>
+      <w:r>
+        <w:br w:type="page"/>
+      </w:r>
+    </w:p>
+    <w:tbl>
+      <w:tblPr>
+        <w:tblW w:type="auto" w:w="0"/>
+        <w:jc w:val="center"/>
+        <w:tblLayout w:type="fixed"/>
+        <w:tblLook w:firstColumn="1" w:firstRow="1" w:lastColumn="0" w:lastRow="0" w:noHBand="0" w:noVBand="1" w:val="04A0"/>
+      </w:tblPr>
+      <w:tblGrid>
+        <w:gridCol w:w="4873"/>
+        <w:gridCol w:w="4873"/>
+      </w:tblGrid>
+      <w:tr>
+        <w:tc>
+          <w:tcPr>
+            <w:tcW w:type="dxa" w:w="6520"/>
+            <w:tcMar>
+              <w:top w:w="124" w:type="dxa"/>
+              <w:left w:w="124" w:type="dxa"/>
+              <w:bottom w:w="124" w:type="dxa"/>
+              <w:right w:w="124" w:type="dxa"/>
+            </w:tcMar>
+            <w:shd w:val="clear" w:color="auto" w:fill="1B365D"/>
+            <w:tcBorders>
+              <w:top w:val="nil"/>
+              <w:left w:val="nil"/>
+              <w:bottom w:val="single" w:sz="36" w:color="C5A059"/>
+              <w:right w:val="nil"/>
+            </w:tcBorders>
+            <w:tcMar>
+              <w:top w:w="226" w:type="dxa"/>
+              <w:left w:w="226" w:type="dxa"/>
+              <w:bottom w:w="226" w:type="dxa"/>
+              <w:right w:w="226" w:type="dxa"/>
+            </w:tcMar>
+          </w:tcPr>
+          <w:p>
+            <w:pPr>
+              <w:spacing w:after="40"/>
+            </w:pPr>
+            <w:r>
+              <w:rPr>
+                <w:rFonts w:ascii="Montserrat" w:hAnsi="Montserrat" w:eastAsia="Montserrat"/>
+                <w:b/>
+                <w:i w:val="0"/>
+                <w:color w:val="C5A059"/>
+                <w:sz w:val="17"/>
+              </w:rPr>
+              <w:t>HOGAR DE LAS MEMORIAS · COLUMBARIO</w:t>
+            </w:r>
+          </w:p>
+          <w:p>
+            <w:r>
+              <w:rPr>
+                <w:rFonts w:ascii="Playfair Display" w:hAnsi="Playfair Display" w:eastAsia="Playfair Display"/>
+                <w:b/>
+                <w:i w:val="0"/>
+                <w:color w:val="FFFFFF"/>
+                <w:sz w:val="36"/>
+              </w:rPr>
+              <w:t>Columbario Mármol o Cristal</w:t>
+            </w:r>
+          </w:p>
+        </w:tc>
+        <w:tc>
+          <w:tcPr>
+            <w:tcW w:type="dxa" w:w="3118"/>
+            <w:tcMar>
+              <w:top w:w="124" w:type="dxa"/>
+              <w:left w:w="124" w:type="dxa"/>
+              <w:bottom w:w="124" w:type="dxa"/>
+              <w:right w:w="124" w:type="dxa"/>
+            </w:tcMar>
+            <w:shd w:val="clear" w:color="auto" w:fill="1B365D"/>
+            <w:tcBorders>
+              <w:top w:val="nil"/>
+              <w:left w:val="nil"/>
+              <w:bottom w:val="single" w:sz="36" w:color="C5A059"/>
+              <w:right w:val="nil"/>
+            </w:tcBorders>
+            <w:tcMar>
+              <w:top w:w="226" w:type="dxa"/>
+              <w:left w:w="226" w:type="dxa"/>
+              <w:bottom w:w="226" w:type="dxa"/>
+              <w:right w:w="226" w:type="dxa"/>
+            </w:tcMar>
+          </w:tcPr>
+          <w:p>
+            <w:pPr>
+              <w:spacing w:after="40"/>
+              <w:jc w:val="right"/>
+            </w:pPr>
+            <w:r>
+              <w:rPr>
+                <w:rFonts w:ascii="Montserrat" w:hAnsi="Montserrat" w:eastAsia="Montserrat"/>
+                <w:b/>
+                <w:i w:val="0"/>
+                <w:color w:val="C5A059"/>
+                <w:sz w:val="17"/>
+              </w:rPr>
+              <w:t>PRECIO SEGÚN UBICACIÓN</w:t>
+            </w:r>
+          </w:p>
+          <w:p>
+            <w:pPr>
+              <w:jc w:val="right"/>
+            </w:pPr>
+            <w:r>
+              <w:rPr>
+                <w:rFonts w:ascii="Montserrat" w:hAnsi="Montserrat" w:eastAsia="Montserrat"/>
+                <w:b/>
+                <w:i w:val="0"/>
+                <w:color w:val="FFFFFF"/>
+                <w:sz w:val="36"/>
+              </w:rPr>
+              <w:t>US$ 1.200 – 2.600</w:t>
+            </w:r>
+          </w:p>
+        </w:tc>
+      </w:tr>
+    </w:tbl>
+    <w:p>
+      <w:pPr>
+        <w:spacing w:before="80" w:after="160" w:line="276" w:lineRule="auto"/>
+      </w:pPr>
+      <w:r>
+        <w:rPr>
+          <w:rFonts w:ascii="Montserrat" w:hAnsi="Montserrat" w:eastAsia="Montserrat"/>
+          <w:b w:val="0"/>
+          <w:i/>
+          <w:color w:val="7A8794"/>
+          <w:sz w:val="19"/>
+        </w:rPr>
+        <w:t>Finados y noviembre (−15%): desde US$ 1.020 · Pago único o hasta 120 meses, con intereses</w:t>
+      </w:r>
+    </w:p>
+    <w:p>
+      <w:pPr>
+        <w:spacing w:before="0" w:after="120" w:line="276" w:lineRule="auto"/>
+      </w:pPr>
+      <w:r>
+        <w:rPr>
+          <w:rFonts w:ascii="Montserrat" w:hAnsi="Montserrat" w:eastAsia="Montserrat"/>
+          <w:b/>
+          <w:i w:val="0"/>
+          <w:color w:val="1B365D"/>
+          <w:sz w:val="21"/>
+        </w:rPr>
+        <w:t xml:space="preserve">Qué es. </w:t>
+      </w:r>
+      <w:r>
+        <w:rPr>
+          <w:rFonts w:ascii="Montserrat" w:hAnsi="Montserrat" w:eastAsia="Montserrat"/>
+          <w:b w:val="0"/>
+          <w:i w:val="0"/>
+          <w:color w:val="2C3E50"/>
+          <w:sz w:val="21"/>
+        </w:rPr>
+        <w:t>Columbario permanente de mármol o cristal en El Hogar de las Memorias: un espacio elegante y sereno, de diseño atemporal, para las urnas de la familia.</w:t>
+      </w:r>
+    </w:p>
+    <w:p>
+      <w:pPr>
+        <w:spacing w:before="0" w:after="160" w:line="276" w:lineRule="auto"/>
+      </w:pPr>
+      <w:r>
+        <w:rPr>
+          <w:rFonts w:ascii="Montserrat" w:hAnsi="Montserrat" w:eastAsia="Montserrat"/>
+          <w:b/>
+          <w:i w:val="0"/>
+          <w:color w:val="1B365D"/>
+          <w:sz w:val="21"/>
+        </w:rPr>
+        <w:t xml:space="preserve">Para quién. </w:t>
+      </w:r>
+      <w:r>
+        <w:rPr>
+          <w:rFonts w:ascii="Montserrat" w:hAnsi="Montserrat" w:eastAsia="Montserrat"/>
+          <w:b w:val="0"/>
+          <w:i w:val="0"/>
+          <w:color w:val="2C3E50"/>
+          <w:sz w:val="21"/>
+        </w:rPr>
+        <w:t>Familias que ya tienen la cremación resuelta y buscan un lugar permanente y elegante para las cenizas.</w:t>
+      </w:r>
+    </w:p>
+    <w:tbl>
+      <w:tblPr>
+        <w:tblW w:type="auto" w:w="0"/>
+        <w:jc w:val="center"/>
+        <w:tblLayout w:type="fixed"/>
+        <w:tblLook w:firstColumn="1" w:firstRow="1" w:lastColumn="0" w:lastRow="0" w:noHBand="0" w:noVBand="1" w:val="04A0"/>
+      </w:tblPr>
+      <w:tblGrid>
+        <w:gridCol w:w="4873"/>
+        <w:gridCol w:w="4873"/>
+      </w:tblGrid>
+      <w:tr>
+        <w:tc>
+          <w:tcPr>
+            <w:tcW w:type="dxa" w:w="4819"/>
+            <w:tcMar>
+              <w:top w:w="124" w:type="dxa"/>
+              <w:left w:w="124" w:type="dxa"/>
+              <w:bottom w:w="124" w:type="dxa"/>
+              <w:right w:w="124" w:type="dxa"/>
+            </w:tcMar>
+            <w:shd w:val="clear" w:color="auto" w:fill="F4F7FA"/>
+            <w:tcBorders>
+              <w:top w:val="single" w:sz="24" w:color="C5A059"/>
+              <w:left w:val="single" w:sz="24" w:color="FFFFFF"/>
+              <w:bottom w:val="nil"/>
+              <w:right w:val="single" w:sz="24" w:color="FFFFFF"/>
+            </w:tcBorders>
+            <w:tcMar>
+              <w:top w:w="170" w:type="dxa"/>
+              <w:left w:w="170" w:type="dxa"/>
+              <w:bottom w:w="170" w:type="dxa"/>
+              <w:right w:w="170" w:type="dxa"/>
+            </w:tcMar>
+          </w:tcPr>
+          <w:p>
+            <w:pPr>
+              <w:spacing w:after="40"/>
+            </w:pPr>
+            <w:r>
+              <w:rPr>
+                <w:rFonts w:ascii="Montserrat" w:hAnsi="Montserrat" w:eastAsia="Montserrat"/>
+                <w:b/>
+                <w:i w:val="0"/>
+                <w:color w:val="1B365D"/>
+                <w:sz w:val="17"/>
+              </w:rPr>
+              <w:t>QUÉ INCLUYE</w:t>
+            </w:r>
+          </w:p>
+          <w:p>
+            <w:pPr>
+              <w:spacing w:after="40"/>
+              <w:ind w:left="255" w:hanging="255"/>
+            </w:pPr>
+            <w:r>
+              <w:rPr>
+                <w:rFonts w:ascii="Montserrat" w:hAnsi="Montserrat" w:eastAsia="Montserrat"/>
+                <w:b/>
+                <w:i w:val="0"/>
+                <w:color w:val="4F7A5A"/>
+                <w:sz w:val="18"/>
+              </w:rPr>
+              <w:t xml:space="preserve">✓  </w:t>
+            </w:r>
+            <w:r>
+              <w:rPr>
+                <w:rFonts w:ascii="Montserrat" w:hAnsi="Montserrat" w:eastAsia="Montserrat"/>
+                <w:b w:val="0"/>
+                <w:i w:val="0"/>
+                <w:color w:val="2C3E50"/>
+                <w:sz w:val="19"/>
+              </w:rPr>
+              <w:t>Espacio permanente en columbario de mármol o cristal</w:t>
+            </w:r>
+          </w:p>
+          <w:p>
+            <w:pPr>
+              <w:spacing w:after="40"/>
+              <w:ind w:left="255" w:hanging="255"/>
+            </w:pPr>
+            <w:r>
+              <w:rPr>
+                <w:rFonts w:ascii="Montserrat" w:hAnsi="Montserrat" w:eastAsia="Montserrat"/>
+                <w:b/>
+                <w:i w:val="0"/>
+                <w:color w:val="4F7A5A"/>
+                <w:sz w:val="18"/>
+              </w:rPr>
+              <w:t xml:space="preserve">✓  </w:t>
+            </w:r>
+            <w:r>
+              <w:rPr>
+                <w:rFonts w:ascii="Montserrat" w:hAnsi="Montserrat" w:eastAsia="Montserrat"/>
+                <w:b w:val="0"/>
+                <w:i w:val="0"/>
+                <w:color w:val="2C3E50"/>
+                <w:sz w:val="19"/>
+              </w:rPr>
+              <w:t>Capacidad estándar: hasta 2 urnas</w:t>
+            </w:r>
+          </w:p>
+          <w:p>
+            <w:pPr>
+              <w:spacing w:after="40"/>
+              <w:ind w:left="255" w:hanging="255"/>
+            </w:pPr>
+            <w:r>
+              <w:rPr>
+                <w:rFonts w:ascii="Montserrat" w:hAnsi="Montserrat" w:eastAsia="Montserrat"/>
+                <w:b/>
+                <w:i w:val="0"/>
+                <w:color w:val="4F7A5A"/>
+                <w:sz w:val="18"/>
+              </w:rPr>
+              <w:t xml:space="preserve">✓  </w:t>
+            </w:r>
+            <w:r>
+              <w:rPr>
+                <w:rFonts w:ascii="Montserrat" w:hAnsi="Montserrat" w:eastAsia="Montserrat"/>
+                <w:b w:val="0"/>
+                <w:i w:val="0"/>
+                <w:color w:val="2C3E50"/>
+                <w:sz w:val="19"/>
+              </w:rPr>
+              <w:t>Ubicación definida o a futuro, según la opción contratada</w:t>
+            </w:r>
+          </w:p>
+        </w:tc>
+        <w:tc>
+          <w:tcPr>
+            <w:tcW w:type="dxa" w:w="4819"/>
+            <w:tcMar>
+              <w:top w:w="124" w:type="dxa"/>
+              <w:left w:w="124" w:type="dxa"/>
+              <w:bottom w:w="124" w:type="dxa"/>
+              <w:right w:w="124" w:type="dxa"/>
+            </w:tcMar>
+            <w:shd w:val="clear" w:color="auto" w:fill="F4F7FA"/>
+            <w:tcBorders>
+              <w:top w:val="single" w:sz="24" w:color="C5A059"/>
+              <w:left w:val="single" w:sz="24" w:color="FFFFFF"/>
+              <w:bottom w:val="nil"/>
+              <w:right w:val="single" w:sz="24" w:color="FFFFFF"/>
+            </w:tcBorders>
+            <w:tcMar>
+              <w:top w:w="170" w:type="dxa"/>
+              <w:left w:w="170" w:type="dxa"/>
+              <w:bottom w:w="170" w:type="dxa"/>
+              <w:right w:w="170" w:type="dxa"/>
+            </w:tcMar>
+          </w:tcPr>
+          <w:p>
+            <w:pPr>
+              <w:spacing w:after="40"/>
+            </w:pPr>
+            <w:r>
+              <w:rPr>
+                <w:rFonts w:ascii="Montserrat" w:hAnsi="Montserrat" w:eastAsia="Montserrat"/>
+                <w:b/>
+                <w:i w:val="0"/>
+                <w:color w:val="1B365D"/>
+                <w:sz w:val="17"/>
+              </w:rPr>
+              <w:t>REGLAS DEL PRODUCTO</w:t>
+            </w:r>
+          </w:p>
+          <w:p>
+            <w:pPr>
+              <w:spacing w:after="40"/>
+              <w:ind w:left="255" w:hanging="255"/>
+            </w:pPr>
+            <w:r>
+              <w:rPr>
+                <w:rFonts w:ascii="Montserrat" w:hAnsi="Montserrat" w:eastAsia="Montserrat"/>
+                <w:b/>
+                <w:i w:val="0"/>
+                <w:color w:val="C5A059"/>
+                <w:sz w:val="18"/>
+              </w:rPr>
+              <w:t xml:space="preserve">■  </w:t>
+            </w:r>
+            <w:r>
+              <w:rPr>
+                <w:rFonts w:ascii="Montserrat" w:hAnsi="Montserrat" w:eastAsia="Montserrat"/>
+                <w:b w:val="0"/>
+                <w:i w:val="0"/>
+                <w:color w:val="2C3E50"/>
+                <w:sz w:val="19"/>
+              </w:rPr>
+              <w:t>Solo columbario: la cremación se contrata aparte (por ejemplo, con la Solución Modular).</w:t>
+            </w:r>
+          </w:p>
+          <w:p>
+            <w:pPr>
+              <w:spacing w:after="40"/>
+              <w:ind w:left="255" w:hanging="255"/>
+            </w:pPr>
+            <w:r>
+              <w:rPr>
+                <w:rFonts w:ascii="Montserrat" w:hAnsi="Montserrat" w:eastAsia="Montserrat"/>
+                <w:b/>
+                <w:i w:val="0"/>
+                <w:color w:val="C5A059"/>
+                <w:sz w:val="18"/>
+              </w:rPr>
+              <w:t xml:space="preserve">■  </w:t>
+            </w:r>
+            <w:r>
+              <w:rPr>
+                <w:rFonts w:ascii="Montserrat" w:hAnsi="Montserrat" w:eastAsia="Montserrat"/>
+                <w:b w:val="0"/>
+                <w:i w:val="0"/>
+                <w:color w:val="2C3E50"/>
+                <w:sz w:val="19"/>
+              </w:rPr>
+              <w:t>Ubicación definida: US$ 2.600. Ubicación a futuro: US$ 1.200 – 1.900 (según fila y nivel).</w:t>
+            </w:r>
+          </w:p>
+        </w:tc>
+      </w:tr>
+    </w:tbl>
+    <w:p>
+      <w:pPr>
+        <w:spacing w:before="0" w:after="80" w:line="276" w:lineRule="auto"/>
+      </w:pPr>
+    </w:p>
+    <w:p>
+      <w:pPr>
+        <w:spacing w:before="120" w:after="40" w:line="276" w:lineRule="auto"/>
+      </w:pPr>
+      <w:r>
+        <w:rPr>
+          <w:rFonts w:ascii="Montserrat" w:hAnsi="Montserrat" w:eastAsia="Montserrat"/>
+          <w:b/>
+          <w:i w:val="0"/>
+          <w:color w:val="C5A059"/>
+          <w:sz w:val="17"/>
+        </w:rPr>
+        <w:t>SPEECH SUGERIDO</w:t>
+      </w:r>
+    </w:p>
+    <w:tbl>
+      <w:tblPr>
+        <w:tblW w:type="auto" w:w="0"/>
+        <w:jc w:val="center"/>
+        <w:tblLayout w:type="fixed"/>
+        <w:tblLook w:firstColumn="1" w:firstRow="1" w:lastColumn="0" w:lastRow="0" w:noHBand="0" w:noVBand="1" w:val="04A0"/>
+      </w:tblPr>
+      <w:tblGrid>
+        <w:gridCol w:w="9746"/>
+      </w:tblGrid>
+      <w:tr>
+        <w:tc>
+          <w:tcPr>
+            <w:tcW w:type="dxa" w:w="9638"/>
+            <w:tcMar>
+              <w:top w:w="124" w:type="dxa"/>
+              <w:left w:w="124" w:type="dxa"/>
+              <w:bottom w:w="124" w:type="dxa"/>
+              <w:right w:w="124" w:type="dxa"/>
+            </w:tcMar>
+            <w:shd w:val="clear" w:color="auto" w:fill="FBF3E1"/>
+            <w:tcBorders>
+              <w:top w:val="nil"/>
+              <w:left w:val="single" w:sz="36" w:color="C5A059"/>
+              <w:bottom w:val="nil"/>
+              <w:right w:val="nil"/>
+            </w:tcBorders>
+            <w:tcMar>
+              <w:top w:w="198" w:type="dxa"/>
+              <w:left w:w="198" w:type="dxa"/>
+              <w:bottom w:w="198" w:type="dxa"/>
+              <w:right w:w="198" w:type="dxa"/>
+            </w:tcMar>
+          </w:tcPr>
+          <w:p>
+            <w:pPr>
+              <w:spacing w:after="40"/>
+            </w:pPr>
+            <w:r>
+              <w:rPr>
+                <w:rFonts w:ascii="Montserrat" w:hAnsi="Montserrat" w:eastAsia="Montserrat"/>
+                <w:b w:val="0"/>
+                <w:i w:val="0"/>
+                <w:color w:val="2C3E50"/>
+                <w:sz w:val="21"/>
+              </w:rPr>
+              <w:t>«Las cenizas de su ser querido merecen un lugar propio y permanente. En El Hogar de las Memorias, el columbario de mármol o cristal guarda hasta dos urnas en un espacio sereno, donde la familia siempre podrá volver.»</w:t>
+            </w:r>
+          </w:p>
+        </w:tc>
+      </w:tr>
+    </w:tbl>
+    <w:p>
+      <w:pPr>
+        <w:spacing w:before="0" w:after="80" w:line="276" w:lineRule="auto"/>
+      </w:pPr>
+    </w:p>
+    <w:p>
+      <w:pPr>
+        <w:spacing w:before="120" w:after="40" w:line="276" w:lineRule="auto"/>
+      </w:pPr>
+      <w:r>
+        <w:rPr>
+          <w:rFonts w:ascii="Montserrat" w:hAnsi="Montserrat" w:eastAsia="Montserrat"/>
+          <w:b/>
+          <w:i w:val="0"/>
+          <w:color w:val="C5A059"/>
+          <w:sz w:val="17"/>
+        </w:rPr>
+        <w:t>PREGUNTAS DE DESCUBRIMIENTO</w:t>
+      </w:r>
+    </w:p>
+    <w:p>
+      <w:pPr>
+        <w:spacing w:before="0" w:after="60" w:line="276" w:lineRule="auto"/>
+        <w:ind w:left="340" w:hanging="340"/>
+      </w:pPr>
+      <w:r>
+        <w:rPr>
+          <w:rFonts w:ascii="Montserrat" w:hAnsi="Montserrat" w:eastAsia="Montserrat"/>
+          <w:b w:val="0"/>
+          <w:i w:val="0"/>
+          <w:color w:val="C5A059"/>
+          <w:sz w:val="14"/>
+        </w:rPr>
+        <w:t xml:space="preserve">?  </w:t>
+      </w:r>
+      <w:r>
+        <w:rPr>
+          <w:rFonts w:ascii="Montserrat" w:hAnsi="Montserrat" w:eastAsia="Montserrat"/>
+          <w:b w:val="0"/>
+          <w:i w:val="0"/>
+          <w:color w:val="2C3E50"/>
+          <w:sz w:val="20"/>
+        </w:rPr>
+        <w:t>¿Las cenizas están hoy en casa o en un columbario temporal?</w:t>
+      </w:r>
+    </w:p>
+    <w:p>
+      <w:pPr>
+        <w:spacing w:before="0" w:after="60" w:line="276" w:lineRule="auto"/>
+        <w:ind w:left="340" w:hanging="340"/>
+      </w:pPr>
+      <w:r>
+        <w:rPr>
+          <w:rFonts w:ascii="Montserrat" w:hAnsi="Montserrat" w:eastAsia="Montserrat"/>
+          <w:b w:val="0"/>
+          <w:i w:val="0"/>
+          <w:color w:val="C5A059"/>
+          <w:sz w:val="14"/>
+        </w:rPr>
+        <w:t xml:space="preserve">?  </w:t>
+      </w:r>
+      <w:r>
+        <w:rPr>
+          <w:rFonts w:ascii="Montserrat" w:hAnsi="Montserrat" w:eastAsia="Montserrat"/>
+          <w:b w:val="0"/>
+          <w:i w:val="0"/>
+          <w:color w:val="2C3E50"/>
+          <w:sz w:val="20"/>
+        </w:rPr>
+        <w:t>¿Prefieren el mármol o el cristal?</w:t>
+      </w:r>
+    </w:p>
+    <w:p>
+      <w:pPr>
+        <w:spacing w:before="0" w:after="60" w:line="276" w:lineRule="auto"/>
+        <w:ind w:left="340" w:hanging="340"/>
+      </w:pPr>
+      <w:r>
+        <w:rPr>
+          <w:rFonts w:ascii="Montserrat" w:hAnsi="Montserrat" w:eastAsia="Montserrat"/>
+          <w:b w:val="0"/>
+          <w:i w:val="0"/>
+          <w:color w:val="C5A059"/>
+          <w:sz w:val="14"/>
+        </w:rPr>
+        <w:t xml:space="preserve">?  </w:t>
+      </w:r>
+      <w:r>
+        <w:rPr>
+          <w:rFonts w:ascii="Montserrat" w:hAnsi="Montserrat" w:eastAsia="Montserrat"/>
+          <w:b w:val="0"/>
+          <w:i w:val="0"/>
+          <w:color w:val="2C3E50"/>
+          <w:sz w:val="20"/>
+        </w:rPr>
+        <w:t>¿Pensarían en un espacio para dos personas de la familia?</w:t>
+      </w:r>
+    </w:p>
+    <w:p>
+      <w:pPr>
+        <w:spacing w:before="120" w:after="40" w:line="276" w:lineRule="auto"/>
+      </w:pPr>
+      <w:r>
+        <w:rPr>
+          <w:rFonts w:ascii="Montserrat" w:hAnsi="Montserrat" w:eastAsia="Montserrat"/>
+          <w:b/>
+          <w:i w:val="0"/>
+          <w:color w:val="C5A059"/>
+          <w:sz w:val="17"/>
+        </w:rPr>
+        <w:t>FRASE DE CIERRE</w:t>
+      </w:r>
+    </w:p>
+    <w:p>
+      <w:pPr>
+        <w:spacing w:before="0" w:after="120" w:line="276" w:lineRule="auto"/>
+      </w:pPr>
+      <w:r>
+        <w:rPr>
+          <w:rFonts w:ascii="Montserrat" w:hAnsi="Montserrat" w:eastAsia="Montserrat"/>
+          <w:b w:val="0"/>
+          <w:i/>
+          <w:color w:val="1B365D"/>
+          <w:sz w:val="21"/>
+        </w:rPr>
+        <w:t>«¿Visitamos El Hogar de las Memorias para que elija la fila y el nivel?»</w:t>
+      </w:r>
+    </w:p>
+    <w:p>
+      <w:pPr>
+        <w:spacing w:before="120" w:after="40" w:line="276" w:lineRule="auto"/>
+      </w:pPr>
+      <w:r>
+        <w:rPr>
+          <w:rFonts w:ascii="Montserrat" w:hAnsi="Montserrat" w:eastAsia="Montserrat"/>
+          <w:b/>
+          <w:i w:val="0"/>
+          <w:color w:val="C5A059"/>
+          <w:sz w:val="17"/>
+        </w:rPr>
+        <w:t>OBJECIÓN TÍPICA</w:t>
+      </w:r>
+    </w:p>
+    <w:p>
+      <w:pPr>
+        <w:spacing w:before="0" w:after="120" w:line="276" w:lineRule="auto"/>
+      </w:pPr>
+      <w:r>
+        <w:rPr>
+          <w:rFonts w:ascii="Montserrat" w:hAnsi="Montserrat" w:eastAsia="Montserrat"/>
+          <w:b w:val="0"/>
+          <w:i w:val="0"/>
+          <w:color w:val="2C3E50"/>
+          <w:sz w:val="20"/>
+        </w:rPr>
+        <w:t>«Ya tengo las cenizas en casa.» → «Es natural tenerlas cerca. En el columbario quedan protegidas para siempre y toda la familia puede visitarlas.»</w:t>
+      </w:r>
+    </w:p>
+    <w:tbl>
+      <w:tblPr>
+        <w:tblW w:type="auto" w:w="0"/>
+        <w:jc w:val="center"/>
+        <w:tblLayout w:type="fixed"/>
+        <w:tblLook w:firstColumn="1" w:firstRow="1" w:lastColumn="0" w:lastRow="0" w:noHBand="0" w:noVBand="1" w:val="04A0"/>
+      </w:tblPr>
+      <w:tblGrid>
+        <w:gridCol w:w="9746"/>
+      </w:tblGrid>
+      <w:tr>
+        <w:tc>
+          <w:tcPr>
+            <w:tcW w:type="dxa" w:w="9638"/>
+            <w:tcMar>
+              <w:top w:w="124" w:type="dxa"/>
+              <w:left w:w="124" w:type="dxa"/>
+              <w:bottom w:w="124" w:type="dxa"/>
+              <w:right w:w="124" w:type="dxa"/>
+            </w:tcMar>
+            <w:shd w:val="clear" w:color="auto" w:fill="F4F7FA"/>
+            <w:tcBorders>
+              <w:top w:val="nil"/>
+              <w:left w:val="single" w:sz="36" w:color="4F7A5A"/>
+              <w:bottom w:val="nil"/>
+              <w:right w:val="nil"/>
+            </w:tcBorders>
+            <w:tcMar>
+              <w:top w:w="198" w:type="dxa"/>
+              <w:left w:w="198" w:type="dxa"/>
+              <w:bottom w:w="198" w:type="dxa"/>
+              <w:right w:w="198" w:type="dxa"/>
+            </w:tcMar>
+          </w:tcPr>
+          <w:p>
+            <w:pPr>
+              <w:spacing w:after="40"/>
+            </w:pPr>
+            <w:r>
+              <w:rPr>
+                <w:rFonts w:ascii="Montserrat" w:hAnsi="Montserrat" w:eastAsia="Montserrat"/>
+                <w:b/>
+                <w:i w:val="0"/>
+                <w:color w:val="4F7A5A"/>
+                <w:sz w:val="18"/>
+              </w:rPr>
+              <w:t>TIP DEL ASESOR</w:t>
+            </w:r>
+          </w:p>
+          <w:p>
+            <w:pPr>
+              <w:spacing w:after="40"/>
+            </w:pPr>
+            <w:r>
+              <w:rPr>
+                <w:rFonts w:ascii="Montserrat" w:hAnsi="Montserrat" w:eastAsia="Montserrat"/>
+                <w:b w:val="0"/>
+                <w:i w:val="0"/>
+                <w:color w:val="2C3E50"/>
+                <w:sz w:val="21"/>
+              </w:rPr>
+              <w:t>Es el destino natural al terminar los 12 meses de columbario temporal de la Solución Modular.</w:t>
+            </w:r>
+          </w:p>
+        </w:tc>
+      </w:tr>
+    </w:tbl>
+    <w:p>
+      <w:pPr>
+        <w:spacing w:before="0" w:after="80" w:line="276" w:lineRule="auto"/>
+      </w:pPr>
+    </w:p>
+    <w:p>
+      <w:r>
+        <w:br w:type="page"/>
+      </w:r>
+    </w:p>
+    <w:tbl>
+      <w:tblPr>
+        <w:tblW w:type="auto" w:w="0"/>
+        <w:jc w:val="center"/>
+        <w:tblLayout w:type="fixed"/>
+        <w:tblLook w:firstColumn="1" w:firstRow="1" w:lastColumn="0" w:lastRow="0" w:noHBand="0" w:noVBand="1" w:val="04A0"/>
+      </w:tblPr>
+      <w:tblGrid>
+        <w:gridCol w:w="4873"/>
+        <w:gridCol w:w="4873"/>
+      </w:tblGrid>
+      <w:tr>
+        <w:tc>
+          <w:tcPr>
+            <w:tcW w:type="dxa" w:w="6520"/>
+            <w:tcMar>
+              <w:top w:w="124" w:type="dxa"/>
+              <w:left w:w="124" w:type="dxa"/>
+              <w:bottom w:w="124" w:type="dxa"/>
+              <w:right w:w="124" w:type="dxa"/>
+            </w:tcMar>
+            <w:shd w:val="clear" w:color="auto" w:fill="1B365D"/>
+            <w:tcBorders>
+              <w:top w:val="nil"/>
+              <w:left w:val="nil"/>
+              <w:bottom w:val="single" w:sz="36" w:color="C5A059"/>
+              <w:right w:val="nil"/>
+            </w:tcBorders>
+            <w:tcMar>
+              <w:top w:w="226" w:type="dxa"/>
+              <w:left w:w="226" w:type="dxa"/>
+              <w:bottom w:w="226" w:type="dxa"/>
+              <w:right w:w="226" w:type="dxa"/>
+            </w:tcMar>
+          </w:tcPr>
+          <w:p>
+            <w:pPr>
+              <w:spacing w:after="40"/>
+            </w:pPr>
+            <w:r>
+              <w:rPr>
+                <w:rFonts w:ascii="Montserrat" w:hAnsi="Montserrat" w:eastAsia="Montserrat"/>
+                <w:b/>
+                <w:i w:val="0"/>
+                <w:color w:val="C5A059"/>
+                <w:sz w:val="17"/>
+              </w:rPr>
+              <w:t>HOGAR DE LAS MEMORIAS · COLUMBARIO PREMIUM</w:t>
+            </w:r>
+          </w:p>
+          <w:p>
+            <w:r>
+              <w:rPr>
+                <w:rFonts w:ascii="Playfair Display" w:hAnsi="Playfair Display" w:eastAsia="Playfair Display"/>
+                <w:b/>
+                <w:i w:val="0"/>
+                <w:color w:val="FFFFFF"/>
+                <w:sz w:val="36"/>
+              </w:rPr>
+              <w:t>Columbario Ónix</w:t>
+            </w:r>
+          </w:p>
+        </w:tc>
+        <w:tc>
+          <w:tcPr>
+            <w:tcW w:type="dxa" w:w="3118"/>
+            <w:tcMar>
+              <w:top w:w="124" w:type="dxa"/>
+              <w:left w:w="124" w:type="dxa"/>
+              <w:bottom w:w="124" w:type="dxa"/>
+              <w:right w:w="124" w:type="dxa"/>
+            </w:tcMar>
+            <w:shd w:val="clear" w:color="auto" w:fill="1B365D"/>
+            <w:tcBorders>
+              <w:top w:val="nil"/>
+              <w:left w:val="nil"/>
+              <w:bottom w:val="single" w:sz="36" w:color="C5A059"/>
+              <w:right w:val="nil"/>
+            </w:tcBorders>
+            <w:tcMar>
+              <w:top w:w="226" w:type="dxa"/>
+              <w:left w:w="226" w:type="dxa"/>
+              <w:bottom w:w="226" w:type="dxa"/>
+              <w:right w:w="226" w:type="dxa"/>
+            </w:tcMar>
+          </w:tcPr>
+          <w:p>
+            <w:pPr>
+              <w:spacing w:after="40"/>
+              <w:jc w:val="right"/>
+            </w:pPr>
+            <w:r>
+              <w:rPr>
+                <w:rFonts w:ascii="Montserrat" w:hAnsi="Montserrat" w:eastAsia="Montserrat"/>
+                <w:b/>
+                <w:i w:val="0"/>
+                <w:color w:val="C5A059"/>
+                <w:sz w:val="17"/>
+              </w:rPr>
+              <w:t>PRECIO SEGÚN MODALIDAD</w:t>
+            </w:r>
+          </w:p>
+          <w:p>
+            <w:pPr>
+              <w:jc w:val="right"/>
+            </w:pPr>
+            <w:r>
+              <w:rPr>
+                <w:rFonts w:ascii="Montserrat" w:hAnsi="Montserrat" w:eastAsia="Montserrat"/>
+                <w:b/>
+                <w:i w:val="0"/>
+                <w:color w:val="FFFFFF"/>
+                <w:sz w:val="36"/>
+              </w:rPr>
+              <w:t>US$ 3.100 / 5.000</w:t>
+            </w:r>
+          </w:p>
+        </w:tc>
+      </w:tr>
+    </w:tbl>
+    <w:p>
+      <w:pPr>
+        <w:spacing w:before="80" w:after="160" w:line="276" w:lineRule="auto"/>
+      </w:pPr>
+      <w:r>
+        <w:rPr>
+          <w:rFonts w:ascii="Montserrat" w:hAnsi="Montserrat" w:eastAsia="Montserrat"/>
+          <w:b w:val="0"/>
+          <w:i/>
+          <w:color w:val="7A8794"/>
+          <w:sz w:val="19"/>
+        </w:rPr>
+        <w:t>Finados y noviembre (−15%): US$ 2.635 / US$ 4.250 · Pago único o hasta 120 meses, con intereses</w:t>
+      </w:r>
+    </w:p>
+    <w:p>
+      <w:pPr>
+        <w:spacing w:before="0" w:after="120" w:line="276" w:lineRule="auto"/>
+      </w:pPr>
+      <w:r>
+        <w:rPr>
+          <w:rFonts w:ascii="Montserrat" w:hAnsi="Montserrat" w:eastAsia="Montserrat"/>
+          <w:b/>
+          <w:i w:val="0"/>
+          <w:color w:val="1B365D"/>
+          <w:sz w:val="21"/>
+        </w:rPr>
+        <w:t xml:space="preserve">Qué es. </w:t>
+      </w:r>
+      <w:r>
+        <w:rPr>
+          <w:rFonts w:ascii="Montserrat" w:hAnsi="Montserrat" w:eastAsia="Montserrat"/>
+          <w:b w:val="0"/>
+          <w:i w:val="0"/>
+          <w:color w:val="2C3E50"/>
+          <w:sz w:val="21"/>
+        </w:rPr>
+        <w:t>Columbario de ónix natural, una piedra de tonos cálidos y apariencia luminosa, para un homenaje exclusivo y perdurable.</w:t>
+      </w:r>
+    </w:p>
+    <w:p>
+      <w:pPr>
+        <w:spacing w:before="0" w:after="160" w:line="276" w:lineRule="auto"/>
+      </w:pPr>
+      <w:r>
+        <w:rPr>
+          <w:rFonts w:ascii="Montserrat" w:hAnsi="Montserrat" w:eastAsia="Montserrat"/>
+          <w:b/>
+          <w:i w:val="0"/>
+          <w:color w:val="1B365D"/>
+          <w:sz w:val="21"/>
+        </w:rPr>
+        <w:t xml:space="preserve">Para quién. </w:t>
+      </w:r>
+      <w:r>
+        <w:rPr>
+          <w:rFonts w:ascii="Montserrat" w:hAnsi="Montserrat" w:eastAsia="Montserrat"/>
+          <w:b w:val="0"/>
+          <w:i w:val="0"/>
+          <w:color w:val="2C3E50"/>
+          <w:sz w:val="21"/>
+        </w:rPr>
+        <w:t>Familias que buscan exclusividad y una piedra natural de alta gama para el homenaje.</w:t>
+      </w:r>
+    </w:p>
+    <w:tbl>
+      <w:tblPr>
+        <w:tblW w:type="auto" w:w="0"/>
+        <w:jc w:val="center"/>
+        <w:tblLayout w:type="fixed"/>
+        <w:tblLook w:firstColumn="1" w:firstRow="1" w:lastColumn="0" w:lastRow="0" w:noHBand="0" w:noVBand="1" w:val="04A0"/>
+      </w:tblPr>
+      <w:tblGrid>
+        <w:gridCol w:w="4873"/>
+        <w:gridCol w:w="4873"/>
+      </w:tblGrid>
+      <w:tr>
+        <w:tc>
+          <w:tcPr>
+            <w:tcW w:type="dxa" w:w="4819"/>
+            <w:tcMar>
+              <w:top w:w="124" w:type="dxa"/>
+              <w:left w:w="124" w:type="dxa"/>
+              <w:bottom w:w="124" w:type="dxa"/>
+              <w:right w:w="124" w:type="dxa"/>
+            </w:tcMar>
+            <w:shd w:val="clear" w:color="auto" w:fill="F4F7FA"/>
+            <w:tcBorders>
+              <w:top w:val="single" w:sz="24" w:color="C5A059"/>
+              <w:left w:val="single" w:sz="24" w:color="FFFFFF"/>
+              <w:bottom w:val="nil"/>
+              <w:right w:val="single" w:sz="24" w:color="FFFFFF"/>
+            </w:tcBorders>
+            <w:tcMar>
+              <w:top w:w="170" w:type="dxa"/>
+              <w:left w:w="170" w:type="dxa"/>
+              <w:bottom w:w="170" w:type="dxa"/>
+              <w:right w:w="170" w:type="dxa"/>
+            </w:tcMar>
+          </w:tcPr>
+          <w:p>
+            <w:pPr>
+              <w:spacing w:after="40"/>
+            </w:pPr>
+            <w:r>
+              <w:rPr>
+                <w:rFonts w:ascii="Montserrat" w:hAnsi="Montserrat" w:eastAsia="Montserrat"/>
+                <w:b/>
+                <w:i w:val="0"/>
+                <w:color w:val="1B365D"/>
+                <w:sz w:val="17"/>
+              </w:rPr>
+              <w:t>QUÉ INCLUYE</w:t>
+            </w:r>
+          </w:p>
+          <w:p>
+            <w:pPr>
+              <w:spacing w:after="40"/>
+              <w:ind w:left="255" w:hanging="255"/>
+            </w:pPr>
+            <w:r>
+              <w:rPr>
+                <w:rFonts w:ascii="Montserrat" w:hAnsi="Montserrat" w:eastAsia="Montserrat"/>
+                <w:b/>
+                <w:i w:val="0"/>
+                <w:color w:val="4F7A5A"/>
+                <w:sz w:val="18"/>
+              </w:rPr>
+              <w:t xml:space="preserve">✓  </w:t>
+            </w:r>
+            <w:r>
+              <w:rPr>
+                <w:rFonts w:ascii="Montserrat" w:hAnsi="Montserrat" w:eastAsia="Montserrat"/>
+                <w:b w:val="0"/>
+                <w:i w:val="0"/>
+                <w:color w:val="2C3E50"/>
+                <w:sz w:val="19"/>
+              </w:rPr>
+              <w:t>Espacio permanente en columbario de ónix natural</w:t>
+            </w:r>
+          </w:p>
+          <w:p>
+            <w:pPr>
+              <w:spacing w:after="40"/>
+              <w:ind w:left="255" w:hanging="255"/>
+            </w:pPr>
+            <w:r>
+              <w:rPr>
+                <w:rFonts w:ascii="Montserrat" w:hAnsi="Montserrat" w:eastAsia="Montserrat"/>
+                <w:b/>
+                <w:i w:val="0"/>
+                <w:color w:val="4F7A5A"/>
+                <w:sz w:val="18"/>
+              </w:rPr>
+              <w:t xml:space="preserve">✓  </w:t>
+            </w:r>
+            <w:r>
+              <w:rPr>
+                <w:rFonts w:ascii="Montserrat" w:hAnsi="Montserrat" w:eastAsia="Montserrat"/>
+                <w:b w:val="0"/>
+                <w:i w:val="0"/>
+                <w:color w:val="2C3E50"/>
+                <w:sz w:val="19"/>
+              </w:rPr>
+              <w:t>Estándar: hasta 2 urnas, con ubicación definida (US$ 3.100)</w:t>
+            </w:r>
+          </w:p>
+          <w:p>
+            <w:pPr>
+              <w:spacing w:after="40"/>
+              <w:ind w:left="255" w:hanging="255"/>
+            </w:pPr>
+            <w:r>
+              <w:rPr>
+                <w:rFonts w:ascii="Montserrat" w:hAnsi="Montserrat" w:eastAsia="Montserrat"/>
+                <w:b/>
+                <w:i w:val="0"/>
+                <w:color w:val="4F7A5A"/>
+                <w:sz w:val="18"/>
+              </w:rPr>
+              <w:t xml:space="preserve">✓  </w:t>
+            </w:r>
+            <w:r>
+              <w:rPr>
+                <w:rFonts w:ascii="Montserrat" w:hAnsi="Montserrat" w:eastAsia="Montserrat"/>
+                <w:b w:val="0"/>
+                <w:i w:val="0"/>
+                <w:color w:val="2C3E50"/>
+                <w:sz w:val="19"/>
+              </w:rPr>
+              <w:t>Familiar: hasta 4 urnas, con ubicación a futuro (US$ 5.000)</w:t>
+            </w:r>
+          </w:p>
+        </w:tc>
+        <w:tc>
+          <w:tcPr>
+            <w:tcW w:type="dxa" w:w="4819"/>
+            <w:tcMar>
+              <w:top w:w="124" w:type="dxa"/>
+              <w:left w:w="124" w:type="dxa"/>
+              <w:bottom w:w="124" w:type="dxa"/>
+              <w:right w:w="124" w:type="dxa"/>
+            </w:tcMar>
+            <w:shd w:val="clear" w:color="auto" w:fill="F4F7FA"/>
+            <w:tcBorders>
+              <w:top w:val="single" w:sz="24" w:color="C5A059"/>
+              <w:left w:val="single" w:sz="24" w:color="FFFFFF"/>
+              <w:bottom w:val="nil"/>
+              <w:right w:val="single" w:sz="24" w:color="FFFFFF"/>
+            </w:tcBorders>
+            <w:tcMar>
+              <w:top w:w="170" w:type="dxa"/>
+              <w:left w:w="170" w:type="dxa"/>
+              <w:bottom w:w="170" w:type="dxa"/>
+              <w:right w:w="170" w:type="dxa"/>
+            </w:tcMar>
+          </w:tcPr>
+          <w:p>
+            <w:pPr>
+              <w:spacing w:after="40"/>
+            </w:pPr>
+            <w:r>
+              <w:rPr>
+                <w:rFonts w:ascii="Montserrat" w:hAnsi="Montserrat" w:eastAsia="Montserrat"/>
+                <w:b/>
+                <w:i w:val="0"/>
+                <w:color w:val="1B365D"/>
+                <w:sz w:val="17"/>
+              </w:rPr>
+              <w:t>REGLAS DEL PRODUCTO</w:t>
+            </w:r>
+          </w:p>
+          <w:p>
+            <w:pPr>
+              <w:spacing w:after="40"/>
+              <w:ind w:left="255" w:hanging="255"/>
+            </w:pPr>
+            <w:r>
+              <w:rPr>
+                <w:rFonts w:ascii="Montserrat" w:hAnsi="Montserrat" w:eastAsia="Montserrat"/>
+                <w:b/>
+                <w:i w:val="0"/>
+                <w:color w:val="C5A059"/>
+                <w:sz w:val="18"/>
+              </w:rPr>
+              <w:t xml:space="preserve">■  </w:t>
+            </w:r>
+            <w:r>
+              <w:rPr>
+                <w:rFonts w:ascii="Montserrat" w:hAnsi="Montserrat" w:eastAsia="Montserrat"/>
+                <w:b w:val="0"/>
+                <w:i w:val="0"/>
+                <w:color w:val="2C3E50"/>
+                <w:sz w:val="19"/>
+              </w:rPr>
+              <w:t>Solo columbario: la cremación se contrata aparte.</w:t>
+            </w:r>
+          </w:p>
+          <w:p>
+            <w:pPr>
+              <w:spacing w:after="40"/>
+              <w:ind w:left="255" w:hanging="255"/>
+            </w:pPr>
+            <w:r>
+              <w:rPr>
+                <w:rFonts w:ascii="Montserrat" w:hAnsi="Montserrat" w:eastAsia="Montserrat"/>
+                <w:b/>
+                <w:i w:val="0"/>
+                <w:color w:val="C5A059"/>
+                <w:sz w:val="18"/>
+              </w:rPr>
+              <w:t xml:space="preserve">■  </w:t>
+            </w:r>
+            <w:r>
+              <w:rPr>
+                <w:rFonts w:ascii="Montserrat" w:hAnsi="Montserrat" w:eastAsia="Montserrat"/>
+                <w:b w:val="0"/>
+                <w:i w:val="0"/>
+                <w:color w:val="2C3E50"/>
+                <w:sz w:val="19"/>
+              </w:rPr>
+              <w:t>Estándar (2 urnas) con ubicación definida; Familiar (4 urnas) con ubicación a futuro.</w:t>
+            </w:r>
+          </w:p>
+        </w:tc>
+      </w:tr>
+    </w:tbl>
+    <w:p>
+      <w:pPr>
+        <w:spacing w:before="0" w:after="80" w:line="276" w:lineRule="auto"/>
+      </w:pPr>
+    </w:p>
+    <w:p>
+      <w:pPr>
+        <w:spacing w:before="120" w:after="40" w:line="276" w:lineRule="auto"/>
+      </w:pPr>
+      <w:r>
+        <w:rPr>
+          <w:rFonts w:ascii="Montserrat" w:hAnsi="Montserrat" w:eastAsia="Montserrat"/>
+          <w:b/>
+          <w:i w:val="0"/>
+          <w:color w:val="C5A059"/>
+          <w:sz w:val="17"/>
+        </w:rPr>
+        <w:t>SPEECH SUGERIDO</w:t>
+      </w:r>
+    </w:p>
+    <w:tbl>
+      <w:tblPr>
+        <w:tblW w:type="auto" w:w="0"/>
+        <w:jc w:val="center"/>
+        <w:tblLayout w:type="fixed"/>
+        <w:tblLook w:firstColumn="1" w:firstRow="1" w:lastColumn="0" w:lastRow="0" w:noHBand="0" w:noVBand="1" w:val="04A0"/>
+      </w:tblPr>
+      <w:tblGrid>
+        <w:gridCol w:w="9746"/>
+      </w:tblGrid>
+      <w:tr>
+        <w:tc>
+          <w:tcPr>
+            <w:tcW w:type="dxa" w:w="9638"/>
+            <w:tcMar>
+              <w:top w:w="124" w:type="dxa"/>
+              <w:left w:w="124" w:type="dxa"/>
+              <w:bottom w:w="124" w:type="dxa"/>
+              <w:right w:w="124" w:type="dxa"/>
+            </w:tcMar>
+            <w:shd w:val="clear" w:color="auto" w:fill="FBF3E1"/>
+            <w:tcBorders>
+              <w:top w:val="nil"/>
+              <w:left w:val="single" w:sz="36" w:color="C5A059"/>
+              <w:bottom w:val="nil"/>
+              <w:right w:val="nil"/>
+            </w:tcBorders>
+            <w:tcMar>
+              <w:top w:w="198" w:type="dxa"/>
+              <w:left w:w="198" w:type="dxa"/>
+              <w:bottom w:w="198" w:type="dxa"/>
+              <w:right w:w="198" w:type="dxa"/>
+            </w:tcMar>
+          </w:tcPr>
+          <w:p>
+            <w:pPr>
+              <w:spacing w:after="40"/>
+            </w:pPr>
+            <w:r>
+              <w:rPr>
+                <w:rFonts w:ascii="Montserrat" w:hAnsi="Montserrat" w:eastAsia="Montserrat"/>
+                <w:b w:val="0"/>
+                <w:i w:val="0"/>
+                <w:color w:val="2C3E50"/>
+                <w:sz w:val="21"/>
+              </w:rPr>
+              <w:t>«El ónix es una piedra natural única: su luz y sus tonos cálidos hacen de cada espacio un lugar de paz. Es un homenaje distinto, a la altura de quien usted ama.»</w:t>
+            </w:r>
+          </w:p>
+        </w:tc>
+      </w:tr>
+    </w:tbl>
+    <w:p>
+      <w:pPr>
+        <w:spacing w:before="0" w:after="80" w:line="276" w:lineRule="auto"/>
+      </w:pPr>
+    </w:p>
+    <w:p>
+      <w:pPr>
+        <w:spacing w:before="120" w:after="40" w:line="276" w:lineRule="auto"/>
+      </w:pPr>
+      <w:r>
+        <w:rPr>
+          <w:rFonts w:ascii="Montserrat" w:hAnsi="Montserrat" w:eastAsia="Montserrat"/>
+          <w:b/>
+          <w:i w:val="0"/>
+          <w:color w:val="C5A059"/>
+          <w:sz w:val="17"/>
+        </w:rPr>
+        <w:t>PREGUNTAS DE DESCUBRIMIENTO</w:t>
+      </w:r>
+    </w:p>
+    <w:p>
+      <w:pPr>
+        <w:spacing w:before="0" w:after="60" w:line="276" w:lineRule="auto"/>
+        <w:ind w:left="340" w:hanging="340"/>
+      </w:pPr>
+      <w:r>
+        <w:rPr>
+          <w:rFonts w:ascii="Montserrat" w:hAnsi="Montserrat" w:eastAsia="Montserrat"/>
+          <w:b w:val="0"/>
+          <w:i w:val="0"/>
+          <w:color w:val="C5A059"/>
+          <w:sz w:val="14"/>
+        </w:rPr>
+        <w:t xml:space="preserve">?  </w:t>
+      </w:r>
+      <w:r>
+        <w:rPr>
+          <w:rFonts w:ascii="Montserrat" w:hAnsi="Montserrat" w:eastAsia="Montserrat"/>
+          <w:b w:val="0"/>
+          <w:i w:val="0"/>
+          <w:color w:val="2C3E50"/>
+          <w:sz w:val="20"/>
+        </w:rPr>
+        <w:t>¿Qué tipo de homenaje imagina para su familia?</w:t>
+      </w:r>
+    </w:p>
+    <w:p>
+      <w:pPr>
+        <w:spacing w:before="0" w:after="60" w:line="276" w:lineRule="auto"/>
+        <w:ind w:left="340" w:hanging="340"/>
+      </w:pPr>
+      <w:r>
+        <w:rPr>
+          <w:rFonts w:ascii="Montserrat" w:hAnsi="Montserrat" w:eastAsia="Montserrat"/>
+          <w:b w:val="0"/>
+          <w:i w:val="0"/>
+          <w:color w:val="C5A059"/>
+          <w:sz w:val="14"/>
+        </w:rPr>
+        <w:t xml:space="preserve">?  </w:t>
+      </w:r>
+      <w:r>
+        <w:rPr>
+          <w:rFonts w:ascii="Montserrat" w:hAnsi="Montserrat" w:eastAsia="Montserrat"/>
+          <w:b w:val="0"/>
+          <w:i w:val="0"/>
+          <w:color w:val="2C3E50"/>
+          <w:sz w:val="20"/>
+        </w:rPr>
+        <w:t>¿Sería para dos personas o para la familia completa?</w:t>
+      </w:r>
+    </w:p>
+    <w:p>
+      <w:pPr>
+        <w:spacing w:before="120" w:after="40" w:line="276" w:lineRule="auto"/>
+      </w:pPr>
+      <w:r>
+        <w:rPr>
+          <w:rFonts w:ascii="Montserrat" w:hAnsi="Montserrat" w:eastAsia="Montserrat"/>
+          <w:b/>
+          <w:i w:val="0"/>
+          <w:color w:val="C5A059"/>
+          <w:sz w:val="17"/>
+        </w:rPr>
+        <w:t>FRASE DE CIERRE</w:t>
+      </w:r>
+    </w:p>
+    <w:p>
+      <w:pPr>
+        <w:spacing w:before="0" w:after="120" w:line="276" w:lineRule="auto"/>
+      </w:pPr>
+      <w:r>
+        <w:rPr>
+          <w:rFonts w:ascii="Montserrat" w:hAnsi="Montserrat" w:eastAsia="Montserrat"/>
+          <w:b w:val="0"/>
+          <w:i/>
+          <w:color w:val="1B365D"/>
+          <w:sz w:val="21"/>
+        </w:rPr>
+        <w:t>«¿Le muestro el columbario de ónix para que vea la piedra en persona?»</w:t>
+      </w:r>
+    </w:p>
+    <w:p>
+      <w:pPr>
+        <w:spacing w:before="120" w:after="40" w:line="276" w:lineRule="auto"/>
+      </w:pPr>
+      <w:r>
+        <w:rPr>
+          <w:rFonts w:ascii="Montserrat" w:hAnsi="Montserrat" w:eastAsia="Montserrat"/>
+          <w:b/>
+          <w:i w:val="0"/>
+          <w:color w:val="C5A059"/>
+          <w:sz w:val="17"/>
+        </w:rPr>
+        <w:t>OBJECIÓN TÍPICA</w:t>
+      </w:r>
+    </w:p>
+    <w:p>
+      <w:pPr>
+        <w:spacing w:before="0" w:after="120" w:line="276" w:lineRule="auto"/>
+      </w:pPr>
+      <w:r>
+        <w:rPr>
+          <w:rFonts w:ascii="Montserrat" w:hAnsi="Montserrat" w:eastAsia="Montserrat"/>
+          <w:b w:val="0"/>
+          <w:i w:val="0"/>
+          <w:color w:val="2C3E50"/>
+          <w:sz w:val="20"/>
+        </w:rPr>
+        <w:t>«Hay opciones más baratas.» → «Sí, y con gusto se las muestro. El ónix es para quien busca algo único: una piedra natural que no se repite.»</w:t>
+      </w:r>
+    </w:p>
+    <w:tbl>
+      <w:tblPr>
+        <w:tblW w:type="auto" w:w="0"/>
+        <w:jc w:val="center"/>
+        <w:tblLayout w:type="fixed"/>
+        <w:tblLook w:firstColumn="1" w:firstRow="1" w:lastColumn="0" w:lastRow="0" w:noHBand="0" w:noVBand="1" w:val="04A0"/>
+      </w:tblPr>
+      <w:tblGrid>
+        <w:gridCol w:w="9746"/>
+      </w:tblGrid>
+      <w:tr>
+        <w:tc>
+          <w:tcPr>
+            <w:tcW w:type="dxa" w:w="9638"/>
+            <w:tcMar>
+              <w:top w:w="124" w:type="dxa"/>
+              <w:left w:w="124" w:type="dxa"/>
+              <w:bottom w:w="124" w:type="dxa"/>
+              <w:right w:w="124" w:type="dxa"/>
+            </w:tcMar>
+            <w:shd w:val="clear" w:color="auto" w:fill="F4F7FA"/>
+            <w:tcBorders>
+              <w:top w:val="nil"/>
+              <w:left w:val="single" w:sz="36" w:color="4F7A5A"/>
+              <w:bottom w:val="nil"/>
+              <w:right w:val="nil"/>
+            </w:tcBorders>
+            <w:tcMar>
+              <w:top w:w="198" w:type="dxa"/>
+              <w:left w:w="198" w:type="dxa"/>
+              <w:bottom w:w="198" w:type="dxa"/>
+              <w:right w:w="198" w:type="dxa"/>
+            </w:tcMar>
+          </w:tcPr>
+          <w:p>
+            <w:pPr>
+              <w:spacing w:after="40"/>
+            </w:pPr>
+            <w:r>
+              <w:rPr>
+                <w:rFonts w:ascii="Montserrat" w:hAnsi="Montserrat" w:eastAsia="Montserrat"/>
+                <w:b/>
+                <w:i w:val="0"/>
+                <w:color w:val="4F7A5A"/>
+                <w:sz w:val="18"/>
+              </w:rPr>
+              <w:t>TIP DEL ASESOR</w:t>
+            </w:r>
+          </w:p>
+          <w:p>
+            <w:pPr>
+              <w:spacing w:after="40"/>
+            </w:pPr>
+            <w:r>
+              <w:rPr>
+                <w:rFonts w:ascii="Montserrat" w:hAnsi="Montserrat" w:eastAsia="Montserrat"/>
+                <w:b w:val="0"/>
+                <w:i w:val="0"/>
+                <w:color w:val="2C3E50"/>
+                <w:sz w:val="21"/>
+              </w:rPr>
+              <w:t>Muestre la piedra en persona: la luz del ónix se aprecia mejor que en cualquier foto.</w:t>
+            </w:r>
+          </w:p>
+        </w:tc>
+      </w:tr>
+    </w:tbl>
+    <w:p>
+      <w:pPr>
+        <w:spacing w:before="0" w:after="80" w:line="276" w:lineRule="auto"/>
+      </w:pPr>
+    </w:p>
+    <w:p>
+      <w:r>
+        <w:br w:type="page"/>
+      </w:r>
+    </w:p>
+    <w:tbl>
+      <w:tblPr>
+        <w:tblW w:type="auto" w:w="0"/>
+        <w:jc w:val="center"/>
+        <w:tblLayout w:type="fixed"/>
+        <w:tblLook w:firstColumn="1" w:firstRow="1" w:lastColumn="0" w:lastRow="0" w:noHBand="0" w:noVBand="1" w:val="04A0"/>
+      </w:tblPr>
+      <w:tblGrid>
+        <w:gridCol w:w="4873"/>
+        <w:gridCol w:w="4873"/>
+      </w:tblGrid>
+      <w:tr>
+        <w:tc>
+          <w:tcPr>
+            <w:tcW w:type="dxa" w:w="6520"/>
+            <w:tcMar>
+              <w:top w:w="124" w:type="dxa"/>
+              <w:left w:w="124" w:type="dxa"/>
+              <w:bottom w:w="124" w:type="dxa"/>
+              <w:right w:w="124" w:type="dxa"/>
+            </w:tcMar>
+            <w:shd w:val="clear" w:color="auto" w:fill="1B365D"/>
+            <w:tcBorders>
+              <w:top w:val="nil"/>
+              <w:left w:val="nil"/>
+              <w:bottom w:val="single" w:sz="36" w:color="C5A059"/>
+              <w:right w:val="nil"/>
+            </w:tcBorders>
+            <w:tcMar>
+              <w:top w:w="226" w:type="dxa"/>
+              <w:left w:w="226" w:type="dxa"/>
+              <w:bottom w:w="226" w:type="dxa"/>
+              <w:right w:w="226" w:type="dxa"/>
+            </w:tcMar>
+          </w:tcPr>
+          <w:p>
+            <w:pPr>
+              <w:spacing w:after="40"/>
+            </w:pPr>
+            <w:r>
+              <w:rPr>
+                <w:rFonts w:ascii="Montserrat" w:hAnsi="Montserrat" w:eastAsia="Montserrat"/>
+                <w:b/>
+                <w:i w:val="0"/>
+                <w:color w:val="C5A059"/>
+                <w:sz w:val="17"/>
+              </w:rPr>
+              <w:t>HOGAR DE LAS MEMORIAS · COLUMBARIO FAMILIAR EXCLUSIVO</w:t>
+            </w:r>
+          </w:p>
+          <w:p>
+            <w:r>
+              <w:rPr>
+                <w:rFonts w:ascii="Playfair Display" w:hAnsi="Playfair Display" w:eastAsia="Playfair Display"/>
+                <w:b/>
+                <w:i w:val="0"/>
+                <w:color w:val="FFFFFF"/>
+                <w:sz w:val="36"/>
+              </w:rPr>
+              <w:t>Columbario Obra de Arte</w:t>
+            </w:r>
+          </w:p>
+        </w:tc>
+        <w:tc>
+          <w:tcPr>
+            <w:tcW w:type="dxa" w:w="3118"/>
+            <w:tcMar>
+              <w:top w:w="124" w:type="dxa"/>
+              <w:left w:w="124" w:type="dxa"/>
+              <w:bottom w:w="124" w:type="dxa"/>
+              <w:right w:w="124" w:type="dxa"/>
+            </w:tcMar>
+            <w:shd w:val="clear" w:color="auto" w:fill="1B365D"/>
+            <w:tcBorders>
+              <w:top w:val="nil"/>
+              <w:left w:val="nil"/>
+              <w:bottom w:val="single" w:sz="36" w:color="C5A059"/>
+              <w:right w:val="nil"/>
+            </w:tcBorders>
+            <w:tcMar>
+              <w:top w:w="226" w:type="dxa"/>
+              <w:left w:w="226" w:type="dxa"/>
+              <w:bottom w:w="226" w:type="dxa"/>
+              <w:right w:w="226" w:type="dxa"/>
+            </w:tcMar>
+          </w:tcPr>
+          <w:p>
+            <w:pPr>
+              <w:spacing w:after="40"/>
+              <w:jc w:val="right"/>
+            </w:pPr>
+            <w:r>
+              <w:rPr>
+                <w:rFonts w:ascii="Montserrat" w:hAnsi="Montserrat" w:eastAsia="Montserrat"/>
+                <w:b/>
+                <w:i w:val="0"/>
+                <w:color w:val="C5A059"/>
+                <w:sz w:val="17"/>
+              </w:rPr>
+              <w:t>PRECIO</w:t>
+            </w:r>
+          </w:p>
+          <w:p>
+            <w:pPr>
+              <w:jc w:val="right"/>
+            </w:pPr>
+            <w:r>
+              <w:rPr>
+                <w:rFonts w:ascii="Montserrat" w:hAnsi="Montserrat" w:eastAsia="Montserrat"/>
+                <w:b/>
+                <w:i w:val="0"/>
+                <w:color w:val="FFFFFF"/>
+                <w:sz w:val="36"/>
+              </w:rPr>
+              <w:t>US$ 12.500</w:t>
+            </w:r>
+          </w:p>
+        </w:tc>
+      </w:tr>
+    </w:tbl>
+    <w:p>
+      <w:pPr>
+        <w:spacing w:before="80" w:after="160" w:line="276" w:lineRule="auto"/>
+      </w:pPr>
+      <w:r>
+        <w:rPr>
+          <w:rFonts w:ascii="Montserrat" w:hAnsi="Montserrat" w:eastAsia="Montserrat"/>
+          <w:b w:val="0"/>
+          <w:i/>
+          <w:color w:val="7A8794"/>
+          <w:sz w:val="19"/>
+        </w:rPr>
+        <w:t>Finados y noviembre (−15%): US$ 10.625 · Pago único o hasta 120 meses, con intereses</w:t>
+      </w:r>
+    </w:p>
+    <w:p>
+      <w:pPr>
+        <w:spacing w:before="0" w:after="120" w:line="276" w:lineRule="auto"/>
+      </w:pPr>
+      <w:r>
+        <w:rPr>
+          <w:rFonts w:ascii="Montserrat" w:hAnsi="Montserrat" w:eastAsia="Montserrat"/>
+          <w:b/>
+          <w:i w:val="0"/>
+          <w:color w:val="1B365D"/>
+          <w:sz w:val="21"/>
+        </w:rPr>
+        <w:t xml:space="preserve">Qué es. </w:t>
+      </w:r>
+      <w:r>
+        <w:rPr>
+          <w:rFonts w:ascii="Montserrat" w:hAnsi="Montserrat" w:eastAsia="Montserrat"/>
+          <w:b w:val="0"/>
+          <w:i w:val="0"/>
+          <w:color w:val="2C3E50"/>
+          <w:sz w:val="21"/>
+        </w:rPr>
+        <w:t>Columbario familiar con tapa de ónix y obra de arte religiosa: una expresión única de fe, memoria y belleza para toda una familia.</w:t>
+      </w:r>
+    </w:p>
+    <w:p>
+      <w:pPr>
+        <w:spacing w:before="0" w:after="160" w:line="276" w:lineRule="auto"/>
+      </w:pPr>
+      <w:r>
+        <w:rPr>
+          <w:rFonts w:ascii="Montserrat" w:hAnsi="Montserrat" w:eastAsia="Montserrat"/>
+          <w:b/>
+          <w:i w:val="0"/>
+          <w:color w:val="1B365D"/>
+          <w:sz w:val="21"/>
+        </w:rPr>
+        <w:t xml:space="preserve">Para quién. </w:t>
+      </w:r>
+      <w:r>
+        <w:rPr>
+          <w:rFonts w:ascii="Montserrat" w:hAnsi="Montserrat" w:eastAsia="Montserrat"/>
+          <w:b w:val="0"/>
+          <w:i w:val="0"/>
+          <w:color w:val="2C3E50"/>
+          <w:sz w:val="21"/>
+        </w:rPr>
+        <w:t>Familias de fe que desean un legado único y de máxima exclusividad.</w:t>
+      </w:r>
+    </w:p>
+    <w:tbl>
+      <w:tblPr>
+        <w:tblW w:type="auto" w:w="0"/>
+        <w:jc w:val="center"/>
+        <w:tblLayout w:type="fixed"/>
+        <w:tblLook w:firstColumn="1" w:firstRow="1" w:lastColumn="0" w:lastRow="0" w:noHBand="0" w:noVBand="1" w:val="04A0"/>
+      </w:tblPr>
+      <w:tblGrid>
+        <w:gridCol w:w="4873"/>
+        <w:gridCol w:w="4873"/>
+      </w:tblGrid>
+      <w:tr>
+        <w:tc>
+          <w:tcPr>
+            <w:tcW w:type="dxa" w:w="4819"/>
+            <w:tcMar>
+              <w:top w:w="124" w:type="dxa"/>
+              <w:left w:w="124" w:type="dxa"/>
+              <w:bottom w:w="124" w:type="dxa"/>
+              <w:right w:w="124" w:type="dxa"/>
+            </w:tcMar>
+            <w:shd w:val="clear" w:color="auto" w:fill="F4F7FA"/>
+            <w:tcBorders>
+              <w:top w:val="single" w:sz="24" w:color="C5A059"/>
+              <w:left w:val="single" w:sz="24" w:color="FFFFFF"/>
+              <w:bottom w:val="nil"/>
+              <w:right w:val="single" w:sz="24" w:color="FFFFFF"/>
+            </w:tcBorders>
+            <w:tcMar>
+              <w:top w:w="170" w:type="dxa"/>
+              <w:left w:w="170" w:type="dxa"/>
+              <w:bottom w:w="170" w:type="dxa"/>
+              <w:right w:w="170" w:type="dxa"/>
+            </w:tcMar>
+          </w:tcPr>
+          <w:p>
+            <w:pPr>
+              <w:spacing w:after="40"/>
+            </w:pPr>
+            <w:r>
+              <w:rPr>
+                <w:rFonts w:ascii="Montserrat" w:hAnsi="Montserrat" w:eastAsia="Montserrat"/>
+                <w:b/>
+                <w:i w:val="0"/>
+                <w:color w:val="1B365D"/>
+                <w:sz w:val="17"/>
+              </w:rPr>
+              <w:t>QUÉ INCLUYE</w:t>
+            </w:r>
+          </w:p>
+          <w:p>
+            <w:pPr>
+              <w:spacing w:after="40"/>
+              <w:ind w:left="255" w:hanging="255"/>
+            </w:pPr>
+            <w:r>
+              <w:rPr>
+                <w:rFonts w:ascii="Montserrat" w:hAnsi="Montserrat" w:eastAsia="Montserrat"/>
+                <w:b/>
+                <w:i w:val="0"/>
+                <w:color w:val="4F7A5A"/>
+                <w:sz w:val="18"/>
+              </w:rPr>
+              <w:t xml:space="preserve">✓  </w:t>
+            </w:r>
+            <w:r>
+              <w:rPr>
+                <w:rFonts w:ascii="Montserrat" w:hAnsi="Montserrat" w:eastAsia="Montserrat"/>
+                <w:b w:val="0"/>
+                <w:i w:val="0"/>
+                <w:color w:val="2C3E50"/>
+                <w:sz w:val="19"/>
+              </w:rPr>
+              <w:t>Columbario familiar permanente para hasta 4 urnas</w:t>
+            </w:r>
+          </w:p>
+          <w:p>
+            <w:pPr>
+              <w:spacing w:after="40"/>
+              <w:ind w:left="255" w:hanging="255"/>
+            </w:pPr>
+            <w:r>
+              <w:rPr>
+                <w:rFonts w:ascii="Montserrat" w:hAnsi="Montserrat" w:eastAsia="Montserrat"/>
+                <w:b/>
+                <w:i w:val="0"/>
+                <w:color w:val="4F7A5A"/>
+                <w:sz w:val="18"/>
+              </w:rPr>
+              <w:t xml:space="preserve">✓  </w:t>
+            </w:r>
+            <w:r>
+              <w:rPr>
+                <w:rFonts w:ascii="Montserrat" w:hAnsi="Montserrat" w:eastAsia="Montserrat"/>
+                <w:b w:val="0"/>
+                <w:i w:val="0"/>
+                <w:color w:val="2C3E50"/>
+                <w:sz w:val="19"/>
+              </w:rPr>
+              <w:t>Tapa exclusiva de ónix con obra de arte religiosa</w:t>
+            </w:r>
+          </w:p>
+          <w:p>
+            <w:pPr>
+              <w:spacing w:after="40"/>
+              <w:ind w:left="255" w:hanging="255"/>
+            </w:pPr>
+            <w:r>
+              <w:rPr>
+                <w:rFonts w:ascii="Montserrat" w:hAnsi="Montserrat" w:eastAsia="Montserrat"/>
+                <w:b/>
+                <w:i w:val="0"/>
+                <w:color w:val="4F7A5A"/>
+                <w:sz w:val="18"/>
+              </w:rPr>
+              <w:t xml:space="preserve">✓  </w:t>
+            </w:r>
+            <w:r>
+              <w:rPr>
+                <w:rFonts w:ascii="Montserrat" w:hAnsi="Montserrat" w:eastAsia="Montserrat"/>
+                <w:b w:val="0"/>
+                <w:i w:val="0"/>
+                <w:color w:val="2C3E50"/>
+                <w:sz w:val="19"/>
+              </w:rPr>
+              <w:t>Ubicación definida</w:t>
+            </w:r>
+          </w:p>
+        </w:tc>
+        <w:tc>
+          <w:tcPr>
+            <w:tcW w:type="dxa" w:w="4819"/>
+            <w:tcMar>
+              <w:top w:w="124" w:type="dxa"/>
+              <w:left w:w="124" w:type="dxa"/>
+              <w:bottom w:w="124" w:type="dxa"/>
+              <w:right w:w="124" w:type="dxa"/>
+            </w:tcMar>
+            <w:shd w:val="clear" w:color="auto" w:fill="F4F7FA"/>
+            <w:tcBorders>
+              <w:top w:val="single" w:sz="24" w:color="C5A059"/>
+              <w:left w:val="single" w:sz="24" w:color="FFFFFF"/>
+              <w:bottom w:val="nil"/>
+              <w:right w:val="single" w:sz="24" w:color="FFFFFF"/>
+            </w:tcBorders>
+            <w:tcMar>
+              <w:top w:w="170" w:type="dxa"/>
+              <w:left w:w="170" w:type="dxa"/>
+              <w:bottom w:w="170" w:type="dxa"/>
+              <w:right w:w="170" w:type="dxa"/>
+            </w:tcMar>
+          </w:tcPr>
+          <w:p>
+            <w:pPr>
+              <w:spacing w:after="40"/>
+            </w:pPr>
+            <w:r>
+              <w:rPr>
+                <w:rFonts w:ascii="Montserrat" w:hAnsi="Montserrat" w:eastAsia="Montserrat"/>
+                <w:b/>
+                <w:i w:val="0"/>
+                <w:color w:val="1B365D"/>
+                <w:sz w:val="17"/>
+              </w:rPr>
+              <w:t>REGLAS DEL PRODUCTO</w:t>
+            </w:r>
+          </w:p>
+          <w:p>
+            <w:pPr>
+              <w:spacing w:after="40"/>
+              <w:ind w:left="255" w:hanging="255"/>
+            </w:pPr>
+            <w:r>
+              <w:rPr>
+                <w:rFonts w:ascii="Montserrat" w:hAnsi="Montserrat" w:eastAsia="Montserrat"/>
+                <w:b/>
+                <w:i w:val="0"/>
+                <w:color w:val="C5A059"/>
+                <w:sz w:val="18"/>
+              </w:rPr>
+              <w:t xml:space="preserve">■  </w:t>
+            </w:r>
+            <w:r>
+              <w:rPr>
+                <w:rFonts w:ascii="Montserrat" w:hAnsi="Montserrat" w:eastAsia="Montserrat"/>
+                <w:b w:val="0"/>
+                <w:i w:val="0"/>
+                <w:color w:val="2C3E50"/>
+                <w:sz w:val="19"/>
+              </w:rPr>
+              <w:t>Capacidad: hasta 4 urnas (familiar).</w:t>
+            </w:r>
+          </w:p>
+          <w:p>
+            <w:pPr>
+              <w:spacing w:after="40"/>
+              <w:ind w:left="255" w:hanging="255"/>
+            </w:pPr>
+            <w:r>
+              <w:rPr>
+                <w:rFonts w:ascii="Montserrat" w:hAnsi="Montserrat" w:eastAsia="Montserrat"/>
+                <w:b/>
+                <w:i w:val="0"/>
+                <w:color w:val="C5A059"/>
+                <w:sz w:val="18"/>
+              </w:rPr>
+              <w:t xml:space="preserve">■  </w:t>
+            </w:r>
+            <w:r>
+              <w:rPr>
+                <w:rFonts w:ascii="Montserrat" w:hAnsi="Montserrat" w:eastAsia="Montserrat"/>
+                <w:b w:val="0"/>
+                <w:i w:val="0"/>
+                <w:color w:val="2C3E50"/>
+                <w:sz w:val="19"/>
+              </w:rPr>
+              <w:t>Solo columbario: la cremación se contrata aparte.</w:t>
+            </w:r>
+          </w:p>
+        </w:tc>
+      </w:tr>
+    </w:tbl>
+    <w:p>
+      <w:pPr>
+        <w:spacing w:before="0" w:after="80" w:line="276" w:lineRule="auto"/>
+      </w:pPr>
+    </w:p>
+    <w:p>
+      <w:pPr>
+        <w:spacing w:before="120" w:after="40" w:line="276" w:lineRule="auto"/>
+      </w:pPr>
+      <w:r>
+        <w:rPr>
+          <w:rFonts w:ascii="Montserrat" w:hAnsi="Montserrat" w:eastAsia="Montserrat"/>
+          <w:b/>
+          <w:i w:val="0"/>
+          <w:color w:val="C5A059"/>
+          <w:sz w:val="17"/>
+        </w:rPr>
+        <w:t>SPEECH SUGERIDO</w:t>
+      </w:r>
+    </w:p>
+    <w:tbl>
+      <w:tblPr>
+        <w:tblW w:type="auto" w:w="0"/>
+        <w:jc w:val="center"/>
+        <w:tblLayout w:type="fixed"/>
+        <w:tblLook w:firstColumn="1" w:firstRow="1" w:lastColumn="0" w:lastRow="0" w:noHBand="0" w:noVBand="1" w:val="04A0"/>
+      </w:tblPr>
+      <w:tblGrid>
+        <w:gridCol w:w="9746"/>
+      </w:tblGrid>
+      <w:tr>
+        <w:tc>
+          <w:tcPr>
+            <w:tcW w:type="dxa" w:w="9638"/>
+            <w:tcMar>
+              <w:top w:w="124" w:type="dxa"/>
+              <w:left w:w="124" w:type="dxa"/>
+              <w:bottom w:w="124" w:type="dxa"/>
+              <w:right w:w="124" w:type="dxa"/>
+            </w:tcMar>
+            <w:shd w:val="clear" w:color="auto" w:fill="FBF3E1"/>
+            <w:tcBorders>
+              <w:top w:val="nil"/>
+              <w:left w:val="single" w:sz="36" w:color="C5A059"/>
+              <w:bottom w:val="nil"/>
+              <w:right w:val="nil"/>
+            </w:tcBorders>
+            <w:tcMar>
+              <w:top w:w="198" w:type="dxa"/>
+              <w:left w:w="198" w:type="dxa"/>
+              <w:bottom w:w="198" w:type="dxa"/>
+              <w:right w:w="198" w:type="dxa"/>
+            </w:tcMar>
+          </w:tcPr>
+          <w:p>
+            <w:pPr>
+              <w:spacing w:after="40"/>
+            </w:pPr>
+            <w:r>
+              <w:rPr>
+                <w:rFonts w:ascii="Montserrat" w:hAnsi="Montserrat" w:eastAsia="Montserrat"/>
+                <w:b w:val="0"/>
+                <w:i w:val="0"/>
+                <w:color w:val="2C3E50"/>
+                <w:sz w:val="21"/>
+              </w:rPr>
+              <w:t>«Este columbario es una obra de arte de fe: la tapa de ónix con imagen religiosa convierte el lugar de descanso de su familia en un espacio de oración y contemplación, para generaciones.»</w:t>
+            </w:r>
+          </w:p>
+        </w:tc>
+      </w:tr>
+    </w:tbl>
+    <w:p>
+      <w:pPr>
+        <w:spacing w:before="0" w:after="80" w:line="276" w:lineRule="auto"/>
+      </w:pPr>
+    </w:p>
+    <w:p>
+      <w:pPr>
+        <w:spacing w:before="120" w:after="40" w:line="276" w:lineRule="auto"/>
+      </w:pPr>
+      <w:r>
+        <w:rPr>
+          <w:rFonts w:ascii="Montserrat" w:hAnsi="Montserrat" w:eastAsia="Montserrat"/>
+          <w:b/>
+          <w:i w:val="0"/>
+          <w:color w:val="C5A059"/>
+          <w:sz w:val="17"/>
+        </w:rPr>
+        <w:t>PREGUNTAS DE DESCUBRIMIENTO</w:t>
+      </w:r>
+    </w:p>
+    <w:p>
+      <w:pPr>
+        <w:spacing w:before="0" w:after="60" w:line="276" w:lineRule="auto"/>
+        <w:ind w:left="340" w:hanging="340"/>
+      </w:pPr>
+      <w:r>
+        <w:rPr>
+          <w:rFonts w:ascii="Montserrat" w:hAnsi="Montserrat" w:eastAsia="Montserrat"/>
+          <w:b w:val="0"/>
+          <w:i w:val="0"/>
+          <w:color w:val="C5A059"/>
+          <w:sz w:val="14"/>
+        </w:rPr>
+        <w:t xml:space="preserve">?  </w:t>
+      </w:r>
+      <w:r>
+        <w:rPr>
+          <w:rFonts w:ascii="Montserrat" w:hAnsi="Montserrat" w:eastAsia="Montserrat"/>
+          <w:b w:val="0"/>
+          <w:i w:val="0"/>
+          <w:color w:val="2C3E50"/>
+          <w:sz w:val="20"/>
+        </w:rPr>
+        <w:t>¿Qué lugar tiene la fe en la forma en que su familia recuerda?</w:t>
+      </w:r>
+    </w:p>
+    <w:p>
+      <w:pPr>
+        <w:spacing w:before="0" w:after="60" w:line="276" w:lineRule="auto"/>
+        <w:ind w:left="340" w:hanging="340"/>
+      </w:pPr>
+      <w:r>
+        <w:rPr>
+          <w:rFonts w:ascii="Montserrat" w:hAnsi="Montserrat" w:eastAsia="Montserrat"/>
+          <w:b w:val="0"/>
+          <w:i w:val="0"/>
+          <w:color w:val="C5A059"/>
+          <w:sz w:val="14"/>
+        </w:rPr>
+        <w:t xml:space="preserve">?  </w:t>
+      </w:r>
+      <w:r>
+        <w:rPr>
+          <w:rFonts w:ascii="Montserrat" w:hAnsi="Montserrat" w:eastAsia="Montserrat"/>
+          <w:b w:val="0"/>
+          <w:i w:val="0"/>
+          <w:color w:val="2C3E50"/>
+          <w:sz w:val="20"/>
+        </w:rPr>
+        <w:t>¿Cuántos miembros de la familia lo considerarían?</w:t>
+      </w:r>
+    </w:p>
+    <w:p>
+      <w:pPr>
+        <w:spacing w:before="120" w:after="40" w:line="276" w:lineRule="auto"/>
+      </w:pPr>
+      <w:r>
+        <w:rPr>
+          <w:rFonts w:ascii="Montserrat" w:hAnsi="Montserrat" w:eastAsia="Montserrat"/>
+          <w:b/>
+          <w:i w:val="0"/>
+          <w:color w:val="C5A059"/>
+          <w:sz w:val="17"/>
+        </w:rPr>
+        <w:t>FRASE DE CIERRE</w:t>
+      </w:r>
+    </w:p>
+    <w:p>
+      <w:pPr>
+        <w:spacing w:before="0" w:after="120" w:line="276" w:lineRule="auto"/>
+      </w:pPr>
+      <w:r>
+        <w:rPr>
+          <w:rFonts w:ascii="Montserrat" w:hAnsi="Montserrat" w:eastAsia="Montserrat"/>
+          <w:b w:val="0"/>
+          <w:i/>
+          <w:color w:val="1B365D"/>
+          <w:sz w:val="21"/>
+        </w:rPr>
+        <w:t>«¿Reservamos hoy el espacio familiar con el precio de noviembre?»</w:t>
+      </w:r>
+    </w:p>
+    <w:p>
+      <w:pPr>
+        <w:spacing w:before="120" w:after="40" w:line="276" w:lineRule="auto"/>
+      </w:pPr>
+      <w:r>
+        <w:rPr>
+          <w:rFonts w:ascii="Montserrat" w:hAnsi="Montserrat" w:eastAsia="Montserrat"/>
+          <w:b/>
+          <w:i w:val="0"/>
+          <w:color w:val="C5A059"/>
+          <w:sz w:val="17"/>
+        </w:rPr>
+        <w:t>OBJECIÓN TÍPICA</w:t>
+      </w:r>
+    </w:p>
+    <w:p>
+      <w:pPr>
+        <w:spacing w:before="0" w:after="120" w:line="276" w:lineRule="auto"/>
+      </w:pPr>
+      <w:r>
+        <w:rPr>
+          <w:rFonts w:ascii="Montserrat" w:hAnsi="Montserrat" w:eastAsia="Montserrat"/>
+          <w:b w:val="0"/>
+          <w:i w:val="0"/>
+          <w:color w:val="2C3E50"/>
+          <w:sz w:val="20"/>
+        </w:rPr>
+        <w:t>«Es muy caro.» → «Es un legado para cuatro personas, para siempre, y puede pagarse en hasta 120 meses. Es la opción más exclusiva del portafolio.»</w:t>
+      </w:r>
+    </w:p>
+    <w:tbl>
+      <w:tblPr>
+        <w:tblW w:type="auto" w:w="0"/>
+        <w:jc w:val="center"/>
+        <w:tblLayout w:type="fixed"/>
+        <w:tblLook w:firstColumn="1" w:firstRow="1" w:lastColumn="0" w:lastRow="0" w:noHBand="0" w:noVBand="1" w:val="04A0"/>
+      </w:tblPr>
+      <w:tblGrid>
+        <w:gridCol w:w="9746"/>
+      </w:tblGrid>
+      <w:tr>
+        <w:tc>
+          <w:tcPr>
+            <w:tcW w:type="dxa" w:w="9638"/>
+            <w:tcMar>
+              <w:top w:w="124" w:type="dxa"/>
+              <w:left w:w="124" w:type="dxa"/>
+              <w:bottom w:w="124" w:type="dxa"/>
+              <w:right w:w="124" w:type="dxa"/>
+            </w:tcMar>
+            <w:shd w:val="clear" w:color="auto" w:fill="F4F7FA"/>
+            <w:tcBorders>
+              <w:top w:val="nil"/>
+              <w:left w:val="single" w:sz="36" w:color="4F7A5A"/>
+              <w:bottom w:val="nil"/>
+              <w:right w:val="nil"/>
+            </w:tcBorders>
+            <w:tcMar>
+              <w:top w:w="198" w:type="dxa"/>
+              <w:left w:w="198" w:type="dxa"/>
+              <w:bottom w:w="198" w:type="dxa"/>
+              <w:right w:w="198" w:type="dxa"/>
+            </w:tcMar>
+          </w:tcPr>
+          <w:p>
+            <w:pPr>
+              <w:spacing w:after="40"/>
+            </w:pPr>
+            <w:r>
+              <w:rPr>
+                <w:rFonts w:ascii="Montserrat" w:hAnsi="Montserrat" w:eastAsia="Montserrat"/>
+                <w:b/>
+                <w:i w:val="0"/>
+                <w:color w:val="4F7A5A"/>
+                <w:sz w:val="18"/>
+              </w:rPr>
+              <w:t>TIP DEL ASESOR</w:t>
+            </w:r>
+          </w:p>
+          <w:p>
+            <w:pPr>
+              <w:spacing w:after="40"/>
+            </w:pPr>
+            <w:r>
+              <w:rPr>
+                <w:rFonts w:ascii="Montserrat" w:hAnsi="Montserrat" w:eastAsia="Montserrat"/>
+                <w:b w:val="0"/>
+                <w:i w:val="0"/>
+                <w:color w:val="2C3E50"/>
+                <w:sz w:val="21"/>
+              </w:rPr>
+              <w:t>Preséntelo con calma y en persona; no lo ofrezca a quien busca la opción más económica.</w:t>
+            </w:r>
+          </w:p>
+        </w:tc>
+      </w:tr>
+    </w:tbl>
+    <w:p>
+      <w:pPr>
+        <w:spacing w:before="0" w:after="80" w:line="276" w:lineRule="auto"/>
+      </w:pPr>
+    </w:p>
+    <w:p>
+      <w:r>
+        <w:br w:type="page"/>
+      </w:r>
+    </w:p>
+    <w:tbl>
+      <w:tblPr>
+        <w:tblW w:type="auto" w:w="0"/>
+        <w:jc w:val="center"/>
+        <w:tblLayout w:type="fixed"/>
+        <w:tblLook w:firstColumn="1" w:firstRow="1" w:lastColumn="0" w:lastRow="0" w:noHBand="0" w:noVBand="1" w:val="04A0"/>
+      </w:tblPr>
+      <w:tblGrid>
+        <w:gridCol w:w="4873"/>
+        <w:gridCol w:w="4873"/>
+      </w:tblGrid>
+      <w:tr>
+        <w:tc>
+          <w:tcPr>
+            <w:tcW w:type="dxa" w:w="6520"/>
+            <w:tcMar>
+              <w:top w:w="124" w:type="dxa"/>
+              <w:left w:w="124" w:type="dxa"/>
+              <w:bottom w:w="124" w:type="dxa"/>
+              <w:right w:w="124" w:type="dxa"/>
+            </w:tcMar>
+            <w:shd w:val="clear" w:color="auto" w:fill="1B365D"/>
+            <w:tcBorders>
+              <w:top w:val="nil"/>
+              <w:left w:val="nil"/>
+              <w:bottom w:val="single" w:sz="36" w:color="C5A059"/>
+              <w:right w:val="nil"/>
+            </w:tcBorders>
+            <w:tcMar>
+              <w:top w:w="226" w:type="dxa"/>
+              <w:left w:w="226" w:type="dxa"/>
+              <w:bottom w:w="226" w:type="dxa"/>
+              <w:right w:w="226" w:type="dxa"/>
+            </w:tcMar>
+          </w:tcPr>
+          <w:p>
+            <w:pPr>
+              <w:spacing w:after="40"/>
+            </w:pPr>
+            <w:r>
+              <w:rPr>
+                <w:rFonts w:ascii="Montserrat" w:hAnsi="Montserrat" w:eastAsia="Montserrat"/>
+                <w:b/>
+                <w:i w:val="0"/>
+                <w:color w:val="C5A059"/>
+                <w:sz w:val="17"/>
+              </w:rPr>
+              <w:t>MAUSOLEO VERTICAL BELLA VISTA · CREMACIÓN + COLUMBARIO</w:t>
+            </w:r>
+          </w:p>
+          <w:p>
+            <w:r>
+              <w:rPr>
+                <w:rFonts w:ascii="Playfair Display" w:hAnsi="Playfair Display" w:eastAsia="Playfair Display"/>
+                <w:b/>
+                <w:i w:val="0"/>
+                <w:color w:val="FFFFFF"/>
+                <w:sz w:val="36"/>
+              </w:rPr>
+              <w:t>Columbario Cristal · Bella Vista</w:t>
+            </w:r>
+          </w:p>
+        </w:tc>
+        <w:tc>
+          <w:tcPr>
+            <w:tcW w:type="dxa" w:w="3118"/>
+            <w:tcMar>
+              <w:top w:w="124" w:type="dxa"/>
+              <w:left w:w="124" w:type="dxa"/>
+              <w:bottom w:w="124" w:type="dxa"/>
+              <w:right w:w="124" w:type="dxa"/>
+            </w:tcMar>
+            <w:shd w:val="clear" w:color="auto" w:fill="1B365D"/>
+            <w:tcBorders>
+              <w:top w:val="nil"/>
+              <w:left w:val="nil"/>
+              <w:bottom w:val="single" w:sz="36" w:color="C5A059"/>
+              <w:right w:val="nil"/>
+            </w:tcBorders>
+            <w:tcMar>
+              <w:top w:w="226" w:type="dxa"/>
+              <w:left w:w="226" w:type="dxa"/>
+              <w:bottom w:w="226" w:type="dxa"/>
+              <w:right w:w="226" w:type="dxa"/>
+            </w:tcMar>
+          </w:tcPr>
+          <w:p>
+            <w:pPr>
+              <w:spacing w:after="40"/>
+              <w:jc w:val="right"/>
+            </w:pPr>
+            <w:r>
+              <w:rPr>
+                <w:rFonts w:ascii="Montserrat" w:hAnsi="Montserrat" w:eastAsia="Montserrat"/>
+                <w:b/>
+                <w:i w:val="0"/>
+                <w:color w:val="C5A059"/>
+                <w:sz w:val="17"/>
+              </w:rPr>
+              <w:t>PRECIO SEGÚN UBICACIÓN</w:t>
+            </w:r>
+          </w:p>
+          <w:p>
+            <w:pPr>
+              <w:jc w:val="right"/>
+            </w:pPr>
+            <w:r>
+              <w:rPr>
+                <w:rFonts w:ascii="Montserrat" w:hAnsi="Montserrat" w:eastAsia="Montserrat"/>
+                <w:b/>
+                <w:i w:val="0"/>
+                <w:color w:val="FFFFFF"/>
+                <w:sz w:val="36"/>
+              </w:rPr>
+              <w:t>US$ 1.300 – 2.900</w:t>
+            </w:r>
+          </w:p>
+        </w:tc>
+      </w:tr>
+    </w:tbl>
+    <w:p>
+      <w:pPr>
+        <w:spacing w:before="80" w:after="160" w:line="276" w:lineRule="auto"/>
+      </w:pPr>
+      <w:r>
+        <w:rPr>
+          <w:rFonts w:ascii="Montserrat" w:hAnsi="Montserrat" w:eastAsia="Montserrat"/>
+          <w:b w:val="0"/>
+          <w:i/>
+          <w:color w:val="7A8794"/>
+          <w:sz w:val="19"/>
+        </w:rPr>
+        <w:t>Finados y noviembre (−15%): desde US$ 1.105 · Pago único o hasta 120 meses, con intereses</w:t>
+      </w:r>
+    </w:p>
+    <w:p>
+      <w:pPr>
+        <w:spacing w:before="0" w:after="120" w:line="276" w:lineRule="auto"/>
+      </w:pPr>
+      <w:r>
+        <w:rPr>
+          <w:rFonts w:ascii="Montserrat" w:hAnsi="Montserrat" w:eastAsia="Montserrat"/>
+          <w:b/>
+          <w:i w:val="0"/>
+          <w:color w:val="1B365D"/>
+          <w:sz w:val="21"/>
+        </w:rPr>
+        <w:t xml:space="preserve">Qué es. </w:t>
+      </w:r>
+      <w:r>
+        <w:rPr>
+          <w:rFonts w:ascii="Montserrat" w:hAnsi="Montserrat" w:eastAsia="Montserrat"/>
+          <w:b w:val="0"/>
+          <w:i w:val="0"/>
+          <w:color w:val="2C3E50"/>
+          <w:sz w:val="21"/>
+        </w:rPr>
+        <w:t>Columbario de cristal en el mausoleo vertical Bella Vista, dentro del cementerio, con el proceso completo de cremación incluido.</w:t>
+      </w:r>
+    </w:p>
+    <w:p>
+      <w:pPr>
+        <w:spacing w:before="0" w:after="160" w:line="276" w:lineRule="auto"/>
+      </w:pPr>
+      <w:r>
+        <w:rPr>
+          <w:rFonts w:ascii="Montserrat" w:hAnsi="Montserrat" w:eastAsia="Montserrat"/>
+          <w:b/>
+          <w:i w:val="0"/>
+          <w:color w:val="1B365D"/>
+          <w:sz w:val="21"/>
+        </w:rPr>
+        <w:t xml:space="preserve">Para quién. </w:t>
+      </w:r>
+      <w:r>
+        <w:rPr>
+          <w:rFonts w:ascii="Montserrat" w:hAnsi="Montserrat" w:eastAsia="Montserrat"/>
+          <w:b w:val="0"/>
+          <w:i w:val="0"/>
+          <w:color w:val="2C3E50"/>
+          <w:sz w:val="21"/>
+        </w:rPr>
+        <w:t>Familias que buscan la opción más accesible de cremación con columbario permanente, para 2 o 4 personas.</w:t>
+      </w:r>
+    </w:p>
+    <w:tbl>
+      <w:tblPr>
+        <w:tblW w:type="auto" w:w="0"/>
+        <w:jc w:val="center"/>
+        <w:tblLayout w:type="fixed"/>
+        <w:tblLook w:firstColumn="1" w:firstRow="1" w:lastColumn="0" w:lastRow="0" w:noHBand="0" w:noVBand="1" w:val="04A0"/>
+      </w:tblPr>
+      <w:tblGrid>
+        <w:gridCol w:w="4873"/>
+        <w:gridCol w:w="4873"/>
+      </w:tblGrid>
+      <w:tr>
+        <w:tc>
+          <w:tcPr>
+            <w:tcW w:type="dxa" w:w="4819"/>
+            <w:tcMar>
+              <w:top w:w="124" w:type="dxa"/>
+              <w:left w:w="124" w:type="dxa"/>
+              <w:bottom w:w="124" w:type="dxa"/>
+              <w:right w:w="124" w:type="dxa"/>
+            </w:tcMar>
+            <w:shd w:val="clear" w:color="auto" w:fill="F4F7FA"/>
+            <w:tcBorders>
+              <w:top w:val="single" w:sz="24" w:color="C5A059"/>
+              <w:left w:val="single" w:sz="24" w:color="FFFFFF"/>
+              <w:bottom w:val="nil"/>
+              <w:right w:val="single" w:sz="24" w:color="FFFFFF"/>
+            </w:tcBorders>
+            <w:tcMar>
+              <w:top w:w="170" w:type="dxa"/>
+              <w:left w:w="170" w:type="dxa"/>
+              <w:bottom w:w="170" w:type="dxa"/>
+              <w:right w:w="170" w:type="dxa"/>
+            </w:tcMar>
+          </w:tcPr>
+          <w:p>
+            <w:pPr>
+              <w:spacing w:after="40"/>
+            </w:pPr>
+            <w:r>
+              <w:rPr>
+                <w:rFonts w:ascii="Montserrat" w:hAnsi="Montserrat" w:eastAsia="Montserrat"/>
+                <w:b/>
+                <w:i w:val="0"/>
+                <w:color w:val="1B365D"/>
+                <w:sz w:val="17"/>
+              </w:rPr>
+              <w:t>QUÉ INCLUYE</w:t>
+            </w:r>
+          </w:p>
+          <w:p>
+            <w:pPr>
+              <w:spacing w:after="40"/>
+              <w:ind w:left="255" w:hanging="255"/>
+            </w:pPr>
+            <w:r>
+              <w:rPr>
+                <w:rFonts w:ascii="Montserrat" w:hAnsi="Montserrat" w:eastAsia="Montserrat"/>
+                <w:b/>
+                <w:i w:val="0"/>
+                <w:color w:val="4F7A5A"/>
+                <w:sz w:val="18"/>
+              </w:rPr>
+              <w:t xml:space="preserve">✓  </w:t>
+            </w:r>
+            <w:r>
+              <w:rPr>
+                <w:rFonts w:ascii="Montserrat" w:hAnsi="Montserrat" w:eastAsia="Montserrat"/>
+                <w:b w:val="0"/>
+                <w:i w:val="0"/>
+                <w:color w:val="2C3E50"/>
+                <w:sz w:val="19"/>
+              </w:rPr>
+              <w:t>Columbario de cristal permanente (30 × 30 × 30 cm)</w:t>
+            </w:r>
+          </w:p>
+          <w:p>
+            <w:pPr>
+              <w:spacing w:after="40"/>
+              <w:ind w:left="255" w:hanging="255"/>
+            </w:pPr>
+            <w:r>
+              <w:rPr>
+                <w:rFonts w:ascii="Montserrat" w:hAnsi="Montserrat" w:eastAsia="Montserrat"/>
+                <w:b/>
+                <w:i w:val="0"/>
+                <w:color w:val="4F7A5A"/>
+                <w:sz w:val="18"/>
+              </w:rPr>
+              <w:t xml:space="preserve">✓  </w:t>
+            </w:r>
+            <w:r>
+              <w:rPr>
+                <w:rFonts w:ascii="Montserrat" w:hAnsi="Montserrat" w:eastAsia="Montserrat"/>
+                <w:b w:val="0"/>
+                <w:i w:val="0"/>
+                <w:color w:val="2C3E50"/>
+                <w:sz w:val="19"/>
+              </w:rPr>
+              <w:t>Estándar: 2 cremaciones y 2 urnas · Familiar: 4 cremaciones y 4 urnas</w:t>
+            </w:r>
+          </w:p>
+          <w:p>
+            <w:pPr>
+              <w:spacing w:after="40"/>
+              <w:ind w:left="255" w:hanging="255"/>
+            </w:pPr>
+            <w:r>
+              <w:rPr>
+                <w:rFonts w:ascii="Montserrat" w:hAnsi="Montserrat" w:eastAsia="Montserrat"/>
+                <w:b/>
+                <w:i w:val="0"/>
+                <w:color w:val="4F7A5A"/>
+                <w:sz w:val="18"/>
+              </w:rPr>
+              <w:t xml:space="preserve">✓  </w:t>
+            </w:r>
+            <w:r>
+              <w:rPr>
+                <w:rFonts w:ascii="Montserrat" w:hAnsi="Montserrat" w:eastAsia="Montserrat"/>
+                <w:b w:val="0"/>
+                <w:i w:val="0"/>
+                <w:color w:val="2C3E50"/>
+                <w:sz w:val="19"/>
+              </w:rPr>
+              <w:t>Traslados, preparación y resguardo hasta 5 días</w:t>
+            </w:r>
+          </w:p>
+          <w:p>
+            <w:pPr>
+              <w:spacing w:after="40"/>
+              <w:ind w:left="255" w:hanging="255"/>
+            </w:pPr>
+            <w:r>
+              <w:rPr>
+                <w:rFonts w:ascii="Montserrat" w:hAnsi="Montserrat" w:eastAsia="Montserrat"/>
+                <w:b/>
+                <w:i w:val="0"/>
+                <w:color w:val="4F7A5A"/>
+                <w:sz w:val="18"/>
+              </w:rPr>
+              <w:t xml:space="preserve">✓  </w:t>
+            </w:r>
+            <w:r>
+              <w:rPr>
+                <w:rFonts w:ascii="Montserrat" w:hAnsi="Montserrat" w:eastAsia="Montserrat"/>
+                <w:b w:val="0"/>
+                <w:i w:val="0"/>
+                <w:color w:val="2C3E50"/>
+                <w:sz w:val="19"/>
+              </w:rPr>
+              <w:t>Certificado de cremación y ceremonia privada de colocación</w:t>
+            </w:r>
+          </w:p>
+        </w:tc>
+        <w:tc>
+          <w:tcPr>
+            <w:tcW w:type="dxa" w:w="4819"/>
+            <w:tcMar>
+              <w:top w:w="124" w:type="dxa"/>
+              <w:left w:w="124" w:type="dxa"/>
+              <w:bottom w:w="124" w:type="dxa"/>
+              <w:right w:w="124" w:type="dxa"/>
+            </w:tcMar>
+            <w:shd w:val="clear" w:color="auto" w:fill="F4F7FA"/>
+            <w:tcBorders>
+              <w:top w:val="single" w:sz="24" w:color="C5A059"/>
+              <w:left w:val="single" w:sz="24" w:color="FFFFFF"/>
+              <w:bottom w:val="nil"/>
+              <w:right w:val="single" w:sz="24" w:color="FFFFFF"/>
+            </w:tcBorders>
+            <w:tcMar>
+              <w:top w:w="170" w:type="dxa"/>
+              <w:left w:w="170" w:type="dxa"/>
+              <w:bottom w:w="170" w:type="dxa"/>
+              <w:right w:w="170" w:type="dxa"/>
+            </w:tcMar>
+          </w:tcPr>
+          <w:p>
+            <w:pPr>
+              <w:spacing w:after="40"/>
+            </w:pPr>
+            <w:r>
+              <w:rPr>
+                <w:rFonts w:ascii="Montserrat" w:hAnsi="Montserrat" w:eastAsia="Montserrat"/>
+                <w:b/>
+                <w:i w:val="0"/>
+                <w:color w:val="1B365D"/>
+                <w:sz w:val="17"/>
+              </w:rPr>
+              <w:t>REGLAS DEL PRODUCTO</w:t>
+            </w:r>
+          </w:p>
+          <w:p>
+            <w:pPr>
+              <w:spacing w:after="40"/>
+              <w:ind w:left="255" w:hanging="255"/>
+            </w:pPr>
+            <w:r>
+              <w:rPr>
+                <w:rFonts w:ascii="Montserrat" w:hAnsi="Montserrat" w:eastAsia="Montserrat"/>
+                <w:b/>
+                <w:i w:val="0"/>
+                <w:color w:val="C5A059"/>
+                <w:sz w:val="18"/>
+              </w:rPr>
+              <w:t xml:space="preserve">■  </w:t>
+            </w:r>
+            <w:r>
+              <w:rPr>
+                <w:rFonts w:ascii="Montserrat" w:hAnsi="Montserrat" w:eastAsia="Montserrat"/>
+                <w:b w:val="0"/>
+                <w:i w:val="0"/>
+                <w:color w:val="2C3E50"/>
+                <w:sz w:val="19"/>
+              </w:rPr>
+              <w:t>Estándar: ubicación definida US$ 1.800 · a futuro US$ 1.300.</w:t>
+            </w:r>
+          </w:p>
+          <w:p>
+            <w:pPr>
+              <w:spacing w:after="40"/>
+              <w:ind w:left="255" w:hanging="255"/>
+            </w:pPr>
+            <w:r>
+              <w:rPr>
+                <w:rFonts w:ascii="Montserrat" w:hAnsi="Montserrat" w:eastAsia="Montserrat"/>
+                <w:b/>
+                <w:i w:val="0"/>
+                <w:color w:val="C5A059"/>
+                <w:sz w:val="18"/>
+              </w:rPr>
+              <w:t xml:space="preserve">■  </w:t>
+            </w:r>
+            <w:r>
+              <w:rPr>
+                <w:rFonts w:ascii="Montserrat" w:hAnsi="Montserrat" w:eastAsia="Montserrat"/>
+                <w:b w:val="0"/>
+                <w:i w:val="0"/>
+                <w:color w:val="2C3E50"/>
+                <w:sz w:val="19"/>
+              </w:rPr>
+              <w:t>Familiar: ubicación definida US$ 2.900 · a futuro US$ 2.300.</w:t>
+            </w:r>
+          </w:p>
+          <w:p>
+            <w:pPr>
+              <w:spacing w:after="40"/>
+              <w:ind w:left="255" w:hanging="255"/>
+            </w:pPr>
+            <w:r>
+              <w:rPr>
+                <w:rFonts w:ascii="Montserrat" w:hAnsi="Montserrat" w:eastAsia="Montserrat"/>
+                <w:b/>
+                <w:i w:val="0"/>
+                <w:color w:val="C5A059"/>
+                <w:sz w:val="18"/>
+              </w:rPr>
+              <w:t xml:space="preserve">■  </w:t>
+            </w:r>
+            <w:r>
+              <w:rPr>
+                <w:rFonts w:ascii="Montserrat" w:hAnsi="Montserrat" w:eastAsia="Montserrat"/>
+                <w:b w:val="0"/>
+                <w:i w:val="0"/>
+                <w:color w:val="2C3E50"/>
+                <w:sz w:val="19"/>
+              </w:rPr>
+              <w:t>La cremación está incluida: no hace falta contratarla aparte.</w:t>
+            </w:r>
+          </w:p>
+        </w:tc>
+      </w:tr>
+    </w:tbl>
+    <w:p>
+      <w:pPr>
+        <w:spacing w:before="0" w:after="80" w:line="276" w:lineRule="auto"/>
+      </w:pPr>
+    </w:p>
+    <w:p>
+      <w:pPr>
+        <w:spacing w:before="120" w:after="40" w:line="276" w:lineRule="auto"/>
+      </w:pPr>
+      <w:r>
+        <w:rPr>
+          <w:rFonts w:ascii="Montserrat" w:hAnsi="Montserrat" w:eastAsia="Montserrat"/>
+          <w:b/>
+          <w:i w:val="0"/>
+          <w:color w:val="C5A059"/>
+          <w:sz w:val="17"/>
+        </w:rPr>
+        <w:t>SPEECH SUGERIDO</w:t>
+      </w:r>
+    </w:p>
+    <w:tbl>
+      <w:tblPr>
+        <w:tblW w:type="auto" w:w="0"/>
+        <w:jc w:val="center"/>
+        <w:tblLayout w:type="fixed"/>
+        <w:tblLook w:firstColumn="1" w:firstRow="1" w:lastColumn="0" w:lastRow="0" w:noHBand="0" w:noVBand="1" w:val="04A0"/>
+      </w:tblPr>
+      <w:tblGrid>
+        <w:gridCol w:w="9746"/>
+      </w:tblGrid>
+      <w:tr>
+        <w:tc>
+          <w:tcPr>
+            <w:tcW w:type="dxa" w:w="9638"/>
+            <w:tcMar>
+              <w:top w:w="124" w:type="dxa"/>
+              <w:left w:w="124" w:type="dxa"/>
+              <w:bottom w:w="124" w:type="dxa"/>
+              <w:right w:w="124" w:type="dxa"/>
+            </w:tcMar>
+            <w:shd w:val="clear" w:color="auto" w:fill="FBF3E1"/>
+            <w:tcBorders>
+              <w:top w:val="nil"/>
+              <w:left w:val="single" w:sz="36" w:color="C5A059"/>
+              <w:bottom w:val="nil"/>
+              <w:right w:val="nil"/>
+            </w:tcBorders>
+            <w:tcMar>
+              <w:top w:w="198" w:type="dxa"/>
+              <w:left w:w="198" w:type="dxa"/>
+              <w:bottom w:w="198" w:type="dxa"/>
+              <w:right w:w="198" w:type="dxa"/>
+            </w:tcMar>
+          </w:tcPr>
+          <w:p>
+            <w:pPr>
+              <w:spacing w:after="40"/>
+            </w:pPr>
+            <w:r>
+              <w:rPr>
+                <w:rFonts w:ascii="Montserrat" w:hAnsi="Montserrat" w:eastAsia="Montserrat"/>
+                <w:b w:val="0"/>
+                <w:i w:val="0"/>
+                <w:color w:val="2C3E50"/>
+                <w:sz w:val="21"/>
+              </w:rPr>
+              <w:t>«Bella Vista resuelve en un solo paso la cremación y el lugar de descanso: un columbario de cristal en nuestro mausoleo vertical, para dos o cuatro personas, con todo el proceso incluido.»</w:t>
+            </w:r>
+          </w:p>
+        </w:tc>
+      </w:tr>
+    </w:tbl>
+    <w:p>
+      <w:pPr>
+        <w:spacing w:before="0" w:after="80" w:line="276" w:lineRule="auto"/>
+      </w:pPr>
+    </w:p>
+    <w:p>
+      <w:pPr>
+        <w:spacing w:before="120" w:after="40" w:line="276" w:lineRule="auto"/>
+      </w:pPr>
+      <w:r>
+        <w:rPr>
+          <w:rFonts w:ascii="Montserrat" w:hAnsi="Montserrat" w:eastAsia="Montserrat"/>
+          <w:b/>
+          <w:i w:val="0"/>
+          <w:color w:val="C5A059"/>
+          <w:sz w:val="17"/>
+        </w:rPr>
+        <w:t>PREGUNTAS DE DESCUBRIMIENTO</w:t>
+      </w:r>
+    </w:p>
+    <w:p>
+      <w:pPr>
+        <w:spacing w:before="0" w:after="60" w:line="276" w:lineRule="auto"/>
+        <w:ind w:left="340" w:hanging="340"/>
+      </w:pPr>
+      <w:r>
+        <w:rPr>
+          <w:rFonts w:ascii="Montserrat" w:hAnsi="Montserrat" w:eastAsia="Montserrat"/>
+          <w:b w:val="0"/>
+          <w:i w:val="0"/>
+          <w:color w:val="C5A059"/>
+          <w:sz w:val="14"/>
+        </w:rPr>
+        <w:t xml:space="preserve">?  </w:t>
+      </w:r>
+      <w:r>
+        <w:rPr>
+          <w:rFonts w:ascii="Montserrat" w:hAnsi="Montserrat" w:eastAsia="Montserrat"/>
+          <w:b w:val="0"/>
+          <w:i w:val="0"/>
+          <w:color w:val="2C3E50"/>
+          <w:sz w:val="20"/>
+        </w:rPr>
+        <w:t>¿Lo considera para dos personas o para la familia?</w:t>
+      </w:r>
+    </w:p>
+    <w:p>
+      <w:pPr>
+        <w:spacing w:before="0" w:after="60" w:line="276" w:lineRule="auto"/>
+        <w:ind w:left="340" w:hanging="340"/>
+      </w:pPr>
+      <w:r>
+        <w:rPr>
+          <w:rFonts w:ascii="Montserrat" w:hAnsi="Montserrat" w:eastAsia="Montserrat"/>
+          <w:b w:val="0"/>
+          <w:i w:val="0"/>
+          <w:color w:val="C5A059"/>
+          <w:sz w:val="14"/>
+        </w:rPr>
+        <w:t xml:space="preserve">?  </w:t>
+      </w:r>
+      <w:r>
+        <w:rPr>
+          <w:rFonts w:ascii="Montserrat" w:hAnsi="Montserrat" w:eastAsia="Montserrat"/>
+          <w:b w:val="0"/>
+          <w:i w:val="0"/>
+          <w:color w:val="2C3E50"/>
+          <w:sz w:val="20"/>
+        </w:rPr>
+        <w:t>¿Prefieren elegir ya la ubicación o dejarla a futuro?</w:t>
+      </w:r>
+    </w:p>
+    <w:p>
+      <w:pPr>
+        <w:spacing w:before="120" w:after="40" w:line="276" w:lineRule="auto"/>
+      </w:pPr>
+      <w:r>
+        <w:rPr>
+          <w:rFonts w:ascii="Montserrat" w:hAnsi="Montserrat" w:eastAsia="Montserrat"/>
+          <w:b/>
+          <w:i w:val="0"/>
+          <w:color w:val="C5A059"/>
+          <w:sz w:val="17"/>
+        </w:rPr>
+        <w:t>FRASE DE CIERRE</w:t>
+      </w:r>
+    </w:p>
+    <w:p>
+      <w:pPr>
+        <w:spacing w:before="0" w:after="120" w:line="276" w:lineRule="auto"/>
+      </w:pPr>
+      <w:r>
+        <w:rPr>
+          <w:rFonts w:ascii="Montserrat" w:hAnsi="Montserrat" w:eastAsia="Montserrat"/>
+          <w:b w:val="0"/>
+          <w:i/>
+          <w:color w:val="1B365D"/>
+          <w:sz w:val="21"/>
+        </w:rPr>
+        <w:t>«¿Aprovechamos el precio de noviembre y lo dejamos resuelto hoy?»</w:t>
+      </w:r>
+    </w:p>
+    <w:p>
+      <w:pPr>
+        <w:spacing w:before="120" w:after="40" w:line="276" w:lineRule="auto"/>
+      </w:pPr>
+      <w:r>
+        <w:rPr>
+          <w:rFonts w:ascii="Montserrat" w:hAnsi="Montserrat" w:eastAsia="Montserrat"/>
+          <w:b/>
+          <w:i w:val="0"/>
+          <w:color w:val="C5A059"/>
+          <w:sz w:val="17"/>
+        </w:rPr>
+        <w:t>OBJECIÓN TÍPICA</w:t>
+      </w:r>
+    </w:p>
+    <w:p>
+      <w:pPr>
+        <w:spacing w:before="0" w:after="120" w:line="276" w:lineRule="auto"/>
+      </w:pPr>
+      <w:r>
+        <w:rPr>
+          <w:rFonts w:ascii="Montserrat" w:hAnsi="Montserrat" w:eastAsia="Montserrat"/>
+          <w:b w:val="0"/>
+          <w:i w:val="0"/>
+          <w:color w:val="2C3E50"/>
+          <w:sz w:val="20"/>
+        </w:rPr>
+        <w:t>«Prefiero un jardín.» → «Perfecto, también tenemos los Jardines de Cenizas. Bella Vista es para quien prefiere un columbario, con la cremación ya incluida.»</w:t>
+      </w:r>
+    </w:p>
+    <w:tbl>
+      <w:tblPr>
+        <w:tblW w:type="auto" w:w="0"/>
+        <w:jc w:val="center"/>
+        <w:tblLayout w:type="fixed"/>
+        <w:tblLook w:firstColumn="1" w:firstRow="1" w:lastColumn="0" w:lastRow="0" w:noHBand="0" w:noVBand="1" w:val="04A0"/>
+      </w:tblPr>
+      <w:tblGrid>
+        <w:gridCol w:w="9746"/>
+      </w:tblGrid>
+      <w:tr>
+        <w:tc>
+          <w:tcPr>
+            <w:tcW w:type="dxa" w:w="9638"/>
+            <w:tcMar>
+              <w:top w:w="124" w:type="dxa"/>
+              <w:left w:w="124" w:type="dxa"/>
+              <w:bottom w:w="124" w:type="dxa"/>
+              <w:right w:w="124" w:type="dxa"/>
+            </w:tcMar>
+            <w:shd w:val="clear" w:color="auto" w:fill="F4F7FA"/>
+            <w:tcBorders>
+              <w:top w:val="nil"/>
+              <w:left w:val="single" w:sz="36" w:color="4F7A5A"/>
+              <w:bottom w:val="nil"/>
+              <w:right w:val="nil"/>
+            </w:tcBorders>
+            <w:tcMar>
+              <w:top w:w="198" w:type="dxa"/>
+              <w:left w:w="198" w:type="dxa"/>
+              <w:bottom w:w="198" w:type="dxa"/>
+              <w:right w:w="198" w:type="dxa"/>
+            </w:tcMar>
+          </w:tcPr>
+          <w:p>
+            <w:pPr>
+              <w:spacing w:after="40"/>
+            </w:pPr>
+            <w:r>
+              <w:rPr>
+                <w:rFonts w:ascii="Montserrat" w:hAnsi="Montserrat" w:eastAsia="Montserrat"/>
+                <w:b/>
+                <w:i w:val="0"/>
+                <w:color w:val="4F7A5A"/>
+                <w:sz w:val="18"/>
+              </w:rPr>
+              <w:t>TIP DEL ASESOR</w:t>
+            </w:r>
+          </w:p>
+          <w:p>
+            <w:pPr>
+              <w:spacing w:after="40"/>
+            </w:pPr>
+            <w:r>
+              <w:rPr>
+                <w:rFonts w:ascii="Montserrat" w:hAnsi="Montserrat" w:eastAsia="Montserrat"/>
+                <w:b w:val="0"/>
+                <w:i w:val="0"/>
+                <w:color w:val="2C3E50"/>
+                <w:sz w:val="21"/>
+              </w:rPr>
+              <w:t>Es la puerta de entrada a los columbarios: cremación y destino final desde US$ 1.105 en noviembre.</w:t>
+            </w:r>
+          </w:p>
+        </w:tc>
+      </w:tr>
+    </w:tbl>
+    <w:p>
+      <w:pPr>
+        <w:spacing w:before="0" w:after="80" w:line="276" w:lineRule="auto"/>
+      </w:pPr>
+    </w:p>
+    <w:p>
+      <w:r>
+        <w:br w:type="page"/>
+      </w:r>
+    </w:p>
+    <w:p>
+      <w:pPr>
         <w:pStyle w:val="Heading1"/>
         <w:spacing w:before="0" w:after="80"/>
       </w:pPr>
@@ -11275,6 +14974,1029 @@
           <w:color w:val="1B365D"/>
           <w:sz w:val="28"/>
         </w:rPr>
+        <w:t>Portafolio existente: columbarios</w:t>
+      </w:r>
+    </w:p>
+    <w:tbl>
+      <w:tblPr>
+        <w:tblW w:type="auto" w:w="0"/>
+        <w:jc w:val="center"/>
+        <w:tblLayout w:type="fixed"/>
+        <w:tblLook w:firstColumn="1" w:firstRow="1" w:lastColumn="0" w:lastRow="0" w:noHBand="0" w:noVBand="1" w:val="04A0"/>
+      </w:tblPr>
+      <w:tblGrid>
+        <w:gridCol w:w="1949"/>
+        <w:gridCol w:w="1949"/>
+        <w:gridCol w:w="1949"/>
+        <w:gridCol w:w="1949"/>
+        <w:gridCol w:w="1949"/>
+      </w:tblGrid>
+      <w:tr>
+        <w:tc>
+          <w:tcPr>
+            <w:tcW w:type="dxa" w:w="1587"/>
+            <w:tcMar>
+              <w:top w:w="124" w:type="dxa"/>
+              <w:left w:w="124" w:type="dxa"/>
+              <w:bottom w:w="124" w:type="dxa"/>
+              <w:right w:w="124" w:type="dxa"/>
+            </w:tcMar>
+            <w:shd w:val="clear" w:color="auto" w:fill="1B365D"/>
+          </w:tcPr>
+          <w:p>
+            <w:pPr>
+              <w:spacing w:after="40"/>
+            </w:pPr>
+            <w:r>
+              <w:rPr>
+                <w:rFonts w:ascii="Montserrat" w:hAnsi="Montserrat" w:eastAsia="Montserrat"/>
+                <w:b/>
+                <w:i w:val="0"/>
+                <w:color w:val="FFFFFF"/>
+                <w:sz w:val="18"/>
+              </w:rPr>
+              <w:t>Producto</w:t>
+            </w:r>
+          </w:p>
+        </w:tc>
+        <w:tc>
+          <w:tcPr>
+            <w:tcW w:type="dxa" w:w="2494"/>
+            <w:tcMar>
+              <w:top w:w="124" w:type="dxa"/>
+              <w:left w:w="124" w:type="dxa"/>
+              <w:bottom w:w="124" w:type="dxa"/>
+              <w:right w:w="124" w:type="dxa"/>
+            </w:tcMar>
+            <w:shd w:val="clear" w:color="auto" w:fill="1B365D"/>
+          </w:tcPr>
+          <w:p>
+            <w:pPr>
+              <w:spacing w:after="40"/>
+            </w:pPr>
+            <w:r>
+              <w:rPr>
+                <w:rFonts w:ascii="Montserrat" w:hAnsi="Montserrat" w:eastAsia="Montserrat"/>
+                <w:b/>
+                <w:i w:val="0"/>
+                <w:color w:val="FFFFFF"/>
+                <w:sz w:val="18"/>
+              </w:rPr>
+              <w:t>Precio</w:t>
+            </w:r>
+          </w:p>
+        </w:tc>
+        <w:tc>
+          <w:tcPr>
+            <w:tcW w:type="dxa" w:w="2268"/>
+            <w:tcMar>
+              <w:top w:w="124" w:type="dxa"/>
+              <w:left w:w="124" w:type="dxa"/>
+              <w:bottom w:w="124" w:type="dxa"/>
+              <w:right w:w="124" w:type="dxa"/>
+            </w:tcMar>
+            <w:shd w:val="clear" w:color="auto" w:fill="1B365D"/>
+          </w:tcPr>
+          <w:p>
+            <w:pPr>
+              <w:spacing w:after="40"/>
+            </w:pPr>
+            <w:r>
+              <w:rPr>
+                <w:rFonts w:ascii="Montserrat" w:hAnsi="Montserrat" w:eastAsia="Montserrat"/>
+                <w:b/>
+                <w:i w:val="0"/>
+                <w:color w:val="FFFFFF"/>
+                <w:sz w:val="18"/>
+              </w:rPr>
+              <w:t>Finados y noviembre (−15%)</w:t>
+            </w:r>
+          </w:p>
+        </w:tc>
+        <w:tc>
+          <w:tcPr>
+            <w:tcW w:type="dxa" w:w="1134"/>
+            <w:tcMar>
+              <w:top w:w="124" w:type="dxa"/>
+              <w:left w:w="124" w:type="dxa"/>
+              <w:bottom w:w="124" w:type="dxa"/>
+              <w:right w:w="124" w:type="dxa"/>
+            </w:tcMar>
+            <w:shd w:val="clear" w:color="auto" w:fill="1B365D"/>
+          </w:tcPr>
+          <w:p>
+            <w:pPr>
+              <w:spacing w:after="40"/>
+            </w:pPr>
+            <w:r>
+              <w:rPr>
+                <w:rFonts w:ascii="Montserrat" w:hAnsi="Montserrat" w:eastAsia="Montserrat"/>
+                <w:b/>
+                <w:i w:val="0"/>
+                <w:color w:val="FFFFFF"/>
+                <w:sz w:val="18"/>
+              </w:rPr>
+              <w:t>Capacidad</w:t>
+            </w:r>
+          </w:p>
+        </w:tc>
+        <w:tc>
+          <w:tcPr>
+            <w:tcW w:type="dxa" w:w="2154"/>
+            <w:tcMar>
+              <w:top w:w="124" w:type="dxa"/>
+              <w:left w:w="124" w:type="dxa"/>
+              <w:bottom w:w="124" w:type="dxa"/>
+              <w:right w:w="124" w:type="dxa"/>
+            </w:tcMar>
+            <w:shd w:val="clear" w:color="auto" w:fill="1B365D"/>
+          </w:tcPr>
+          <w:p>
+            <w:pPr>
+              <w:spacing w:after="40"/>
+            </w:pPr>
+            <w:r>
+              <w:rPr>
+                <w:rFonts w:ascii="Montserrat" w:hAnsi="Montserrat" w:eastAsia="Montserrat"/>
+                <w:b/>
+                <w:i w:val="0"/>
+                <w:color w:val="FFFFFF"/>
+                <w:sz w:val="18"/>
+              </w:rPr>
+              <w:t>Incluye</w:t>
+            </w:r>
+          </w:p>
+        </w:tc>
+      </w:tr>
+      <w:tr>
+        <w:tc>
+          <w:tcPr>
+            <w:tcW w:type="dxa" w:w="1587"/>
+            <w:tcMar>
+              <w:top w:w="124" w:type="dxa"/>
+              <w:left w:w="124" w:type="dxa"/>
+              <w:bottom w:w="124" w:type="dxa"/>
+              <w:right w:w="124" w:type="dxa"/>
+            </w:tcMar>
+            <w:shd w:val="clear" w:color="auto" w:fill="FFFFFF"/>
+            <w:tcBorders>
+              <w:top w:val="nil"/>
+              <w:left w:val="nil"/>
+              <w:bottom w:val="single" w:sz="4" w:color="D9DEE4"/>
+              <w:right w:val="nil"/>
+            </w:tcBorders>
+          </w:tcPr>
+          <w:p>
+            <w:pPr>
+              <w:spacing w:after="40"/>
+            </w:pPr>
+            <w:r>
+              <w:rPr>
+                <w:rFonts w:ascii="Montserrat" w:hAnsi="Montserrat" w:eastAsia="Montserrat"/>
+                <w:b/>
+                <w:i w:val="0"/>
+                <w:color w:val="1B365D"/>
+                <w:sz w:val="19"/>
+              </w:rPr>
+              <w:t>Supremo Plus</w:t>
+            </w:r>
+          </w:p>
+        </w:tc>
+        <w:tc>
+          <w:tcPr>
+            <w:tcW w:type="dxa" w:w="2494"/>
+            <w:tcMar>
+              <w:top w:w="124" w:type="dxa"/>
+              <w:left w:w="124" w:type="dxa"/>
+              <w:bottom w:w="124" w:type="dxa"/>
+              <w:right w:w="124" w:type="dxa"/>
+            </w:tcMar>
+            <w:shd w:val="clear" w:color="auto" w:fill="FFFFFF"/>
+            <w:tcBorders>
+              <w:top w:val="nil"/>
+              <w:left w:val="nil"/>
+              <w:bottom w:val="single" w:sz="4" w:color="D9DEE4"/>
+              <w:right w:val="nil"/>
+            </w:tcBorders>
+          </w:tcPr>
+          <w:p>
+            <w:pPr>
+              <w:spacing w:after="40"/>
+            </w:pPr>
+            <w:r>
+              <w:rPr>
+                <w:rFonts w:ascii="Montserrat" w:hAnsi="Montserrat" w:eastAsia="Montserrat"/>
+                <w:b w:val="0"/>
+                <w:i w:val="0"/>
+                <w:color w:val="2C3E50"/>
+                <w:sz w:val="19"/>
+              </w:rPr>
+              <w:t>Definida US$ 3.400–3.900 · Futuro US$ 2.700–3.200</w:t>
+            </w:r>
+          </w:p>
+        </w:tc>
+        <w:tc>
+          <w:tcPr>
+            <w:tcW w:type="dxa" w:w="2268"/>
+            <w:tcMar>
+              <w:top w:w="124" w:type="dxa"/>
+              <w:left w:w="124" w:type="dxa"/>
+              <w:bottom w:w="124" w:type="dxa"/>
+              <w:right w:w="124" w:type="dxa"/>
+            </w:tcMar>
+            <w:shd w:val="clear" w:color="auto" w:fill="FFFFFF"/>
+            <w:tcBorders>
+              <w:top w:val="nil"/>
+              <w:left w:val="nil"/>
+              <w:bottom w:val="single" w:sz="4" w:color="D9DEE4"/>
+              <w:right w:val="nil"/>
+            </w:tcBorders>
+          </w:tcPr>
+          <w:p>
+            <w:pPr>
+              <w:spacing w:after="40"/>
+            </w:pPr>
+            <w:r>
+              <w:rPr>
+                <w:rFonts w:ascii="Montserrat" w:hAnsi="Montserrat" w:eastAsia="Montserrat"/>
+                <w:b w:val="0"/>
+                <w:i w:val="0"/>
+                <w:color w:val="2C3E50"/>
+                <w:sz w:val="19"/>
+              </w:rPr>
+              <w:t>US$ 2.890–3.315 · US$ 2.295–2.720</w:t>
+            </w:r>
+          </w:p>
+        </w:tc>
+        <w:tc>
+          <w:tcPr>
+            <w:tcW w:type="dxa" w:w="1134"/>
+            <w:tcMar>
+              <w:top w:w="124" w:type="dxa"/>
+              <w:left w:w="124" w:type="dxa"/>
+              <w:bottom w:w="124" w:type="dxa"/>
+              <w:right w:w="124" w:type="dxa"/>
+            </w:tcMar>
+            <w:shd w:val="clear" w:color="auto" w:fill="FFFFFF"/>
+            <w:tcBorders>
+              <w:top w:val="nil"/>
+              <w:left w:val="nil"/>
+              <w:bottom w:val="single" w:sz="4" w:color="D9DEE4"/>
+              <w:right w:val="nil"/>
+            </w:tcBorders>
+          </w:tcPr>
+          <w:p>
+            <w:pPr>
+              <w:spacing w:after="40"/>
+            </w:pPr>
+            <w:r>
+              <w:rPr>
+                <w:rFonts w:ascii="Montserrat" w:hAnsi="Montserrat" w:eastAsia="Montserrat"/>
+                <w:b w:val="0"/>
+                <w:i w:val="0"/>
+                <w:color w:val="2C3E50"/>
+                <w:sz w:val="19"/>
+              </w:rPr>
+              <w:t>2 urnas</w:t>
+            </w:r>
+          </w:p>
+        </w:tc>
+        <w:tc>
+          <w:tcPr>
+            <w:tcW w:type="dxa" w:w="2154"/>
+            <w:tcMar>
+              <w:top w:w="124" w:type="dxa"/>
+              <w:left w:w="124" w:type="dxa"/>
+              <w:bottom w:w="124" w:type="dxa"/>
+              <w:right w:w="124" w:type="dxa"/>
+            </w:tcMar>
+            <w:shd w:val="clear" w:color="auto" w:fill="FFFFFF"/>
+            <w:tcBorders>
+              <w:top w:val="nil"/>
+              <w:left w:val="nil"/>
+              <w:bottom w:val="single" w:sz="4" w:color="D9DEE4"/>
+              <w:right w:val="nil"/>
+            </w:tcBorders>
+          </w:tcPr>
+          <w:p>
+            <w:pPr>
+              <w:spacing w:after="40"/>
+            </w:pPr>
+            <w:r>
+              <w:rPr>
+                <w:rFonts w:ascii="Montserrat" w:hAnsi="Montserrat" w:eastAsia="Montserrat"/>
+                <w:b w:val="0"/>
+                <w:i w:val="0"/>
+                <w:color w:val="2C3E50"/>
+                <w:sz w:val="19"/>
+              </w:rPr>
+              <w:t>Funeral + 2 cremaciones + columbario</w:t>
+            </w:r>
+          </w:p>
+        </w:tc>
+      </w:tr>
+      <w:tr>
+        <w:tc>
+          <w:tcPr>
+            <w:tcW w:type="dxa" w:w="1587"/>
+            <w:tcMar>
+              <w:top w:w="124" w:type="dxa"/>
+              <w:left w:w="124" w:type="dxa"/>
+              <w:bottom w:w="124" w:type="dxa"/>
+              <w:right w:w="124" w:type="dxa"/>
+            </w:tcMar>
+            <w:shd w:val="clear" w:color="auto" w:fill="F4F7FA"/>
+            <w:tcBorders>
+              <w:top w:val="nil"/>
+              <w:left w:val="nil"/>
+              <w:bottom w:val="single" w:sz="4" w:color="D9DEE4"/>
+              <w:right w:val="nil"/>
+            </w:tcBorders>
+          </w:tcPr>
+          <w:p>
+            <w:pPr>
+              <w:spacing w:after="40"/>
+            </w:pPr>
+            <w:r>
+              <w:rPr>
+                <w:rFonts w:ascii="Montserrat" w:hAnsi="Montserrat" w:eastAsia="Montserrat"/>
+                <w:b/>
+                <w:i w:val="0"/>
+                <w:color w:val="1B365D"/>
+                <w:sz w:val="19"/>
+              </w:rPr>
+              <w:t>Mármol o Cristal</w:t>
+            </w:r>
+          </w:p>
+        </w:tc>
+        <w:tc>
+          <w:tcPr>
+            <w:tcW w:type="dxa" w:w="2494"/>
+            <w:tcMar>
+              <w:top w:w="124" w:type="dxa"/>
+              <w:left w:w="124" w:type="dxa"/>
+              <w:bottom w:w="124" w:type="dxa"/>
+              <w:right w:w="124" w:type="dxa"/>
+            </w:tcMar>
+            <w:shd w:val="clear" w:color="auto" w:fill="F4F7FA"/>
+            <w:tcBorders>
+              <w:top w:val="nil"/>
+              <w:left w:val="nil"/>
+              <w:bottom w:val="single" w:sz="4" w:color="D9DEE4"/>
+              <w:right w:val="nil"/>
+            </w:tcBorders>
+          </w:tcPr>
+          <w:p>
+            <w:pPr>
+              <w:spacing w:after="40"/>
+            </w:pPr>
+            <w:r>
+              <w:rPr>
+                <w:rFonts w:ascii="Montserrat" w:hAnsi="Montserrat" w:eastAsia="Montserrat"/>
+                <w:b w:val="0"/>
+                <w:i w:val="0"/>
+                <w:color w:val="2C3E50"/>
+                <w:sz w:val="19"/>
+              </w:rPr>
+              <w:t>Definida US$ 2.600 · Futuro US$ 1.200–1.900</w:t>
+            </w:r>
+          </w:p>
+        </w:tc>
+        <w:tc>
+          <w:tcPr>
+            <w:tcW w:type="dxa" w:w="2268"/>
+            <w:tcMar>
+              <w:top w:w="124" w:type="dxa"/>
+              <w:left w:w="124" w:type="dxa"/>
+              <w:bottom w:w="124" w:type="dxa"/>
+              <w:right w:w="124" w:type="dxa"/>
+            </w:tcMar>
+            <w:shd w:val="clear" w:color="auto" w:fill="F4F7FA"/>
+            <w:tcBorders>
+              <w:top w:val="nil"/>
+              <w:left w:val="nil"/>
+              <w:bottom w:val="single" w:sz="4" w:color="D9DEE4"/>
+              <w:right w:val="nil"/>
+            </w:tcBorders>
+          </w:tcPr>
+          <w:p>
+            <w:pPr>
+              <w:spacing w:after="40"/>
+            </w:pPr>
+            <w:r>
+              <w:rPr>
+                <w:rFonts w:ascii="Montserrat" w:hAnsi="Montserrat" w:eastAsia="Montserrat"/>
+                <w:b w:val="0"/>
+                <w:i w:val="0"/>
+                <w:color w:val="2C3E50"/>
+                <w:sz w:val="19"/>
+              </w:rPr>
+              <w:t>US$ 2.210 · US$ 1.020–1.615</w:t>
+            </w:r>
+          </w:p>
+        </w:tc>
+        <w:tc>
+          <w:tcPr>
+            <w:tcW w:type="dxa" w:w="1134"/>
+            <w:tcMar>
+              <w:top w:w="124" w:type="dxa"/>
+              <w:left w:w="124" w:type="dxa"/>
+              <w:bottom w:w="124" w:type="dxa"/>
+              <w:right w:w="124" w:type="dxa"/>
+            </w:tcMar>
+            <w:shd w:val="clear" w:color="auto" w:fill="F4F7FA"/>
+            <w:tcBorders>
+              <w:top w:val="nil"/>
+              <w:left w:val="nil"/>
+              <w:bottom w:val="single" w:sz="4" w:color="D9DEE4"/>
+              <w:right w:val="nil"/>
+            </w:tcBorders>
+          </w:tcPr>
+          <w:p>
+            <w:pPr>
+              <w:spacing w:after="40"/>
+            </w:pPr>
+            <w:r>
+              <w:rPr>
+                <w:rFonts w:ascii="Montserrat" w:hAnsi="Montserrat" w:eastAsia="Montserrat"/>
+                <w:b w:val="0"/>
+                <w:i w:val="0"/>
+                <w:color w:val="2C3E50"/>
+                <w:sz w:val="19"/>
+              </w:rPr>
+              <w:t>2 urnas</w:t>
+            </w:r>
+          </w:p>
+        </w:tc>
+        <w:tc>
+          <w:tcPr>
+            <w:tcW w:type="dxa" w:w="2154"/>
+            <w:tcMar>
+              <w:top w:w="124" w:type="dxa"/>
+              <w:left w:w="124" w:type="dxa"/>
+              <w:bottom w:w="124" w:type="dxa"/>
+              <w:right w:w="124" w:type="dxa"/>
+            </w:tcMar>
+            <w:shd w:val="clear" w:color="auto" w:fill="F4F7FA"/>
+            <w:tcBorders>
+              <w:top w:val="nil"/>
+              <w:left w:val="nil"/>
+              <w:bottom w:val="single" w:sz="4" w:color="D9DEE4"/>
+              <w:right w:val="nil"/>
+            </w:tcBorders>
+          </w:tcPr>
+          <w:p>
+            <w:pPr>
+              <w:spacing w:after="40"/>
+            </w:pPr>
+            <w:r>
+              <w:rPr>
+                <w:rFonts w:ascii="Montserrat" w:hAnsi="Montserrat" w:eastAsia="Montserrat"/>
+                <w:b w:val="0"/>
+                <w:i w:val="0"/>
+                <w:color w:val="2C3E50"/>
+                <w:sz w:val="19"/>
+              </w:rPr>
+              <w:t>Solo columbario</w:t>
+            </w:r>
+          </w:p>
+        </w:tc>
+      </w:tr>
+      <w:tr>
+        <w:tc>
+          <w:tcPr>
+            <w:tcW w:type="dxa" w:w="1587"/>
+            <w:tcMar>
+              <w:top w:w="124" w:type="dxa"/>
+              <w:left w:w="124" w:type="dxa"/>
+              <w:bottom w:w="124" w:type="dxa"/>
+              <w:right w:w="124" w:type="dxa"/>
+            </w:tcMar>
+            <w:shd w:val="clear" w:color="auto" w:fill="FFFFFF"/>
+            <w:tcBorders>
+              <w:top w:val="nil"/>
+              <w:left w:val="nil"/>
+              <w:bottom w:val="single" w:sz="4" w:color="D9DEE4"/>
+              <w:right w:val="nil"/>
+            </w:tcBorders>
+          </w:tcPr>
+          <w:p>
+            <w:pPr>
+              <w:spacing w:after="40"/>
+            </w:pPr>
+            <w:r>
+              <w:rPr>
+                <w:rFonts w:ascii="Montserrat" w:hAnsi="Montserrat" w:eastAsia="Montserrat"/>
+                <w:b/>
+                <w:i w:val="0"/>
+                <w:color w:val="1B365D"/>
+                <w:sz w:val="19"/>
+              </w:rPr>
+              <w:t>Columbario Ónix</w:t>
+            </w:r>
+          </w:p>
+        </w:tc>
+        <w:tc>
+          <w:tcPr>
+            <w:tcW w:type="dxa" w:w="2494"/>
+            <w:tcMar>
+              <w:top w:w="124" w:type="dxa"/>
+              <w:left w:w="124" w:type="dxa"/>
+              <w:bottom w:w="124" w:type="dxa"/>
+              <w:right w:w="124" w:type="dxa"/>
+            </w:tcMar>
+            <w:shd w:val="clear" w:color="auto" w:fill="FFFFFF"/>
+            <w:tcBorders>
+              <w:top w:val="nil"/>
+              <w:left w:val="nil"/>
+              <w:bottom w:val="single" w:sz="4" w:color="D9DEE4"/>
+              <w:right w:val="nil"/>
+            </w:tcBorders>
+          </w:tcPr>
+          <w:p>
+            <w:pPr>
+              <w:spacing w:after="40"/>
+            </w:pPr>
+            <w:r>
+              <w:rPr>
+                <w:rFonts w:ascii="Montserrat" w:hAnsi="Montserrat" w:eastAsia="Montserrat"/>
+                <w:b w:val="0"/>
+                <w:i w:val="0"/>
+                <w:color w:val="2C3E50"/>
+                <w:sz w:val="19"/>
+              </w:rPr>
+              <w:t>Estándar US$ 3.100 · Familiar US$ 5.000</w:t>
+            </w:r>
+          </w:p>
+        </w:tc>
+        <w:tc>
+          <w:tcPr>
+            <w:tcW w:type="dxa" w:w="2268"/>
+            <w:tcMar>
+              <w:top w:w="124" w:type="dxa"/>
+              <w:left w:w="124" w:type="dxa"/>
+              <w:bottom w:w="124" w:type="dxa"/>
+              <w:right w:w="124" w:type="dxa"/>
+            </w:tcMar>
+            <w:shd w:val="clear" w:color="auto" w:fill="FFFFFF"/>
+            <w:tcBorders>
+              <w:top w:val="nil"/>
+              <w:left w:val="nil"/>
+              <w:bottom w:val="single" w:sz="4" w:color="D9DEE4"/>
+              <w:right w:val="nil"/>
+            </w:tcBorders>
+          </w:tcPr>
+          <w:p>
+            <w:pPr>
+              <w:spacing w:after="40"/>
+            </w:pPr>
+            <w:r>
+              <w:rPr>
+                <w:rFonts w:ascii="Montserrat" w:hAnsi="Montserrat" w:eastAsia="Montserrat"/>
+                <w:b w:val="0"/>
+                <w:i w:val="0"/>
+                <w:color w:val="2C3E50"/>
+                <w:sz w:val="19"/>
+              </w:rPr>
+              <w:t>US$ 2.635 · US$ 4.250</w:t>
+            </w:r>
+          </w:p>
+        </w:tc>
+        <w:tc>
+          <w:tcPr>
+            <w:tcW w:type="dxa" w:w="1134"/>
+            <w:tcMar>
+              <w:top w:w="124" w:type="dxa"/>
+              <w:left w:w="124" w:type="dxa"/>
+              <w:bottom w:w="124" w:type="dxa"/>
+              <w:right w:w="124" w:type="dxa"/>
+            </w:tcMar>
+            <w:shd w:val="clear" w:color="auto" w:fill="FFFFFF"/>
+            <w:tcBorders>
+              <w:top w:val="nil"/>
+              <w:left w:val="nil"/>
+              <w:bottom w:val="single" w:sz="4" w:color="D9DEE4"/>
+              <w:right w:val="nil"/>
+            </w:tcBorders>
+          </w:tcPr>
+          <w:p>
+            <w:pPr>
+              <w:spacing w:after="40"/>
+            </w:pPr>
+            <w:r>
+              <w:rPr>
+                <w:rFonts w:ascii="Montserrat" w:hAnsi="Montserrat" w:eastAsia="Montserrat"/>
+                <w:b w:val="0"/>
+                <w:i w:val="0"/>
+                <w:color w:val="2C3E50"/>
+                <w:sz w:val="19"/>
+              </w:rPr>
+              <w:t>2 o 4 urnas</w:t>
+            </w:r>
+          </w:p>
+        </w:tc>
+        <w:tc>
+          <w:tcPr>
+            <w:tcW w:type="dxa" w:w="2154"/>
+            <w:tcMar>
+              <w:top w:w="124" w:type="dxa"/>
+              <w:left w:w="124" w:type="dxa"/>
+              <w:bottom w:w="124" w:type="dxa"/>
+              <w:right w:w="124" w:type="dxa"/>
+            </w:tcMar>
+            <w:shd w:val="clear" w:color="auto" w:fill="FFFFFF"/>
+            <w:tcBorders>
+              <w:top w:val="nil"/>
+              <w:left w:val="nil"/>
+              <w:bottom w:val="single" w:sz="4" w:color="D9DEE4"/>
+              <w:right w:val="nil"/>
+            </w:tcBorders>
+          </w:tcPr>
+          <w:p>
+            <w:pPr>
+              <w:spacing w:after="40"/>
+            </w:pPr>
+            <w:r>
+              <w:rPr>
+                <w:rFonts w:ascii="Montserrat" w:hAnsi="Montserrat" w:eastAsia="Montserrat"/>
+                <w:b w:val="0"/>
+                <w:i w:val="0"/>
+                <w:color w:val="2C3E50"/>
+                <w:sz w:val="19"/>
+              </w:rPr>
+              <w:t>Solo columbario</w:t>
+            </w:r>
+          </w:p>
+        </w:tc>
+      </w:tr>
+      <w:tr>
+        <w:tc>
+          <w:tcPr>
+            <w:tcW w:type="dxa" w:w="1587"/>
+            <w:tcMar>
+              <w:top w:w="124" w:type="dxa"/>
+              <w:left w:w="124" w:type="dxa"/>
+              <w:bottom w:w="124" w:type="dxa"/>
+              <w:right w:w="124" w:type="dxa"/>
+            </w:tcMar>
+            <w:shd w:val="clear" w:color="auto" w:fill="F4F7FA"/>
+            <w:tcBorders>
+              <w:top w:val="nil"/>
+              <w:left w:val="nil"/>
+              <w:bottom w:val="single" w:sz="4" w:color="D9DEE4"/>
+              <w:right w:val="nil"/>
+            </w:tcBorders>
+          </w:tcPr>
+          <w:p>
+            <w:pPr>
+              <w:spacing w:after="40"/>
+            </w:pPr>
+            <w:r>
+              <w:rPr>
+                <w:rFonts w:ascii="Montserrat" w:hAnsi="Montserrat" w:eastAsia="Montserrat"/>
+                <w:b/>
+                <w:i w:val="0"/>
+                <w:color w:val="1B365D"/>
+                <w:sz w:val="19"/>
+              </w:rPr>
+              <w:t>Obra de Arte</w:t>
+            </w:r>
+          </w:p>
+        </w:tc>
+        <w:tc>
+          <w:tcPr>
+            <w:tcW w:type="dxa" w:w="2494"/>
+            <w:tcMar>
+              <w:top w:w="124" w:type="dxa"/>
+              <w:left w:w="124" w:type="dxa"/>
+              <w:bottom w:w="124" w:type="dxa"/>
+              <w:right w:w="124" w:type="dxa"/>
+            </w:tcMar>
+            <w:shd w:val="clear" w:color="auto" w:fill="F4F7FA"/>
+            <w:tcBorders>
+              <w:top w:val="nil"/>
+              <w:left w:val="nil"/>
+              <w:bottom w:val="single" w:sz="4" w:color="D9DEE4"/>
+              <w:right w:val="nil"/>
+            </w:tcBorders>
+          </w:tcPr>
+          <w:p>
+            <w:pPr>
+              <w:spacing w:after="40"/>
+            </w:pPr>
+            <w:r>
+              <w:rPr>
+                <w:rFonts w:ascii="Montserrat" w:hAnsi="Montserrat" w:eastAsia="Montserrat"/>
+                <w:b w:val="0"/>
+                <w:i w:val="0"/>
+                <w:color w:val="2C3E50"/>
+                <w:sz w:val="19"/>
+              </w:rPr>
+              <w:t>Familiar US$ 12.500</w:t>
+            </w:r>
+          </w:p>
+        </w:tc>
+        <w:tc>
+          <w:tcPr>
+            <w:tcW w:type="dxa" w:w="2268"/>
+            <w:tcMar>
+              <w:top w:w="124" w:type="dxa"/>
+              <w:left w:w="124" w:type="dxa"/>
+              <w:bottom w:w="124" w:type="dxa"/>
+              <w:right w:w="124" w:type="dxa"/>
+            </w:tcMar>
+            <w:shd w:val="clear" w:color="auto" w:fill="F4F7FA"/>
+            <w:tcBorders>
+              <w:top w:val="nil"/>
+              <w:left w:val="nil"/>
+              <w:bottom w:val="single" w:sz="4" w:color="D9DEE4"/>
+              <w:right w:val="nil"/>
+            </w:tcBorders>
+          </w:tcPr>
+          <w:p>
+            <w:pPr>
+              <w:spacing w:after="40"/>
+            </w:pPr>
+            <w:r>
+              <w:rPr>
+                <w:rFonts w:ascii="Montserrat" w:hAnsi="Montserrat" w:eastAsia="Montserrat"/>
+                <w:b w:val="0"/>
+                <w:i w:val="0"/>
+                <w:color w:val="2C3E50"/>
+                <w:sz w:val="19"/>
+              </w:rPr>
+              <w:t>US$ 10.625</w:t>
+            </w:r>
+          </w:p>
+        </w:tc>
+        <w:tc>
+          <w:tcPr>
+            <w:tcW w:type="dxa" w:w="1134"/>
+            <w:tcMar>
+              <w:top w:w="124" w:type="dxa"/>
+              <w:left w:w="124" w:type="dxa"/>
+              <w:bottom w:w="124" w:type="dxa"/>
+              <w:right w:w="124" w:type="dxa"/>
+            </w:tcMar>
+            <w:shd w:val="clear" w:color="auto" w:fill="F4F7FA"/>
+            <w:tcBorders>
+              <w:top w:val="nil"/>
+              <w:left w:val="nil"/>
+              <w:bottom w:val="single" w:sz="4" w:color="D9DEE4"/>
+              <w:right w:val="nil"/>
+            </w:tcBorders>
+          </w:tcPr>
+          <w:p>
+            <w:pPr>
+              <w:spacing w:after="40"/>
+            </w:pPr>
+            <w:r>
+              <w:rPr>
+                <w:rFonts w:ascii="Montserrat" w:hAnsi="Montserrat" w:eastAsia="Montserrat"/>
+                <w:b w:val="0"/>
+                <w:i w:val="0"/>
+                <w:color w:val="2C3E50"/>
+                <w:sz w:val="19"/>
+              </w:rPr>
+              <w:t>4 urnas</w:t>
+            </w:r>
+          </w:p>
+        </w:tc>
+        <w:tc>
+          <w:tcPr>
+            <w:tcW w:type="dxa" w:w="2154"/>
+            <w:tcMar>
+              <w:top w:w="124" w:type="dxa"/>
+              <w:left w:w="124" w:type="dxa"/>
+              <w:bottom w:w="124" w:type="dxa"/>
+              <w:right w:w="124" w:type="dxa"/>
+            </w:tcMar>
+            <w:shd w:val="clear" w:color="auto" w:fill="F4F7FA"/>
+            <w:tcBorders>
+              <w:top w:val="nil"/>
+              <w:left w:val="nil"/>
+              <w:bottom w:val="single" w:sz="4" w:color="D9DEE4"/>
+              <w:right w:val="nil"/>
+            </w:tcBorders>
+          </w:tcPr>
+          <w:p>
+            <w:pPr>
+              <w:spacing w:after="40"/>
+            </w:pPr>
+            <w:r>
+              <w:rPr>
+                <w:rFonts w:ascii="Montserrat" w:hAnsi="Montserrat" w:eastAsia="Montserrat"/>
+                <w:b w:val="0"/>
+                <w:i w:val="0"/>
+                <w:color w:val="2C3E50"/>
+                <w:sz w:val="19"/>
+              </w:rPr>
+              <w:t>Solo columbario</w:t>
+            </w:r>
+          </w:p>
+        </w:tc>
+      </w:tr>
+      <w:tr>
+        <w:tc>
+          <w:tcPr>
+            <w:tcW w:type="dxa" w:w="1587"/>
+            <w:tcMar>
+              <w:top w:w="124" w:type="dxa"/>
+              <w:left w:w="124" w:type="dxa"/>
+              <w:bottom w:w="124" w:type="dxa"/>
+              <w:right w:w="124" w:type="dxa"/>
+            </w:tcMar>
+            <w:shd w:val="clear" w:color="auto" w:fill="FFFFFF"/>
+            <w:tcBorders>
+              <w:top w:val="nil"/>
+              <w:left w:val="nil"/>
+              <w:bottom w:val="single" w:sz="4" w:color="D9DEE4"/>
+              <w:right w:val="nil"/>
+            </w:tcBorders>
+          </w:tcPr>
+          <w:p>
+            <w:pPr>
+              <w:spacing w:after="40"/>
+            </w:pPr>
+            <w:r>
+              <w:rPr>
+                <w:rFonts w:ascii="Montserrat" w:hAnsi="Montserrat" w:eastAsia="Montserrat"/>
+                <w:b/>
+                <w:i w:val="0"/>
+                <w:color w:val="1B365D"/>
+                <w:sz w:val="19"/>
+              </w:rPr>
+              <w:t>Bella Vista</w:t>
+            </w:r>
+          </w:p>
+        </w:tc>
+        <w:tc>
+          <w:tcPr>
+            <w:tcW w:type="dxa" w:w="2494"/>
+            <w:tcMar>
+              <w:top w:w="124" w:type="dxa"/>
+              <w:left w:w="124" w:type="dxa"/>
+              <w:bottom w:w="124" w:type="dxa"/>
+              <w:right w:w="124" w:type="dxa"/>
+            </w:tcMar>
+            <w:shd w:val="clear" w:color="auto" w:fill="FFFFFF"/>
+            <w:tcBorders>
+              <w:top w:val="nil"/>
+              <w:left w:val="nil"/>
+              <w:bottom w:val="single" w:sz="4" w:color="D9DEE4"/>
+              <w:right w:val="nil"/>
+            </w:tcBorders>
+          </w:tcPr>
+          <w:p>
+            <w:pPr>
+              <w:spacing w:after="40"/>
+            </w:pPr>
+            <w:r>
+              <w:rPr>
+                <w:rFonts w:ascii="Montserrat" w:hAnsi="Montserrat" w:eastAsia="Montserrat"/>
+                <w:b w:val="0"/>
+                <w:i w:val="0"/>
+                <w:color w:val="2C3E50"/>
+                <w:sz w:val="19"/>
+              </w:rPr>
+              <w:t>Estándar US$ 1.800 / 1.300 · Familiar US$ 2.900 / 2.300</w:t>
+            </w:r>
+          </w:p>
+        </w:tc>
+        <w:tc>
+          <w:tcPr>
+            <w:tcW w:type="dxa" w:w="2268"/>
+            <w:tcMar>
+              <w:top w:w="124" w:type="dxa"/>
+              <w:left w:w="124" w:type="dxa"/>
+              <w:bottom w:w="124" w:type="dxa"/>
+              <w:right w:w="124" w:type="dxa"/>
+            </w:tcMar>
+            <w:shd w:val="clear" w:color="auto" w:fill="FFFFFF"/>
+            <w:tcBorders>
+              <w:top w:val="nil"/>
+              <w:left w:val="nil"/>
+              <w:bottom w:val="single" w:sz="4" w:color="D9DEE4"/>
+              <w:right w:val="nil"/>
+            </w:tcBorders>
+          </w:tcPr>
+          <w:p>
+            <w:pPr>
+              <w:spacing w:after="40"/>
+            </w:pPr>
+            <w:r>
+              <w:rPr>
+                <w:rFonts w:ascii="Montserrat" w:hAnsi="Montserrat" w:eastAsia="Montserrat"/>
+                <w:b w:val="0"/>
+                <w:i w:val="0"/>
+                <w:color w:val="2C3E50"/>
+                <w:sz w:val="19"/>
+              </w:rPr>
+              <w:t>US$ 1.530 / 1.105 · US$ 2.465 / 1.955</w:t>
+            </w:r>
+          </w:p>
+        </w:tc>
+        <w:tc>
+          <w:tcPr>
+            <w:tcW w:type="dxa" w:w="1134"/>
+            <w:tcMar>
+              <w:top w:w="124" w:type="dxa"/>
+              <w:left w:w="124" w:type="dxa"/>
+              <w:bottom w:w="124" w:type="dxa"/>
+              <w:right w:w="124" w:type="dxa"/>
+            </w:tcMar>
+            <w:shd w:val="clear" w:color="auto" w:fill="FFFFFF"/>
+            <w:tcBorders>
+              <w:top w:val="nil"/>
+              <w:left w:val="nil"/>
+              <w:bottom w:val="single" w:sz="4" w:color="D9DEE4"/>
+              <w:right w:val="nil"/>
+            </w:tcBorders>
+          </w:tcPr>
+          <w:p>
+            <w:pPr>
+              <w:spacing w:after="40"/>
+            </w:pPr>
+            <w:r>
+              <w:rPr>
+                <w:rFonts w:ascii="Montserrat" w:hAnsi="Montserrat" w:eastAsia="Montserrat"/>
+                <w:b w:val="0"/>
+                <w:i w:val="0"/>
+                <w:color w:val="2C3E50"/>
+                <w:sz w:val="19"/>
+              </w:rPr>
+              <w:t>2 o 4 urnas</w:t>
+            </w:r>
+          </w:p>
+        </w:tc>
+        <w:tc>
+          <w:tcPr>
+            <w:tcW w:type="dxa" w:w="2154"/>
+            <w:tcMar>
+              <w:top w:w="124" w:type="dxa"/>
+              <w:left w:w="124" w:type="dxa"/>
+              <w:bottom w:w="124" w:type="dxa"/>
+              <w:right w:w="124" w:type="dxa"/>
+            </w:tcMar>
+            <w:shd w:val="clear" w:color="auto" w:fill="FFFFFF"/>
+            <w:tcBorders>
+              <w:top w:val="nil"/>
+              <w:left w:val="nil"/>
+              <w:bottom w:val="single" w:sz="4" w:color="D9DEE4"/>
+              <w:right w:val="nil"/>
+            </w:tcBorders>
+          </w:tcPr>
+          <w:p>
+            <w:pPr>
+              <w:spacing w:after="40"/>
+            </w:pPr>
+            <w:r>
+              <w:rPr>
+                <w:rFonts w:ascii="Montserrat" w:hAnsi="Montserrat" w:eastAsia="Montserrat"/>
+                <w:b w:val="0"/>
+                <w:i w:val="0"/>
+                <w:color w:val="2C3E50"/>
+                <w:sz w:val="19"/>
+              </w:rPr>
+              <w:t>Cremación + columbario</w:t>
+            </w:r>
+          </w:p>
+        </w:tc>
+      </w:tr>
+    </w:tbl>
+    <w:p>
+      <w:pPr>
+        <w:spacing w:before="0" w:after="80" w:line="276" w:lineRule="auto"/>
+      </w:pPr>
+    </w:p>
+    <w:p>
+      <w:pPr>
+        <w:spacing w:before="80" w:after="120" w:line="276" w:lineRule="auto"/>
+      </w:pPr>
+      <w:r>
+        <w:rPr>
+          <w:rFonts w:ascii="Montserrat" w:hAnsi="Montserrat" w:eastAsia="Montserrat"/>
+          <w:b w:val="0"/>
+          <w:i/>
+          <w:color w:val="7A8794"/>
+          <w:sz w:val="19"/>
+        </w:rPr>
+        <w:t>Precios según fila y nivel (Bella Vista: definida / a futuro). Pago único o financiado en hasta 120 meses, con intereses. El 15% vale solo en Finados y durante noviembre.</w:t>
+      </w:r>
+    </w:p>
+    <w:p>
+      <w:pPr>
+        <w:pStyle w:val="Heading2"/>
+        <w:spacing w:before="200" w:after="80"/>
+      </w:pPr>
+      <w:r>
+        <w:rPr>
+          <w:rFonts w:ascii="Playfair Display" w:hAnsi="Playfair Display" w:eastAsia="Playfair Display"/>
+          <w:b/>
+          <w:i w:val="0"/>
+          <w:color w:val="1B365D"/>
+          <w:sz w:val="28"/>
+        </w:rPr>
         <w:t>Reglas comerciales</w:t>
       </w:r>
     </w:p>
@@ -11476,7 +16198,7 @@
                 <w:color w:val="2C3E50"/>
                 <w:sz w:val="19"/>
               </w:rPr>
-              <w:t>Precio de lanzamiento: 20% en los productos de lanzamiento de este playbook (ver Ficha Técnica). Demás productos del portafolio de cremación: 15%. Cualquier otro descuento, solo con autorización del supervisor (emergencia: máximo 5%).</w:t>
+              <w:t>Productos de lanzamiento (ver Ficha Técnica): 20%. Portafolio existente de columbarios: 15%. Ambos descuentos valen solo en Finados y durante noviembre. Cualquier otro descuento, solo con autorización del supervisor (emergencia: máximo 5%).</w:t>
             </w:r>
           </w:p>
         </w:tc>
@@ -13349,6 +18071,173 @@
                 <w:sz w:val="19"/>
               </w:rPr>
               <w:t>—</w:t>
+            </w:r>
+          </w:p>
+        </w:tc>
+        <w:tc>
+          <w:tcPr>
+            <w:tcW w:type="dxa" w:w="2268"/>
+            <w:tcMar>
+              <w:top w:w="124" w:type="dxa"/>
+              <w:left w:w="124" w:type="dxa"/>
+              <w:bottom w:w="124" w:type="dxa"/>
+              <w:right w:w="124" w:type="dxa"/>
+            </w:tcMar>
+            <w:shd w:val="clear" w:color="auto" w:fill="FBF3E1"/>
+            <w:tcBorders>
+              <w:top w:val="nil"/>
+              <w:left w:val="nil"/>
+              <w:bottom w:val="single" w:sz="4" w:color="D9DEE4"/>
+              <w:right w:val="nil"/>
+            </w:tcBorders>
+          </w:tcPr>
+          <w:p>
+            <w:pPr>
+              <w:spacing w:after="40"/>
+            </w:pPr>
+            <w:r>
+              <w:rPr>
+                <w:rFonts w:ascii="Montserrat" w:hAnsi="Montserrat" w:eastAsia="Montserrat"/>
+                <w:b w:val="0"/>
+                <w:i w:val="0"/>
+                <w:color w:val="2C3E50"/>
+                <w:sz w:val="19"/>
+              </w:rPr>
+              <w:t>—</w:t>
+            </w:r>
+          </w:p>
+        </w:tc>
+      </w:tr>
+      <w:tr>
+        <w:tc>
+          <w:tcPr>
+            <w:tcW w:type="dxa" w:w="1928"/>
+            <w:tcMar>
+              <w:top w:w="124" w:type="dxa"/>
+              <w:left w:w="124" w:type="dxa"/>
+              <w:bottom w:w="124" w:type="dxa"/>
+              <w:right w:w="124" w:type="dxa"/>
+            </w:tcMar>
+            <w:shd w:val="clear" w:color="auto" w:fill="FBF3E1"/>
+            <w:tcBorders>
+              <w:top w:val="nil"/>
+              <w:left w:val="nil"/>
+              <w:bottom w:val="single" w:sz="4" w:color="D9DEE4"/>
+              <w:right w:val="nil"/>
+            </w:tcBorders>
+          </w:tcPr>
+          <w:p>
+            <w:pPr>
+              <w:spacing w:after="40"/>
+            </w:pPr>
+            <w:r>
+              <w:rPr>
+                <w:rFonts w:ascii="Montserrat" w:hAnsi="Montserrat" w:eastAsia="Montserrat"/>
+                <w:b/>
+                <w:i w:val="0"/>
+                <w:color w:val="1B365D"/>
+                <w:sz w:val="19"/>
+              </w:rPr>
+              <w:t>Portafolio existente (columbarios)</w:t>
+            </w:r>
+          </w:p>
+        </w:tc>
+        <w:tc>
+          <w:tcPr>
+            <w:tcW w:type="dxa" w:w="794"/>
+            <w:tcMar>
+              <w:top w:w="124" w:type="dxa"/>
+              <w:left w:w="124" w:type="dxa"/>
+              <w:bottom w:w="124" w:type="dxa"/>
+              <w:right w:w="124" w:type="dxa"/>
+            </w:tcMar>
+            <w:shd w:val="clear" w:color="auto" w:fill="FBF3E1"/>
+            <w:tcBorders>
+              <w:top w:val="nil"/>
+              <w:left w:val="nil"/>
+              <w:bottom w:val="single" w:sz="4" w:color="D9DEE4"/>
+              <w:right w:val="nil"/>
+            </w:tcBorders>
+          </w:tcPr>
+          <w:p>
+            <w:pPr>
+              <w:spacing w:after="40"/>
+            </w:pPr>
+            <w:r>
+              <w:rPr>
+                <w:rFonts w:ascii="Montserrat" w:hAnsi="Montserrat" w:eastAsia="Montserrat"/>
+                <w:b w:val="0"/>
+                <w:i w:val="0"/>
+                <w:color w:val="2C3E50"/>
+                <w:sz w:val="19"/>
+              </w:rPr>
+              <w:t>A definir</w:t>
+            </w:r>
+          </w:p>
+        </w:tc>
+        <w:tc>
+          <w:tcPr>
+            <w:tcW w:type="dxa" w:w="1474"/>
+            <w:tcMar>
+              <w:top w:w="124" w:type="dxa"/>
+              <w:left w:w="124" w:type="dxa"/>
+              <w:bottom w:w="124" w:type="dxa"/>
+              <w:right w:w="124" w:type="dxa"/>
+            </w:tcMar>
+            <w:shd w:val="clear" w:color="auto" w:fill="FBF3E1"/>
+            <w:tcBorders>
+              <w:top w:val="nil"/>
+              <w:left w:val="nil"/>
+              <w:bottom w:val="single" w:sz="4" w:color="D9DEE4"/>
+              <w:right w:val="nil"/>
+            </w:tcBorders>
+          </w:tcPr>
+          <w:p>
+            <w:pPr>
+              <w:spacing w:after="40"/>
+            </w:pPr>
+            <w:r>
+              <w:rPr>
+                <w:rFonts w:ascii="Montserrat" w:hAnsi="Montserrat" w:eastAsia="Montserrat"/>
+                <w:b w:val="0"/>
+                <w:i w:val="0"/>
+                <w:color w:val="2C3E50"/>
+                <w:sz w:val="19"/>
+              </w:rPr>
+              <w:t>—</w:t>
+            </w:r>
+          </w:p>
+        </w:tc>
+        <w:tc>
+          <w:tcPr>
+            <w:tcW w:type="dxa" w:w="3175"/>
+            <w:tcMar>
+              <w:top w:w="124" w:type="dxa"/>
+              <w:left w:w="124" w:type="dxa"/>
+              <w:bottom w:w="124" w:type="dxa"/>
+              <w:right w:w="124" w:type="dxa"/>
+            </w:tcMar>
+            <w:shd w:val="clear" w:color="auto" w:fill="FBF3E1"/>
+            <w:tcBorders>
+              <w:top w:val="nil"/>
+              <w:left w:val="nil"/>
+              <w:bottom w:val="single" w:sz="4" w:color="D9DEE4"/>
+              <w:right w:val="nil"/>
+            </w:tcBorders>
+          </w:tcPr>
+          <w:p>
+            <w:pPr>
+              <w:spacing w:after="40"/>
+            </w:pPr>
+            <w:r>
+              <w:rPr>
+                <w:rFonts w:ascii="Montserrat" w:hAnsi="Montserrat" w:eastAsia="Montserrat"/>
+                <w:b w:val="0"/>
+                <w:i w:val="0"/>
+                <w:color w:val="2C3E50"/>
+                <w:sz w:val="19"/>
+              </w:rPr>
+              <w:t>Sistema de comisión propio, en preparación</w:t>
             </w:r>
           </w:p>
         </w:tc>
@@ -13562,6 +18451,32 @@
           <w:sz w:val="21"/>
         </w:rPr>
         <w:t>Estorno: la comisión se descuenta de los pagos siguientes al asesor.</w:t>
+      </w:r>
+    </w:p>
+    <w:p>
+      <w:pPr>
+        <w:spacing w:before="0" w:after="60" w:line="276" w:lineRule="auto"/>
+        <w:ind w:left="340" w:hanging="340"/>
+      </w:pPr>
+      <w:r>
+        <w:rPr>
+          <w:rFonts w:ascii="Montserrat" w:hAnsi="Montserrat" w:eastAsia="Montserrat"/>
+          <w:b w:val="0"/>
+          <w:i w:val="0"/>
+          <w:color w:val="C5A059"/>
+          <w:sz w:val="15"/>
+        </w:rPr>
+        <w:t xml:space="preserve">■  </w:t>
+      </w:r>
+      <w:r>
+        <w:rPr>
+          <w:rFonts w:ascii="Montserrat" w:hAnsi="Montserrat" w:eastAsia="Montserrat"/>
+          <w:b w:val="0"/>
+          <w:i w:val="0"/>
+          <w:color w:val="2C3E50"/>
+          <w:sz w:val="21"/>
+        </w:rPr>
+        <w:t>Portafolio existente (columbarios): la comisión se definirá en un sistema propio, en preparación.</w:t>
       </w:r>
     </w:p>
     <w:p>

</xml_diff>

<commit_message>
Playbook: ajustar textos del portafolio existente de columbarios
Etiquetas más cortas y redacción de qué es, incluye y reglas alineada
con las nuevas páginas del Canva. Salidas regeneradas.

Co-Authored-By: Claude Opus 5.5 <noreply@anthropic.com>
Claude-Session: https://claude.ai/code/session_0111i7vn9WWo4QxCQbucWbrF
</commit_message>
<xml_diff>
--- a/playbook/salida/Playbook_Comercial_Cremacion_Vangrupo.docx
+++ b/playbook/salida/Playbook_Comercial_Cremacion_Vangrupo.docx
@@ -7870,7 +7870,7 @@
                 <w:color w:val="C5A059"/>
                 <w:sz w:val="17"/>
               </w:rPr>
-              <w:t>HOGAR DE LAS MEMORIAS · FUNERAL + CREMACIÓN + COLUMBARIO</w:t>
+              <w:t>HOGAR DE LAS MEMORIAS · SERVICIO COMPLETO</w:t>
             </w:r>
           </w:p>
           <w:p>
@@ -7980,7 +7980,7 @@
           <w:color w:val="2C3E50"/>
           <w:sz w:val="21"/>
         </w:rPr>
-        <w:t>La solución más completa: servicio funerario, dos cremaciones y un columbario permanente de cristal o mármol para hasta dos urnas, en El Hogar de las Memorias.</w:t>
+        <w:t>Integra en un solo contrato el servicio funerario, dos cremaciones y un columbario permanente de cristal o mármol para hasta dos urnas, en El Hogar de las Memorias.</w:t>
       </w:r>
     </w:p>
     <w:p>
@@ -8081,7 +8081,7 @@
                 <w:color w:val="2C3E50"/>
                 <w:sz w:val="19"/>
               </w:rPr>
-              <w:t>Columbario estándar permanente de cristal o mármol, para hasta 2 urnas</w:t>
+              <w:t>Incluye columbario estándar permanente de cristal o mármol, para hasta 2 urnas</w:t>
             </w:r>
           </w:p>
           <w:p>
@@ -8107,7 +8107,7 @@
                 <w:color w:val="2C3E50"/>
                 <w:sz w:val="19"/>
               </w:rPr>
-              <w:t>2 cremaciones con certificado y 2 urnas cinerarias básicas</w:t>
+              <w:t>Traslados, preparación y resguardo hasta 5 días; Programa Vive de acompañamiento en el duelo</w:t>
             </w:r>
           </w:p>
           <w:p>
@@ -8133,7 +8133,7 @@
                 <w:color w:val="2C3E50"/>
                 <w:sz w:val="19"/>
               </w:rPr>
-              <w:t>Sala de velación 24 h, ataúd ceremonial y carroza tradicional</w:t>
+              <w:t>Urnas cinerarias básicas (2) y 2 cremaciones con certificado</w:t>
             </w:r>
           </w:p>
           <w:p>
@@ -8159,7 +8159,7 @@
                 <w:color w:val="2C3E50"/>
                 <w:sz w:val="19"/>
               </w:rPr>
-              <w:t>Traslados, preparación y resguardo hasta 5 días, y Programa Vive de acompañamiento en el duelo</w:t>
+              <w:t>Capilla de velación 24 h, ataúd ceremonial y carroza tradicional</w:t>
             </w:r>
           </w:p>
         </w:tc>
@@ -8250,7 +8250,7 @@
                 <w:color w:val="2C3E50"/>
                 <w:sz w:val="19"/>
               </w:rPr>
-              <w:t>Ubicación definida: US$ 3.400 – 3.900. Ubicación a futuro: US$ 2.700 – 3.200 (según fila y nivel).</w:t>
+              <w:t>Con ubicación definida: US$ 3.400 – 3.900; a futuro: US$ 2.700 – 3.200 (según fila y nivel).</w:t>
             </w:r>
           </w:p>
           <w:p>
@@ -8276,7 +8276,7 @@
                 <w:color w:val="2C3E50"/>
                 <w:sz w:val="19"/>
               </w:rPr>
-              <w:t>Velación en La Auxiliadora (Capilla Maquilishuat o Básica) o en Capillas Memoriales (Las Camelias o Básica).</w:t>
+              <w:t>Elija velación en La Auxiliadora (Maquilishuat o Básica) o en Capillas Memoriales (Las Camelias o Básica).</w:t>
             </w:r>
           </w:p>
         </w:tc>
@@ -8746,7 +8746,7 @@
           <w:color w:val="2C3E50"/>
           <w:sz w:val="21"/>
         </w:rPr>
-        <w:t>Columbario permanente de mármol o cristal en El Hogar de las Memorias: un espacio elegante y sereno, de diseño atemporal, para las urnas de la familia.</w:t>
+        <w:t>Ideal para las cenizas de la familia: columbario permanente de mármol o cristal en El Hogar de las Memorias, elegante, sereno y de diseño atemporal.</w:t>
       </w:r>
     </w:p>
     <w:p>
@@ -8847,7 +8847,7 @@
                 <w:color w:val="2C3E50"/>
                 <w:sz w:val="19"/>
               </w:rPr>
-              <w:t>Espacio permanente en columbario de mármol o cristal</w:t>
+              <w:t>Incluye espacio permanente en columbario de mármol o cristal</w:t>
             </w:r>
           </w:p>
           <w:p>
@@ -8873,7 +8873,7 @@
                 <w:color w:val="2C3E50"/>
                 <w:sz w:val="19"/>
               </w:rPr>
-              <w:t>Capacidad estándar: hasta 2 urnas</w:t>
+              <w:t>Tamaño estándar: hasta 2 urnas</w:t>
             </w:r>
           </w:p>
           <w:p>
@@ -8964,7 +8964,7 @@
                 <w:color w:val="2C3E50"/>
                 <w:sz w:val="19"/>
               </w:rPr>
-              <w:t>Solo columbario: la cremación se contrata aparte (por ejemplo, con la Solución Modular).</w:t>
+              <w:t>Cremación no incluida: se contrata aparte (por ejemplo, con la Solución Modular).</w:t>
             </w:r>
           </w:p>
           <w:p>
@@ -8990,7 +8990,7 @@
                 <w:color w:val="2C3E50"/>
                 <w:sz w:val="19"/>
               </w:rPr>
-              <w:t>Ubicación definida: US$ 2.600. Ubicación a futuro: US$ 1.200 – 1.900 (según fila y nivel).</w:t>
+              <w:t>Con ubicación definida: US$ 2.600; a futuro: US$ 1.200 – 1.900 (según fila y nivel).</w:t>
             </w:r>
           </w:p>
         </w:tc>
@@ -9435,7 +9435,7 @@
           <w:color w:val="7A8794"/>
           <w:sz w:val="19"/>
         </w:rPr>
-        <w:t>Finados y noviembre (−15%): US$ 2.635 / US$ 4.250 · Pago único o hasta 120 meses, con intereses</w:t>
+        <w:t>Finados y noviembre (−15%): US$ 2.635 / 4.250 · Único o hasta 120 meses, con intereses</w:t>
       </w:r>
     </w:p>
     <w:p>
@@ -9460,7 +9460,7 @@
           <w:color w:val="2C3E50"/>
           <w:sz w:val="21"/>
         </w:rPr>
-        <w:t>Columbario de ónix natural, una piedra de tonos cálidos y apariencia luminosa, para un homenaje exclusivo y perdurable.</w:t>
+        <w:t>Inspirado en la belleza del ónix natural, de tonos cálidos y apariencia luminosa: un columbario exclusivo para un homenaje perdurable.</w:t>
       </w:r>
     </w:p>
     <w:p>
@@ -9561,7 +9561,7 @@
                 <w:color w:val="2C3E50"/>
                 <w:sz w:val="19"/>
               </w:rPr>
-              <w:t>Espacio permanente en columbario de ónix natural</w:t>
+              <w:t>Incluye espacio permanente en columbario de ónix natural</w:t>
             </w:r>
           </w:p>
           <w:p>
@@ -9587,7 +9587,7 @@
                 <w:color w:val="2C3E50"/>
                 <w:sz w:val="19"/>
               </w:rPr>
-              <w:t>Estándar: hasta 2 urnas, con ubicación definida (US$ 3.100)</w:t>
+              <w:t>Tamaño estándar: hasta 2 urnas, con ubicación definida (US$ 3.100)</w:t>
             </w:r>
           </w:p>
           <w:p>
@@ -9613,7 +9613,7 @@
                 <w:color w:val="2C3E50"/>
                 <w:sz w:val="19"/>
               </w:rPr>
-              <w:t>Familiar: hasta 4 urnas, con ubicación a futuro (US$ 5.000)</w:t>
+              <w:t>Una opción familiar: hasta 4 urnas, con ubicación a futuro (US$ 5.000)</w:t>
             </w:r>
           </w:p>
         </w:tc>
@@ -9678,7 +9678,7 @@
                 <w:color w:val="2C3E50"/>
                 <w:sz w:val="19"/>
               </w:rPr>
-              <w:t>Solo columbario: la cremación se contrata aparte.</w:t>
+              <w:t>Cremación no incluida: se contrata aparte.</w:t>
             </w:r>
           </w:p>
           <w:p>
@@ -9704,7 +9704,7 @@
                 <w:color w:val="2C3E50"/>
                 <w:sz w:val="19"/>
               </w:rPr>
-              <w:t>Estándar (2 urnas) con ubicación definida; Familiar (4 urnas) con ubicación a futuro.</w:t>
+              <w:t>Con la modalidad estándar la ubicación es definida; con la familiar, a futuro.</w:t>
             </w:r>
           </w:p>
         </w:tc>
@@ -10038,7 +10038,7 @@
                 <w:color w:val="C5A059"/>
                 <w:sz w:val="17"/>
               </w:rPr>
-              <w:t>HOGAR DE LAS MEMORIAS · COLUMBARIO FAMILIAR EXCLUSIVO</w:t>
+              <w:t>HOGAR DE LAS MEMORIAS · COLUMBARIO FAMILIAR</w:t>
             </w:r>
           </w:p>
           <w:p>
@@ -10148,7 +10148,7 @@
           <w:color w:val="2C3E50"/>
           <w:sz w:val="21"/>
         </w:rPr>
-        <w:t>Columbario familiar con tapa de ónix y obra de arte religiosa: una expresión única de fe, memoria y belleza para toda una familia.</w:t>
+        <w:t>Imagen religiosa sobre tapa de ónix: un columbario familiar que es una expresión única de fe, memoria y belleza.</w:t>
       </w:r>
     </w:p>
     <w:p>
@@ -10249,7 +10249,7 @@
                 <w:color w:val="2C3E50"/>
                 <w:sz w:val="19"/>
               </w:rPr>
-              <w:t>Columbario familiar permanente para hasta 4 urnas</w:t>
+              <w:t>Incluye columbario familiar permanente para hasta 4 urnas</w:t>
             </w:r>
           </w:p>
           <w:p>
@@ -10392,7 +10392,7 @@
                 <w:color w:val="2C3E50"/>
                 <w:sz w:val="19"/>
               </w:rPr>
-              <w:t>Solo columbario: la cremación se contrata aparte.</w:t>
+              <w:t>Cremación no incluida: se contrata aparte.</w:t>
             </w:r>
           </w:p>
         </w:tc>
@@ -10726,7 +10726,7 @@
                 <w:color w:val="C5A059"/>
                 <w:sz w:val="17"/>
               </w:rPr>
-              <w:t>MAUSOLEO VERTICAL BELLA VISTA · CREMACIÓN + COLUMBARIO</w:t>
+              <w:t>MAUSOLEO BELLA VISTA · CREMACIÓN + COLUMBARIO</w:t>
             </w:r>
           </w:p>
           <w:p>
@@ -10836,7 +10836,7 @@
           <w:color w:val="2C3E50"/>
           <w:sz w:val="21"/>
         </w:rPr>
-        <w:t>Columbario de cristal en el mausoleo vertical Bella Vista, dentro del cementerio, con el proceso completo de cremación incluido.</w:t>
+        <w:t>Incluye el proceso completo de cremación y un columbario de cristal en el mausoleo vertical Bella Vista, dentro del cementerio.</w:t>
       </w:r>
     </w:p>
     <w:p>
@@ -10937,7 +10937,7 @@
                 <w:color w:val="2C3E50"/>
                 <w:sz w:val="19"/>
               </w:rPr>
-              <w:t>Columbario de cristal permanente (30 × 30 × 30 cm)</w:t>
+              <w:t>Incluye columbario de cristal permanente (30 × 30 × 30 cm)</w:t>
             </w:r>
           </w:p>
           <w:p>
@@ -10963,7 +10963,7 @@
                 <w:color w:val="2C3E50"/>
                 <w:sz w:val="19"/>
               </w:rPr>
-              <w:t>Estándar: 2 cremaciones y 2 urnas · Familiar: 4 cremaciones y 4 urnas</w:t>
+              <w:t>Traslados, preparación y resguardo hasta 5 días</w:t>
             </w:r>
           </w:p>
           <w:p>
@@ -10989,7 +10989,7 @@
                 <w:color w:val="2C3E50"/>
                 <w:sz w:val="19"/>
               </w:rPr>
-              <w:t>Traslados, preparación y resguardo hasta 5 días</w:t>
+              <w:t>Urnas y cremaciones: 2 en la modalidad estándar, 4 en la familiar</w:t>
             </w:r>
           </w:p>
           <w:p>
@@ -11080,7 +11080,7 @@
                 <w:color w:val="2C3E50"/>
                 <w:sz w:val="19"/>
               </w:rPr>
-              <w:t>Estándar: ubicación definida US$ 1.800 · a futuro US$ 1.300.</w:t>
+              <w:t>Con modalidad estándar: definida US$ 1.800 · a futuro US$ 1.300.</w:t>
             </w:r>
           </w:p>
           <w:p>
@@ -11106,7 +11106,7 @@
                 <w:color w:val="2C3E50"/>
                 <w:sz w:val="19"/>
               </w:rPr>
-              <w:t>Familiar: ubicación definida US$ 2.900 · a futuro US$ 2.300.</w:t>
+              <w:t>Con modalidad familiar: definida US$ 2.900 · a futuro US$ 2.300.</w:t>
             </w:r>
           </w:p>
           <w:p>
@@ -11132,7 +11132,7 @@
                 <w:color w:val="2C3E50"/>
                 <w:sz w:val="19"/>
               </w:rPr>
-              <w:t>La cremación está incluida: no hace falta contratarla aparte.</w:t>
+              <w:t>En este producto la cremación está incluida: no hace falta contratarla aparte.</w:t>
             </w:r>
           </w:p>
         </w:tc>

</xml_diff>

<commit_message>
Columbarios: ubicación definida o a futuro en todas las opciones
Ónix y Obra de Arte pasan a admitir ubicación definida o a futuro,
como los demás columbarios. Salidas regeneradas.

Co-Authored-By: Claude Opus 5.5 <noreply@anthropic.com>
Claude-Session: https://claude.ai/code/session_0111i7vn9WWo4QxCQbucWbrF
</commit_message>
<xml_diff>
--- a/playbook/salida/Playbook_Comercial_Cremacion_Vangrupo.docx
+++ b/playbook/salida/Playbook_Comercial_Cremacion_Vangrupo.docx
@@ -9587,7 +9587,7 @@
                 <w:color w:val="2C3E50"/>
                 <w:sz w:val="19"/>
               </w:rPr>
-              <w:t>Tamaño estándar: hasta 2 urnas, con ubicación definida (US$ 3.100)</w:t>
+              <w:t>Tamaño estándar: hasta 2 urnas (US$ 3.100)</w:t>
             </w:r>
           </w:p>
           <w:p>
@@ -9613,7 +9613,7 @@
                 <w:color w:val="2C3E50"/>
                 <w:sz w:val="19"/>
               </w:rPr>
-              <w:t>Una opción familiar: hasta 4 urnas, con ubicación a futuro (US$ 5.000)</w:t>
+              <w:t>Una opción familiar: hasta 4 urnas (US$ 5.000)</w:t>
             </w:r>
           </w:p>
         </w:tc>
@@ -9704,7 +9704,7 @@
                 <w:color w:val="2C3E50"/>
                 <w:sz w:val="19"/>
               </w:rPr>
-              <w:t>Con la modalidad estándar la ubicación es definida; con la familiar, a futuro.</w:t>
+              <w:t>Con ubicación definida o a futuro en ambas modalidades (según fila y nivel).</w:t>
             </w:r>
           </w:p>
         </w:tc>
@@ -10301,7 +10301,7 @@
                 <w:color w:val="2C3E50"/>
                 <w:sz w:val="19"/>
               </w:rPr>
-              <w:t>Ubicación definida</w:t>
+              <w:t>Ubicación definida o a futuro</w:t>
             </w:r>
           </w:p>
         </w:tc>

</xml_diff>

<commit_message>
Columbarios: Ónix estándar definida / familiar a futuro; Obra de Arte solo definida
Revierte el cambio anterior: Obra de Arte es solo familiar con ubicación
definida; Ónix estándar es ubicación definida y familiar, a futuro.

Co-Authored-By: Claude Opus 5.5 <noreply@anthropic.com>
Claude-Session: https://claude.ai/code/session_0111i7vn9WWo4QxCQbucWbrF
</commit_message>
<xml_diff>
--- a/playbook/salida/Playbook_Comercial_Cremacion_Vangrupo.docx
+++ b/playbook/salida/Playbook_Comercial_Cremacion_Vangrupo.docx
@@ -9587,7 +9587,7 @@
                 <w:color w:val="2C3E50"/>
                 <w:sz w:val="19"/>
               </w:rPr>
-              <w:t>Tamaño estándar: hasta 2 urnas (US$ 3.100)</w:t>
+              <w:t>Tamaño estándar: hasta 2 urnas, con ubicación definida (US$ 3.100)</w:t>
             </w:r>
           </w:p>
           <w:p>
@@ -9613,7 +9613,7 @@
                 <w:color w:val="2C3E50"/>
                 <w:sz w:val="19"/>
               </w:rPr>
-              <w:t>Una opción familiar: hasta 4 urnas (US$ 5.000)</w:t>
+              <w:t>Una opción familiar: hasta 4 urnas, con ubicación a futuro (US$ 5.000)</w:t>
             </w:r>
           </w:p>
         </w:tc>
@@ -9704,7 +9704,7 @@
                 <w:color w:val="2C3E50"/>
                 <w:sz w:val="19"/>
               </w:rPr>
-              <w:t>Con ubicación definida o a futuro en ambas modalidades (según fila y nivel).</w:t>
+              <w:t>Con la modalidad estándar la ubicación es definida; con la familiar, a futuro.</w:t>
             </w:r>
           </w:p>
         </w:tc>
@@ -10301,7 +10301,7 @@
                 <w:color w:val="2C3E50"/>
                 <w:sz w:val="19"/>
               </w:rPr>
-              <w:t>Ubicación definida o a futuro</w:t>
+              <w:t>Ubicación definida</w:t>
             </w:r>
           </w:p>
         </w:tc>

</xml_diff>

<commit_message>
Playbook: reemplaza comillas angulares por comillas dobles
Co-Authored-By: Claude Opus 5.5 <noreply@anthropic.com>
Claude-Session: https://claude.ai/code/session_0111i7vn9WWo4QxCQbucWbrF
</commit_message>
<xml_diff>
--- a/playbook/salida/Playbook_Comercial_Cremacion_Vangrupo.docx
+++ b/playbook/salida/Playbook_Comercial_Cremacion_Vangrupo.docx
@@ -159,7 +159,7 @@
           <w:color w:val="1B365D"/>
           <w:sz w:val="30"/>
         </w:rPr>
-        <w:t>«Acompañar, no vender: la familia primero, siempre.»</w:t>
+        <w:t>"Acompañar, no vender: la familia primero, siempre."</w:t>
       </w:r>
     </w:p>
     <w:p>
@@ -953,7 +953,7 @@
           <w:color w:val="2C3E50"/>
           <w:sz w:val="21"/>
         </w:rPr>
-        <w:t>En La Auxiliadora, Hogar de las Memorias y Parque Memorial Las Colinas, empresas de Vangrupo, no vendemos nichos, parcelas ni servicios: acompañamos a las familias salvadoreñas a honrar la memoria de quienes aman. La cremación es una decisión cada vez más elegida, y nuestros nuevos jardines de cenizas responden a una pregunta que muchas familias se hacen y pocas se atreven a decir: «¿y después de la cremación, dónde las visitamos?».</w:t>
+        <w:t>En La Auxiliadora, Hogar de las Memorias y Parque Memorial Las Colinas, empresas de Vangrupo, no vendemos nichos, parcelas ni servicios: acompañamos a las familias salvadoreñas a honrar la memoria de quienes aman. La cremación es una decisión cada vez más elegida, y nuestros nuevos jardines de cenizas responden a una pregunta que muchas familias se hacen y pocas se atreven a decir: "¿y después de la cremación, dónde las visitamos?".</w:t>
       </w:r>
     </w:p>
     <w:p>
@@ -1316,7 +1316,7 @@
           <w:color w:val="2C3E50"/>
           <w:sz w:val="21"/>
         </w:rPr>
-        <w:t>En el momento de la pérdida. Aquí no se «vende»: se acoge, se informa con calma y se resuelve con agilidad y respeto.</w:t>
+        <w:t>En el momento de la pérdida. Aquí no se "vende": se acoge, se informa con calma y se resuelve con agilidad y respeto.</w:t>
       </w:r>
     </w:p>
     <w:tbl>
@@ -1380,7 +1380,7 @@
                 <w:color w:val="FFFFFF"/>
                 <w:sz w:val="21"/>
               </w:rPr>
-              <w:t>Nuestra diferencia no es el precio: es la atención. Antes de cada propuesta, pregúntese: «¿esto acoge a la familia o solo cierra un negocio?».</w:t>
+              <w:t>Nuestra diferencia no es el precio: es la atención. Antes de cada propuesta, pregúntese: "¿esto acoge a la familia o solo cierra un negocio?".</w:t>
             </w:r>
           </w:p>
         </w:tc>
@@ -3645,7 +3645,7 @@
                 <w:color w:val="2C3E50"/>
                 <w:sz w:val="21"/>
               </w:rPr>
-              <w:t>«Usted ya protegió a su familia con su plan. Pagando en hasta 120 meses, puede sumar la cremación completa, con urna, trámites y un año de columbario incluido. Así nadie tendrá que decidir ni pagar de golpe en un momento difícil.»</w:t>
+              <w:t>"Usted ya protegió a su familia con su plan. Pagando en hasta 120 meses, puede sumar la cremación completa, con urna, trámites y un año de columbario incluido. Así nadie tendrá que decidir ni pagar de golpe en un momento difícil."</w:t>
             </w:r>
           </w:p>
         </w:tc>
@@ -3776,7 +3776,7 @@
           <w:color w:val="1B365D"/>
           <w:sz w:val="21"/>
         </w:rPr>
-        <w:t>«¿Le parece si lo sumamos a su plan desde este mes, con la primera cuota de hoy?»</w:t>
+        <w:t>"¿Le parece si lo sumamos a su plan desde este mes, con la primera cuota de hoy?"</w:t>
       </w:r>
     </w:p>
     <w:p>
@@ -3806,7 +3806,7 @@
           <w:color w:val="2C3E50"/>
           <w:sz w:val="20"/>
         </w:rPr>
-        <w:t>«Mi plan ya es suficiente.» → «Su plan cubre el servicio funerario; la cremación y la urna se pagarían aparte y de una sola vez. Con el módulo queda todo cubierto en cuotas pequeñas.»</w:t>
+        <w:t>"Mi plan ya es suficiente." → "Su plan cubre el servicio funerario; la cremación y la urna se pagarían aparte y de una sola vez. Con el módulo queda todo cubierto en cuotas pequeñas."</w:t>
       </w:r>
     </w:p>
     <w:tbl>
@@ -4411,7 +4411,7 @@
                 <w:color w:val="2C3E50"/>
                 <w:sz w:val="21"/>
               </w:rPr>
-              <w:t>«Después de la cremación, muchas familias se preguntan dónde dejar las cenizas. En nuestro Jardín 1, su ser querido descansa bajo una tapa de granito con su nombre, rodeado de plantas y con un banco para sentarse a recordar. Es un lugar para volver, con la dignidad que merece.»</w:t>
+              <w:t>"Después de la cremación, muchas familias se preguntan dónde dejar las cenizas. En nuestro Jardín 1, su ser querido descansa bajo una tapa de granito con su nombre, rodeado de plantas y con un banco para sentarse a recordar. Es un lugar para volver, con la dignidad que merece."</w:t>
             </w:r>
           </w:p>
         </w:tc>
@@ -4542,7 +4542,7 @@
           <w:color w:val="1B365D"/>
           <w:sz w:val="21"/>
         </w:rPr>
-        <w:t>«¿Le gustaría conocer el jardín esta semana para elegir el lugar con calma?»</w:t>
+        <w:t>"¿Le gustaría conocer el jardín esta semana para elegir el lugar con calma?"</w:t>
       </w:r>
     </w:p>
     <w:p>
@@ -4572,7 +4572,7 @@
           <w:color w:val="2C3E50"/>
           <w:sz w:val="20"/>
         </w:rPr>
-        <w:t>«Prefiero tener las cenizas en casa.» → «Es comprensible querer tenerlas cerca. En el jardín, toda la familia puede visitarlas, y las cenizas quedan protegidas si algún día hay mudanzas o cambios en el hogar.»</w:t>
+        <w:t>"Prefiero tener las cenizas en casa." → "Es comprensible querer tenerlas cerca. En el jardín, toda la familia puede visitarlas, y las cenizas quedan protegidas si algún día hay mudanzas o cambios en el hogar."</w:t>
       </w:r>
     </w:p>
     <w:tbl>
@@ -5177,7 +5177,7 @@
                 <w:color w:val="2C3E50"/>
                 <w:sz w:val="21"/>
               </w:rPr>
-              <w:t>«Así como una familia comparte una casa, también puede compartir un lugar de memoria. La parcela familiar reúne hasta cuatro seres queridos en un mismo espacio, por 30 años renovables, y cuesta US$ 500 por espacio (US$ 400 con el precio de lanzamiento), menos que comprarlos por separado.»</w:t>
+              <w:t>"Así como una familia comparte una casa, también puede compartir un lugar de memoria. La parcela familiar reúne hasta cuatro seres queridos en un mismo espacio, por 30 años renovables, y cuesta US$ 500 por espacio (US$ 400 con el precio de lanzamiento), menos que comprarlos por separado."</w:t>
             </w:r>
           </w:p>
         </w:tc>
@@ -5308,7 +5308,7 @@
           <w:color w:val="1B365D"/>
           <w:sz w:val="21"/>
         </w:rPr>
-        <w:t>«¿Reservamos hoy la parcela para su familia y la pagan en cuotas cómodas?»</w:t>
+        <w:t>"¿Reservamos hoy la parcela para su familia y la pagan en cuotas cómodas?"</w:t>
       </w:r>
     </w:p>
     <w:p>
@@ -5338,7 +5338,7 @@
           <w:color w:val="2C3E50"/>
           <w:sz w:val="20"/>
         </w:rPr>
-        <w:t>«Es mucho dinero.» → «Son US$ 500 por cada espacio, con financiamiento. Y es una decisión que se toma una sola vez para toda la familia.»</w:t>
+        <w:t>"Es mucho dinero." → "Son US$ 500 por cada espacio, con financiamiento. Y es una decisión que se toma una sola vez para toda la familia."</w:t>
       </w:r>
     </w:p>
     <w:tbl>
@@ -5969,7 +5969,7 @@
                 <w:color w:val="2C3E50"/>
                 <w:sz w:val="21"/>
               </w:rPr>
-              <w:t>«Para quienes aman la naturaleza, el Jardín Ecológico es volver a la tierra. La urna se integra al suelo del bosque, junto al agua, y durante tres años la familia tiene un lugar señalado para visitar. Después, el nombre queda para siempre en el monumento memorial del jardín.»</w:t>
+              <w:t>"Para quienes aman la naturaleza, el Jardín Ecológico es volver a la tierra. La urna se integra al suelo del bosque, junto al agua, y durante tres años la familia tiene un lugar señalado para visitar. Después, el nombre queda para siempre en el monumento memorial del jardín."</w:t>
             </w:r>
           </w:p>
         </w:tc>
@@ -6044,7 +6044,7 @@
           <w:color w:val="2C3E50"/>
           <w:sz w:val="20"/>
         </w:rPr>
-        <w:t>¿Qué significa para ustedes «volver a la tierra»?</w:t>
+        <w:t>¿Qué significa para ustedes "volver a la tierra"?</w:t>
       </w:r>
     </w:p>
     <w:p>
@@ -6100,7 +6100,7 @@
           <w:color w:val="1B365D"/>
           <w:sz w:val="21"/>
         </w:rPr>
-        <w:t>«¿Le parece si visitamos el Bosque de las Orquídeas y elegimos juntos el lugar?»</w:t>
+        <w:t>"¿Le parece si visitamos el Bosque de las Orquídeas y elegimos juntos el lugar?"</w:t>
       </w:r>
     </w:p>
     <w:p>
@@ -6130,7 +6130,7 @@
           <w:color w:val="2C3E50"/>
           <w:sz w:val="20"/>
         </w:rPr>
-        <w:t>«¿Y después de 3 años?» → «La urna ya se habrá integrado a la tierra, como era el deseo. El nombre pasa a la placa memorial del monumento, que queda para siempre en el jardín.»</w:t>
+        <w:t>"¿Y después de 3 años?" → "La urna ya se habrá integrado a la tierra, como era el deseo. El nombre pasa a la placa memorial del monumento, que queda para siempre en el jardín."</w:t>
       </w:r>
     </w:p>
     <w:tbl>
@@ -6817,7 +6817,7 @@
                 <w:color w:val="2C3E50"/>
                 <w:sz w:val="21"/>
               </w:rPr>
-              <w:t>«Su compañero fue parte de la familia, y merece una despedida a la altura. En nuestro Jardín de Mascotas descansa con su nombre, en un lugar verde donde ustedes pueden volver a recordarlo. Y con la placa memorial, su nombre queda para siempre en el monumento del jardín.»</w:t>
+              <w:t>"Su compañero fue parte de la familia, y merece una despedida a la altura. En nuestro Jardín de Mascotas descansa con su nombre, en un lugar verde donde ustedes pueden volver a recordarlo. Y con la placa memorial, su nombre queda para siempre en el monumento del jardín."</w:t>
             </w:r>
           </w:p>
         </w:tc>
@@ -6948,7 +6948,7 @@
           <w:color w:val="1B365D"/>
           <w:sz w:val="21"/>
         </w:rPr>
-        <w:t>«¿Prefieren la opción con cremación incluida, para resolver todo en un solo paso?»</w:t>
+        <w:t>"¿Prefieren la opción con cremación incluida, para resolver todo en un solo paso?"</w:t>
       </w:r>
     </w:p>
     <w:p>
@@ -6978,7 +6978,7 @@
           <w:color w:val="2C3E50"/>
           <w:sz w:val="20"/>
         </w:rPr>
-        <w:t>«Es solo una mascota.» → No discuta el vínculo de la familia. Si el cliente minimiza, respete y ofrezca la información por escrito para que decida con calma.</w:t>
+        <w:t>"Es solo una mascota." → No discuta el vínculo de la familia. Si el cliente minimiza, respete y ofrezca la información por escrito para que decida con calma.</w:t>
       </w:r>
     </w:p>
     <w:tbl>
@@ -7459,7 +7459,7 @@
                 <w:color w:val="2C3E50"/>
                 <w:sz w:val="19"/>
               </w:rPr>
-              <w:t>Si un cliente muestra interés, registre su contacto como «interesado Ceremonial».</w:t>
+              <w:t>Si un cliente muestra interés, registre su contacto como "interesado Ceremonial".</w:t>
             </w:r>
           </w:p>
         </w:tc>
@@ -7531,7 +7531,7 @@
                 <w:color w:val="2C3E50"/>
                 <w:sz w:val="21"/>
               </w:rPr>
-              <w:t>«Estamos preparando un nuevo jardín con una ceremonia de agua muy especial. Si le interesa, con gusto le aviso apenas esté disponible.»</w:t>
+              <w:t>"Estamos preparando un nuevo jardín con una ceremonia de agua muy especial. Si le interesa, con gusto le aviso apenas esté disponible."</w:t>
             </w:r>
           </w:p>
         </w:tc>
@@ -8348,7 +8348,7 @@
                 <w:color w:val="2C3E50"/>
                 <w:sz w:val="21"/>
               </w:rPr>
-              <w:t>«Con el Supremo Plus su familia no tendrá que coordinar nada: el servicio funerario, la cremación y el lugar donde descansarán las cenizas quedan resueltos en un solo contrato, para dos personas y para siempre.»</w:t>
+              <w:t>"Con el Supremo Plus su familia no tendrá que coordinar nada: el servicio funerario, la cremación y el lugar donde descansarán las cenizas quedan resueltos en un solo contrato, para dos personas y para siempre."</w:t>
             </w:r>
           </w:p>
         </w:tc>
@@ -8479,7 +8479,7 @@
           <w:color w:val="1B365D"/>
           <w:sz w:val="21"/>
         </w:rPr>
-        <w:t>«¿Aprovechamos el precio de noviembre y elegimos hoy la ubicación?»</w:t>
+        <w:t>"¿Aprovechamos el precio de noviembre y elegimos hoy la ubicación?"</w:t>
       </w:r>
     </w:p>
     <w:p>
@@ -8509,7 +8509,7 @@
           <w:color w:val="2C3E50"/>
           <w:sz w:val="20"/>
         </w:rPr>
-        <w:t>«Es una inversión alta.» → «Incluye todo para dos personas: funeral, dos cremaciones y el columbario permanente. Y puede pagarse en hasta 120 meses.»</w:t>
+        <w:t>"Es una inversión alta." → "Incluye todo para dos personas: funeral, dos cremaciones y el columbario permanente. Y puede pagarse en hasta 120 meses."</w:t>
       </w:r>
     </w:p>
     <w:tbl>
@@ -9062,7 +9062,7 @@
                 <w:color w:val="2C3E50"/>
                 <w:sz w:val="21"/>
               </w:rPr>
-              <w:t>«Las cenizas de su ser querido merecen un lugar propio y permanente. En El Hogar de las Memorias, el columbario de mármol o cristal guarda hasta dos urnas en un espacio sereno, donde la familia siempre podrá volver.»</w:t>
+              <w:t>"Las cenizas de su ser querido merecen un lugar propio y permanente. En El Hogar de las Memorias, el columbario de mármol o cristal guarda hasta dos urnas en un espacio sereno, donde la familia siempre podrá volver."</w:t>
             </w:r>
           </w:p>
         </w:tc>
@@ -9193,7 +9193,7 @@
           <w:color w:val="1B365D"/>
           <w:sz w:val="21"/>
         </w:rPr>
-        <w:t>«¿Visitamos El Hogar de las Memorias para que elija la fila y el nivel?»</w:t>
+        <w:t>"¿Visitamos El Hogar de las Memorias para que elija la fila y el nivel?"</w:t>
       </w:r>
     </w:p>
     <w:p>
@@ -9223,7 +9223,7 @@
           <w:color w:val="2C3E50"/>
           <w:sz w:val="20"/>
         </w:rPr>
-        <w:t>«Ya tengo las cenizas en casa.» → «Es natural tenerlas cerca. En el columbario quedan protegidas para siempre y toda la familia puede visitarlas.»</w:t>
+        <w:t>"Ya tengo las cenizas en casa." → "Es natural tenerlas cerca. En el columbario quedan protegidas para siempre y toda la familia puede visitarlas."</w:t>
       </w:r>
     </w:p>
     <w:tbl>
@@ -9776,7 +9776,7 @@
                 <w:color w:val="2C3E50"/>
                 <w:sz w:val="21"/>
               </w:rPr>
-              <w:t>«El ónix es una piedra natural única: su luz y sus tonos cálidos hacen de cada espacio un lugar de paz. Es un homenaje distinto, a la altura de quien usted ama.»</w:t>
+              <w:t>"El ónix es una piedra natural única: su luz y sus tonos cálidos hacen de cada espacio un lugar de paz. Es un homenaje distinto, a la altura de quien usted ama."</w:t>
             </w:r>
           </w:p>
         </w:tc>
@@ -9881,7 +9881,7 @@
           <w:color w:val="1B365D"/>
           <w:sz w:val="21"/>
         </w:rPr>
-        <w:t>«¿Le muestro el columbario de ónix para que vea la piedra en persona?»</w:t>
+        <w:t>"¿Le muestro el columbario de ónix para que vea la piedra en persona?"</w:t>
       </w:r>
     </w:p>
     <w:p>
@@ -9911,7 +9911,7 @@
           <w:color w:val="2C3E50"/>
           <w:sz w:val="20"/>
         </w:rPr>
-        <w:t>«Hay opciones más baratas.» → «Sí, y con gusto se las muestro. El ónix es para quien busca algo único: una piedra natural que no se repite.»</w:t>
+        <w:t>"Hay opciones más baratas." → "Sí, y con gusto se las muestro. El ónix es para quien busca algo único: una piedra natural que no se repite."</w:t>
       </w:r>
     </w:p>
     <w:tbl>
@@ -10464,7 +10464,7 @@
                 <w:color w:val="2C3E50"/>
                 <w:sz w:val="21"/>
               </w:rPr>
-              <w:t>«Este columbario es una obra de arte de fe: la tapa de ónix con imagen religiosa convierte el lugar de descanso de su familia en un espacio de oración y contemplación, para generaciones.»</w:t>
+              <w:t>"Este columbario es una obra de arte de fe: la tapa de ónix con imagen religiosa convierte el lugar de descanso de su familia en un espacio de oración y contemplación, para generaciones."</w:t>
             </w:r>
           </w:p>
         </w:tc>
@@ -10569,7 +10569,7 @@
           <w:color w:val="1B365D"/>
           <w:sz w:val="21"/>
         </w:rPr>
-        <w:t>«¿Reservamos hoy el espacio familiar con el precio de noviembre?»</w:t>
+        <w:t>"¿Reservamos hoy el espacio familiar con el precio de noviembre?"</w:t>
       </w:r>
     </w:p>
     <w:p>
@@ -10599,7 +10599,7 @@
           <w:color w:val="2C3E50"/>
           <w:sz w:val="20"/>
         </w:rPr>
-        <w:t>«Es muy caro.» → «Es un legado para cuatro personas, para siempre, y puede pagarse en hasta 120 meses. Es la opción más exclusiva del portafolio.»</w:t>
+        <w:t>"Es muy caro." → "Es un legado para cuatro personas, para siempre, y puede pagarse en hasta 120 meses. Es la opción más exclusiva del portafolio."</w:t>
       </w:r>
     </w:p>
     <w:tbl>
@@ -11204,7 +11204,7 @@
                 <w:color w:val="2C3E50"/>
                 <w:sz w:val="21"/>
               </w:rPr>
-              <w:t>«Bella Vista resuelve en un solo paso la cremación y el lugar de descanso: un columbario de cristal en nuestro mausoleo vertical, para dos o cuatro personas, con todo el proceso incluido.»</w:t>
+              <w:t>"Bella Vista resuelve en un solo paso la cremación y el lugar de descanso: un columbario de cristal en nuestro mausoleo vertical, para dos o cuatro personas, con todo el proceso incluido."</w:t>
             </w:r>
           </w:p>
         </w:tc>
@@ -11309,7 +11309,7 @@
           <w:color w:val="1B365D"/>
           <w:sz w:val="21"/>
         </w:rPr>
-        <w:t>«¿Aprovechamos el precio de noviembre y lo dejamos resuelto hoy?»</w:t>
+        <w:t>"¿Aprovechamos el precio de noviembre y lo dejamos resuelto hoy?"</w:t>
       </w:r>
     </w:p>
     <w:p>
@@ -11339,7 +11339,7 @@
           <w:color w:val="2C3E50"/>
           <w:sz w:val="20"/>
         </w:rPr>
-        <w:t>«Prefiero un jardín.» → «Perfecto, también tenemos los Jardines de Cenizas. Bella Vista es para quien prefiere un columbario, con la cremación ya incluida.»</w:t>
+        <w:t>"Prefiero un jardín." → "Perfecto, también tenemos los Jardines de Cenizas. Bella Vista es para quien prefiere un columbario, con la cremación ya incluida."</w:t>
       </w:r>
     </w:p>
     <w:tbl>
@@ -11465,7 +11465,7 @@
           <w:color w:val="7A8794"/>
           <w:sz w:val="22"/>
         </w:rPr>
-        <w:t>Una objeción no es un «no»: es una duda que aún no resolvimos.</w:t>
+        <w:t>Una objeción no es un "no": es una duda que aún no resolvimos.</w:t>
       </w:r>
     </w:p>
     <w:p>
@@ -11560,7 +11560,7 @@
                 <w:color w:val="FFFFFF"/>
                 <w:sz w:val="22"/>
               </w:rPr>
-              <w:t>1.  «No quiero pensar en eso, es de mala suerte.»</w:t>
+              <w:t>1.  "No quiero pensar en eso, es de mala suerte."</w:t>
             </w:r>
           </w:p>
         </w:tc>
@@ -11637,7 +11637,7 @@
                 <w:color w:val="2C3E50"/>
                 <w:sz w:val="20"/>
               </w:rPr>
-              <w:t>«Entiendo, a nadie le gusta hablar de este tema.»</w:t>
+              <w:t>"Entiendo, a nadie le gusta hablar de este tema."</w:t>
             </w:r>
           </w:p>
         </w:tc>
@@ -11791,7 +11791,7 @@
                 <w:color w:val="2C3E50"/>
                 <w:sz w:val="20"/>
               </w:rPr>
-              <w:t>«¿Le dejo la información para que la conversen en casa?»</w:t>
+              <w:t>"¿Le dejo la información para que la conversen en casa?"</w:t>
             </w:r>
           </w:p>
         </w:tc>
@@ -11838,7 +11838,7 @@
                 <w:color w:val="FFFFFF"/>
                 <w:sz w:val="22"/>
               </w:rPr>
-              <w:t>2.  «Soy católico, la cremación no está permitida.»</w:t>
+              <w:t>2.  "Soy católico, la cremación no está permitida."</w:t>
             </w:r>
           </w:p>
         </w:tc>
@@ -11915,7 +11915,7 @@
                 <w:color w:val="2C3E50"/>
                 <w:sz w:val="20"/>
               </w:rPr>
-              <w:t>«Su fe es muy importante y la respetamos.»</w:t>
+              <w:t>"Su fe es muy importante y la respetamos."</w:t>
             </w:r>
           </w:p>
         </w:tc>
@@ -12069,7 +12069,7 @@
                 <w:color w:val="2C3E50"/>
                 <w:sz w:val="20"/>
               </w:rPr>
-              <w:t>«¿Le gustaría conocer el jardín y ver cómo es el lugar?»</w:t>
+              <w:t>"¿Le gustaría conocer el jardín y ver cómo es el lugar?"</w:t>
             </w:r>
           </w:p>
         </w:tc>
@@ -12116,7 +12116,7 @@
                 <w:color w:val="FFFFFF"/>
                 <w:sz w:val="22"/>
               </w:rPr>
-              <w:t>3.  «Prefiero la sepultura tradicional.»</w:t>
+              <w:t>3.  "Prefiero la sepultura tradicional."</w:t>
             </w:r>
           </w:p>
         </w:tc>
@@ -12193,7 +12193,7 @@
                 <w:color w:val="2C3E50"/>
                 <w:sz w:val="20"/>
               </w:rPr>
-              <w:t>«Es una tradición muy valiosa.»</w:t>
+              <w:t>"Es una tradición muy valiosa."</w:t>
             </w:r>
           </w:p>
         </w:tc>
@@ -12347,7 +12347,7 @@
                 <w:color w:val="2C3E50"/>
                 <w:sz w:val="20"/>
               </w:rPr>
-              <w:t>«¿Le muestro la diferencia de inversión entre ambas opciones?»</w:t>
+              <w:t>"¿Le muestro la diferencia de inversión entre ambas opciones?"</w:t>
             </w:r>
           </w:p>
         </w:tc>
@@ -12394,7 +12394,7 @@
                 <w:color w:val="FFFFFF"/>
                 <w:sz w:val="22"/>
               </w:rPr>
-              <w:t>4.  «Está caro.»</w:t>
+              <w:t>4.  "Está caro."</w:t>
             </w:r>
           </w:p>
         </w:tc>
@@ -12471,7 +12471,7 @@
                 <w:color w:val="2C3E50"/>
                 <w:sz w:val="20"/>
               </w:rPr>
-              <w:t>«Comprendo, es una inversión.»</w:t>
+              <w:t>"Comprendo, es una inversión."</w:t>
             </w:r>
           </w:p>
         </w:tc>
@@ -12625,7 +12625,7 @@
                 <w:color w:val="2C3E50"/>
                 <w:sz w:val="20"/>
               </w:rPr>
-              <w:t>«¿Le resulta más cómodo pagarlo en cuotas mensuales?»</w:t>
+              <w:t>"¿Le resulta más cómodo pagarlo en cuotas mensuales?"</w:t>
             </w:r>
           </w:p>
         </w:tc>
@@ -12672,7 +12672,7 @@
                 <w:color w:val="FFFFFF"/>
                 <w:sz w:val="22"/>
               </w:rPr>
-              <w:t>5.  «Tengo que hablarlo con mi familia.»</w:t>
+              <w:t>5.  "Tengo que hablarlo con mi familia."</w:t>
             </w:r>
           </w:p>
         </w:tc>
@@ -12749,7 +12749,7 @@
                 <w:color w:val="2C3E50"/>
                 <w:sz w:val="20"/>
               </w:rPr>
-              <w:t>«Claro, es una decisión de familia.»</w:t>
+              <w:t>"Claro, es una decisión de familia."</w:t>
             </w:r>
           </w:p>
         </w:tc>
@@ -12903,7 +12903,7 @@
                 <w:color w:val="2C3E50"/>
                 <w:sz w:val="20"/>
               </w:rPr>
-              <w:t>«¿Puedo llamarle el [día] para ver si quedó alguna pregunta?»</w:t>
+              <w:t>"¿Puedo llamarle el [día] para ver si quedó alguna pregunta?"</w:t>
             </w:r>
           </w:p>
         </w:tc>
@@ -12950,7 +12950,7 @@
                 <w:color w:val="FFFFFF"/>
                 <w:sz w:val="22"/>
               </w:rPr>
-              <w:t>6.  «Prefiero tener las cenizas en casa.»</w:t>
+              <w:t>6.  "Prefiero tener las cenizas en casa."</w:t>
             </w:r>
           </w:p>
         </w:tc>
@@ -13027,7 +13027,7 @@
                 <w:color w:val="2C3E50"/>
                 <w:sz w:val="20"/>
               </w:rPr>
-              <w:t>«Es natural querer tenerlas cerca.»</w:t>
+              <w:t>"Es natural querer tenerlas cerca."</w:t>
             </w:r>
           </w:p>
         </w:tc>
@@ -13181,7 +13181,7 @@
                 <w:color w:val="2C3E50"/>
                 <w:sz w:val="20"/>
               </w:rPr>
-              <w:t>«¿Le gustaría visitar el jardín antes de decidir?»</w:t>
+              <w:t>"¿Le gustaría visitar el jardín antes de decidir?"</w:t>
             </w:r>
           </w:p>
         </w:tc>
@@ -13228,7 +13228,7 @@
                 <w:color w:val="FFFFFF"/>
                 <w:sz w:val="22"/>
               </w:rPr>
-              <w:t>7.  «¿Por qué pagar mantenimiento cada año?»</w:t>
+              <w:t>7.  "¿Por qué pagar mantenimiento cada año?"</w:t>
             </w:r>
           </w:p>
         </w:tc>
@@ -13305,7 +13305,7 @@
                 <w:color w:val="2C3E50"/>
                 <w:sz w:val="20"/>
               </w:rPr>
-              <w:t>«Es una pregunta muy válida.»</w:t>
+              <w:t>"Es una pregunta muy válida."</w:t>
             </w:r>
           </w:p>
         </w:tc>
@@ -13459,7 +13459,7 @@
                 <w:color w:val="2C3E50"/>
                 <w:sz w:val="20"/>
               </w:rPr>
-              <w:t>«¿Le explico qué incluye el cuidado del jardín?»</w:t>
+              <w:t>"¿Le explico qué incluye el cuidado del jardín?"</w:t>
             </w:r>
           </w:p>
         </w:tc>
@@ -13506,7 +13506,7 @@
                 <w:color w:val="FFFFFF"/>
                 <w:sz w:val="22"/>
               </w:rPr>
-              <w:t>8.  «No confío en estos planes.»</w:t>
+              <w:t>8.  "No confío en estos planes."</w:t>
             </w:r>
           </w:p>
         </w:tc>
@@ -13583,7 +13583,7 @@
                 <w:color w:val="2C3E50"/>
                 <w:sz w:val="20"/>
               </w:rPr>
-              <w:t>«Es una preocupación válida.»</w:t>
+              <w:t>"Es una preocupación válida."</w:t>
             </w:r>
           </w:p>
         </w:tc>
@@ -13737,7 +13737,7 @@
                 <w:color w:val="2C3E50"/>
                 <w:sz w:val="20"/>
               </w:rPr>
-              <w:t>«¿Agendamos una visita sin compromiso?»</w:t>
+              <w:t>"¿Agendamos una visita sin compromiso?"</w:t>
             </w:r>
           </w:p>
         </w:tc>
@@ -18828,7 +18828,7 @@
                 <w:color w:val="1B365D"/>
                 <w:sz w:val="19"/>
               </w:rPr>
-              <w:t>Presentación «Jardines de Cenizas»</w:t>
+              <w:t>Presentación "Jardines de Cenizas"</w:t>
             </w:r>
           </w:p>
         </w:tc>

</xml_diff>

<commit_message>
Comisiones: Política 2026 aprobada (1 venta 8%, 2 ventas 10%, 3+ 12%)
Reemplaza la comisión única de 8% en el playbook (docx, Google Docs, pptx
horizontal y vertical), la figura de comisiones y la pestaña de comisiones
de la Ficha Técnica.

Co-Authored-By: Claude Opus 5.5 <noreply@anthropic.com>
Claude-Session: https://claude.ai/code/session_0111i7vn9WWo4QxCQbucWbrF
</commit_message>
<xml_diff>
--- a/playbook/salida/Playbook_Comercial_Cremacion_Vangrupo.docx
+++ b/playbook/salida/Playbook_Comercial_Cremacion_Vangrupo.docx
@@ -285,7 +285,7 @@
                 <w:color w:val="2C3E50"/>
                 <w:sz w:val="20"/>
               </w:rPr>
-              <w:t>Política de comisiones: 8% en todos los productos. Confirmar con el Gerente Comercial antes de aplicar.</w:t>
+              <w:t>Política de comisiones 2026 (aprobada): 1 venta en el mes = 8%, 2 ventas = 10%, 3 o más = 12% sobre la facturación.</w:t>
             </w:r>
           </w:p>
           <w:p>
@@ -830,7 +830,7 @@
                 <w:color w:val="1B365D"/>
                 <w:sz w:val="24"/>
               </w:rPr>
-              <w:t>Política de comisiones</w:t>
+              <w:t>Política de comisiones 2026</w:t>
             </w:r>
           </w:p>
         </w:tc>
@@ -16649,7 +16649,7 @@
           <w:color w:val="1B365D"/>
           <w:sz w:val="48"/>
         </w:rPr>
-        <w:t>Política de comisiones</w:t>
+        <w:t>Política de comisiones 2026</w:t>
       </w:r>
     </w:p>
     <w:p>
@@ -16706,7 +16706,7 @@
                 <w:color w:val="B8860B"/>
                 <w:sz w:val="18"/>
               </w:rPr>
-              <w:t>COMISIÓN ÚNICA DE 8%</w:t>
+              <w:t>COMISIÓN POR CANTIDAD DE VENTAS: 8% · 10% · 12%</w:t>
             </w:r>
           </w:p>
           <w:p>
@@ -16721,7 +16721,538 @@
                 <w:color w:val="2C3E50"/>
                 <w:sz w:val="21"/>
               </w:rPr>
-              <w:t>Todos los productos comisionan 8% sobre el precio sin IVA. Confirmar con la Gerencia Comercial antes de aplicar.</w:t>
+              <w:t>Política de comisiones 2026, aprobada. El porcentaje depende de cuántas ventas de cremación cierra el asesor en el mes (cualquier producto: Solución Modular, jardines o columbarios) y se aplica sobre toda la facturación del mes, sin IVA.</w:t>
+            </w:r>
+          </w:p>
+        </w:tc>
+      </w:tr>
+    </w:tbl>
+    <w:p>
+      <w:pPr>
+        <w:spacing w:before="0" w:after="80" w:line="276" w:lineRule="auto"/>
+      </w:pPr>
+    </w:p>
+    <w:tbl>
+      <w:tblPr>
+        <w:tblW w:type="auto" w:w="0"/>
+        <w:jc w:val="center"/>
+        <w:tblLayout w:type="fixed"/>
+        <w:tblLook w:firstColumn="1" w:firstRow="1" w:lastColumn="0" w:lastRow="0" w:noHBand="0" w:noVBand="1" w:val="04A0"/>
+      </w:tblPr>
+      <w:tblGrid>
+        <w:gridCol w:w="2436"/>
+        <w:gridCol w:w="2436"/>
+        <w:gridCol w:w="2436"/>
+        <w:gridCol w:w="2436"/>
+      </w:tblGrid>
+      <w:tr>
+        <w:tc>
+          <w:tcPr>
+            <w:tcW w:type="dxa" w:w="2268"/>
+            <w:tcMar>
+              <w:top w:w="124" w:type="dxa"/>
+              <w:left w:w="124" w:type="dxa"/>
+              <w:bottom w:w="124" w:type="dxa"/>
+              <w:right w:w="124" w:type="dxa"/>
+            </w:tcMar>
+            <w:shd w:val="clear" w:color="auto" w:fill="1B365D"/>
+          </w:tcPr>
+          <w:p>
+            <w:pPr>
+              <w:spacing w:after="40"/>
+            </w:pPr>
+            <w:r>
+              <w:rPr>
+                <w:rFonts w:ascii="Montserrat" w:hAnsi="Montserrat" w:eastAsia="Montserrat"/>
+                <w:b/>
+                <w:i w:val="0"/>
+                <w:color w:val="FFFFFF"/>
+                <w:sz w:val="18"/>
+              </w:rPr>
+              <w:t>Ventas en el mes</w:t>
+            </w:r>
+          </w:p>
+        </w:tc>
+        <w:tc>
+          <w:tcPr>
+            <w:tcW w:type="dxa" w:w="1701"/>
+            <w:tcMar>
+              <w:top w:w="124" w:type="dxa"/>
+              <w:left w:w="124" w:type="dxa"/>
+              <w:bottom w:w="124" w:type="dxa"/>
+              <w:right w:w="124" w:type="dxa"/>
+            </w:tcMar>
+            <w:shd w:val="clear" w:color="auto" w:fill="1B365D"/>
+          </w:tcPr>
+          <w:p>
+            <w:pPr>
+              <w:spacing w:after="40"/>
+            </w:pPr>
+            <w:r>
+              <w:rPr>
+                <w:rFonts w:ascii="Montserrat" w:hAnsi="Montserrat" w:eastAsia="Montserrat"/>
+                <w:b/>
+                <w:i w:val="0"/>
+                <w:color w:val="FFFFFF"/>
+                <w:sz w:val="18"/>
+              </w:rPr>
+              <w:t>% comisión</w:t>
+            </w:r>
+          </w:p>
+        </w:tc>
+        <w:tc>
+          <w:tcPr>
+            <w:tcW w:type="dxa" w:w="3118"/>
+            <w:tcMar>
+              <w:top w:w="124" w:type="dxa"/>
+              <w:left w:w="124" w:type="dxa"/>
+              <w:bottom w:w="124" w:type="dxa"/>
+              <w:right w:w="124" w:type="dxa"/>
+            </w:tcMar>
+            <w:shd w:val="clear" w:color="auto" w:fill="1B365D"/>
+          </w:tcPr>
+          <w:p>
+            <w:pPr>
+              <w:spacing w:after="40"/>
+            </w:pPr>
+            <w:r>
+              <w:rPr>
+                <w:rFonts w:ascii="Montserrat" w:hAnsi="Montserrat" w:eastAsia="Montserrat"/>
+                <w:b/>
+                <w:i w:val="0"/>
+                <w:color w:val="FFFFFF"/>
+                <w:sz w:val="18"/>
+              </w:rPr>
+              <w:t>Ejemplo: facturación (Solución Modular)</w:t>
+            </w:r>
+          </w:p>
+        </w:tc>
+        <w:tc>
+          <w:tcPr>
+            <w:tcW w:type="dxa" w:w="2551"/>
+            <w:tcMar>
+              <w:top w:w="124" w:type="dxa"/>
+              <w:left w:w="124" w:type="dxa"/>
+              <w:bottom w:w="124" w:type="dxa"/>
+              <w:right w:w="124" w:type="dxa"/>
+            </w:tcMar>
+            <w:shd w:val="clear" w:color="auto" w:fill="1B365D"/>
+          </w:tcPr>
+          <w:p>
+            <w:pPr>
+              <w:spacing w:after="40"/>
+            </w:pPr>
+            <w:r>
+              <w:rPr>
+                <w:rFonts w:ascii="Montserrat" w:hAnsi="Montserrat" w:eastAsia="Montserrat"/>
+                <w:b/>
+                <w:i w:val="0"/>
+                <w:color w:val="FFFFFF"/>
+                <w:sz w:val="18"/>
+              </w:rPr>
+              <w:t>Comisión del ejemplo</w:t>
+            </w:r>
+          </w:p>
+        </w:tc>
+      </w:tr>
+      <w:tr>
+        <w:tc>
+          <w:tcPr>
+            <w:tcW w:type="dxa" w:w="2268"/>
+            <w:tcMar>
+              <w:top w:w="124" w:type="dxa"/>
+              <w:left w:w="124" w:type="dxa"/>
+              <w:bottom w:w="124" w:type="dxa"/>
+              <w:right w:w="124" w:type="dxa"/>
+            </w:tcMar>
+            <w:shd w:val="clear" w:color="auto" w:fill="FFFFFF"/>
+            <w:tcBorders>
+              <w:top w:val="nil"/>
+              <w:left w:val="nil"/>
+              <w:bottom w:val="single" w:sz="4" w:color="D9DEE4"/>
+              <w:right w:val="nil"/>
+            </w:tcBorders>
+          </w:tcPr>
+          <w:p>
+            <w:pPr>
+              <w:spacing w:after="40"/>
+            </w:pPr>
+            <w:r>
+              <w:rPr>
+                <w:rFonts w:ascii="Montserrat" w:hAnsi="Montserrat" w:eastAsia="Montserrat"/>
+                <w:b/>
+                <w:i w:val="0"/>
+                <w:color w:val="1B365D"/>
+                <w:sz w:val="19"/>
+              </w:rPr>
+              <w:t>1 venta</w:t>
+            </w:r>
+          </w:p>
+        </w:tc>
+        <w:tc>
+          <w:tcPr>
+            <w:tcW w:type="dxa" w:w="1701"/>
+            <w:tcMar>
+              <w:top w:w="124" w:type="dxa"/>
+              <w:left w:w="124" w:type="dxa"/>
+              <w:bottom w:w="124" w:type="dxa"/>
+              <w:right w:w="124" w:type="dxa"/>
+            </w:tcMar>
+            <w:shd w:val="clear" w:color="auto" w:fill="FFFFFF"/>
+            <w:tcBorders>
+              <w:top w:val="nil"/>
+              <w:left w:val="nil"/>
+              <w:bottom w:val="single" w:sz="4" w:color="D9DEE4"/>
+              <w:right w:val="nil"/>
+            </w:tcBorders>
+          </w:tcPr>
+          <w:p>
+            <w:pPr>
+              <w:spacing w:after="40"/>
+            </w:pPr>
+            <w:r>
+              <w:rPr>
+                <w:rFonts w:ascii="Montserrat" w:hAnsi="Montserrat" w:eastAsia="Montserrat"/>
+                <w:b w:val="0"/>
+                <w:i w:val="0"/>
+                <w:color w:val="2C3E50"/>
+                <w:sz w:val="19"/>
+              </w:rPr>
+              <w:t>8%</w:t>
+            </w:r>
+          </w:p>
+        </w:tc>
+        <w:tc>
+          <w:tcPr>
+            <w:tcW w:type="dxa" w:w="3118"/>
+            <w:tcMar>
+              <w:top w:w="124" w:type="dxa"/>
+              <w:left w:w="124" w:type="dxa"/>
+              <w:bottom w:w="124" w:type="dxa"/>
+              <w:right w:w="124" w:type="dxa"/>
+            </w:tcMar>
+            <w:shd w:val="clear" w:color="auto" w:fill="FFFFFF"/>
+            <w:tcBorders>
+              <w:top w:val="nil"/>
+              <w:left w:val="nil"/>
+              <w:bottom w:val="single" w:sz="4" w:color="D9DEE4"/>
+              <w:right w:val="nil"/>
+            </w:tcBorders>
+          </w:tcPr>
+          <w:p>
+            <w:pPr>
+              <w:spacing w:after="40"/>
+            </w:pPr>
+            <w:r>
+              <w:rPr>
+                <w:rFonts w:ascii="Montserrat" w:hAnsi="Montserrat" w:eastAsia="Montserrat"/>
+                <w:b w:val="0"/>
+                <w:i w:val="0"/>
+                <w:color w:val="2C3E50"/>
+                <w:sz w:val="19"/>
+              </w:rPr>
+              <w:t>US$ 885</w:t>
+            </w:r>
+          </w:p>
+        </w:tc>
+        <w:tc>
+          <w:tcPr>
+            <w:tcW w:type="dxa" w:w="2551"/>
+            <w:tcMar>
+              <w:top w:w="124" w:type="dxa"/>
+              <w:left w:w="124" w:type="dxa"/>
+              <w:bottom w:w="124" w:type="dxa"/>
+              <w:right w:w="124" w:type="dxa"/>
+            </w:tcMar>
+            <w:shd w:val="clear" w:color="auto" w:fill="FFFFFF"/>
+            <w:tcBorders>
+              <w:top w:val="nil"/>
+              <w:left w:val="nil"/>
+              <w:bottom w:val="single" w:sz="4" w:color="D9DEE4"/>
+              <w:right w:val="nil"/>
+            </w:tcBorders>
+          </w:tcPr>
+          <w:p>
+            <w:pPr>
+              <w:spacing w:after="40"/>
+            </w:pPr>
+            <w:r>
+              <w:rPr>
+                <w:rFonts w:ascii="Montserrat" w:hAnsi="Montserrat" w:eastAsia="Montserrat"/>
+                <w:b w:val="0"/>
+                <w:i w:val="0"/>
+                <w:color w:val="2C3E50"/>
+                <w:sz w:val="19"/>
+              </w:rPr>
+              <w:t>US$ 70,80</w:t>
+            </w:r>
+          </w:p>
+        </w:tc>
+      </w:tr>
+      <w:tr>
+        <w:tc>
+          <w:tcPr>
+            <w:tcW w:type="dxa" w:w="2268"/>
+            <w:tcMar>
+              <w:top w:w="124" w:type="dxa"/>
+              <w:left w:w="124" w:type="dxa"/>
+              <w:bottom w:w="124" w:type="dxa"/>
+              <w:right w:w="124" w:type="dxa"/>
+            </w:tcMar>
+            <w:shd w:val="clear" w:color="auto" w:fill="F4F7FA"/>
+            <w:tcBorders>
+              <w:top w:val="nil"/>
+              <w:left w:val="nil"/>
+              <w:bottom w:val="single" w:sz="4" w:color="D9DEE4"/>
+              <w:right w:val="nil"/>
+            </w:tcBorders>
+          </w:tcPr>
+          <w:p>
+            <w:pPr>
+              <w:spacing w:after="40"/>
+            </w:pPr>
+            <w:r>
+              <w:rPr>
+                <w:rFonts w:ascii="Montserrat" w:hAnsi="Montserrat" w:eastAsia="Montserrat"/>
+                <w:b/>
+                <w:i w:val="0"/>
+                <w:color w:val="1B365D"/>
+                <w:sz w:val="19"/>
+              </w:rPr>
+              <w:t>2 ventas</w:t>
+            </w:r>
+          </w:p>
+        </w:tc>
+        <w:tc>
+          <w:tcPr>
+            <w:tcW w:type="dxa" w:w="1701"/>
+            <w:tcMar>
+              <w:top w:w="124" w:type="dxa"/>
+              <w:left w:w="124" w:type="dxa"/>
+              <w:bottom w:w="124" w:type="dxa"/>
+              <w:right w:w="124" w:type="dxa"/>
+            </w:tcMar>
+            <w:shd w:val="clear" w:color="auto" w:fill="F4F7FA"/>
+            <w:tcBorders>
+              <w:top w:val="nil"/>
+              <w:left w:val="nil"/>
+              <w:bottom w:val="single" w:sz="4" w:color="D9DEE4"/>
+              <w:right w:val="nil"/>
+            </w:tcBorders>
+          </w:tcPr>
+          <w:p>
+            <w:pPr>
+              <w:spacing w:after="40"/>
+            </w:pPr>
+            <w:r>
+              <w:rPr>
+                <w:rFonts w:ascii="Montserrat" w:hAnsi="Montserrat" w:eastAsia="Montserrat"/>
+                <w:b w:val="0"/>
+                <w:i w:val="0"/>
+                <w:color w:val="2C3E50"/>
+                <w:sz w:val="19"/>
+              </w:rPr>
+              <w:t>10%</w:t>
+            </w:r>
+          </w:p>
+        </w:tc>
+        <w:tc>
+          <w:tcPr>
+            <w:tcW w:type="dxa" w:w="3118"/>
+            <w:tcMar>
+              <w:top w:w="124" w:type="dxa"/>
+              <w:left w:w="124" w:type="dxa"/>
+              <w:bottom w:w="124" w:type="dxa"/>
+              <w:right w:w="124" w:type="dxa"/>
+            </w:tcMar>
+            <w:shd w:val="clear" w:color="auto" w:fill="F4F7FA"/>
+            <w:tcBorders>
+              <w:top w:val="nil"/>
+              <w:left w:val="nil"/>
+              <w:bottom w:val="single" w:sz="4" w:color="D9DEE4"/>
+              <w:right w:val="nil"/>
+            </w:tcBorders>
+          </w:tcPr>
+          <w:p>
+            <w:pPr>
+              <w:spacing w:after="40"/>
+            </w:pPr>
+            <w:r>
+              <w:rPr>
+                <w:rFonts w:ascii="Montserrat" w:hAnsi="Montserrat" w:eastAsia="Montserrat"/>
+                <w:b w:val="0"/>
+                <w:i w:val="0"/>
+                <w:color w:val="2C3E50"/>
+                <w:sz w:val="19"/>
+              </w:rPr>
+              <w:t>US$ 1.770</w:t>
+            </w:r>
+          </w:p>
+        </w:tc>
+        <w:tc>
+          <w:tcPr>
+            <w:tcW w:type="dxa" w:w="2551"/>
+            <w:tcMar>
+              <w:top w:w="124" w:type="dxa"/>
+              <w:left w:w="124" w:type="dxa"/>
+              <w:bottom w:w="124" w:type="dxa"/>
+              <w:right w:w="124" w:type="dxa"/>
+            </w:tcMar>
+            <w:shd w:val="clear" w:color="auto" w:fill="F4F7FA"/>
+            <w:tcBorders>
+              <w:top w:val="nil"/>
+              <w:left w:val="nil"/>
+              <w:bottom w:val="single" w:sz="4" w:color="D9DEE4"/>
+              <w:right w:val="nil"/>
+            </w:tcBorders>
+          </w:tcPr>
+          <w:p>
+            <w:pPr>
+              <w:spacing w:after="40"/>
+            </w:pPr>
+            <w:r>
+              <w:rPr>
+                <w:rFonts w:ascii="Montserrat" w:hAnsi="Montserrat" w:eastAsia="Montserrat"/>
+                <w:b w:val="0"/>
+                <w:i w:val="0"/>
+                <w:color w:val="2C3E50"/>
+                <w:sz w:val="19"/>
+              </w:rPr>
+              <w:t>US$ 177,00</w:t>
+            </w:r>
+          </w:p>
+        </w:tc>
+      </w:tr>
+      <w:tr>
+        <w:tc>
+          <w:tcPr>
+            <w:tcW w:type="dxa" w:w="2268"/>
+            <w:tcMar>
+              <w:top w:w="124" w:type="dxa"/>
+              <w:left w:w="124" w:type="dxa"/>
+              <w:bottom w:w="124" w:type="dxa"/>
+              <w:right w:w="124" w:type="dxa"/>
+            </w:tcMar>
+            <w:shd w:val="clear" w:color="auto" w:fill="FFFFFF"/>
+            <w:tcBorders>
+              <w:top w:val="nil"/>
+              <w:left w:val="nil"/>
+              <w:bottom w:val="single" w:sz="4" w:color="D9DEE4"/>
+              <w:right w:val="nil"/>
+            </w:tcBorders>
+          </w:tcPr>
+          <w:p>
+            <w:pPr>
+              <w:spacing w:after="40"/>
+            </w:pPr>
+            <w:r>
+              <w:rPr>
+                <w:rFonts w:ascii="Montserrat" w:hAnsi="Montserrat" w:eastAsia="Montserrat"/>
+                <w:b/>
+                <w:i w:val="0"/>
+                <w:color w:val="1B365D"/>
+                <w:sz w:val="19"/>
+              </w:rPr>
+              <w:t>3 ventas o más</w:t>
+            </w:r>
+          </w:p>
+        </w:tc>
+        <w:tc>
+          <w:tcPr>
+            <w:tcW w:type="dxa" w:w="1701"/>
+            <w:tcMar>
+              <w:top w:w="124" w:type="dxa"/>
+              <w:left w:w="124" w:type="dxa"/>
+              <w:bottom w:w="124" w:type="dxa"/>
+              <w:right w:w="124" w:type="dxa"/>
+            </w:tcMar>
+            <w:shd w:val="clear" w:color="auto" w:fill="FFFFFF"/>
+            <w:tcBorders>
+              <w:top w:val="nil"/>
+              <w:left w:val="nil"/>
+              <w:bottom w:val="single" w:sz="4" w:color="D9DEE4"/>
+              <w:right w:val="nil"/>
+            </w:tcBorders>
+          </w:tcPr>
+          <w:p>
+            <w:pPr>
+              <w:spacing w:after="40"/>
+            </w:pPr>
+            <w:r>
+              <w:rPr>
+                <w:rFonts w:ascii="Montserrat" w:hAnsi="Montserrat" w:eastAsia="Montserrat"/>
+                <w:b w:val="0"/>
+                <w:i w:val="0"/>
+                <w:color w:val="2C3E50"/>
+                <w:sz w:val="19"/>
+              </w:rPr>
+              <w:t>12%</w:t>
+            </w:r>
+          </w:p>
+        </w:tc>
+        <w:tc>
+          <w:tcPr>
+            <w:tcW w:type="dxa" w:w="3118"/>
+            <w:tcMar>
+              <w:top w:w="124" w:type="dxa"/>
+              <w:left w:w="124" w:type="dxa"/>
+              <w:bottom w:w="124" w:type="dxa"/>
+              <w:right w:w="124" w:type="dxa"/>
+            </w:tcMar>
+            <w:shd w:val="clear" w:color="auto" w:fill="FFFFFF"/>
+            <w:tcBorders>
+              <w:top w:val="nil"/>
+              <w:left w:val="nil"/>
+              <w:bottom w:val="single" w:sz="4" w:color="D9DEE4"/>
+              <w:right w:val="nil"/>
+            </w:tcBorders>
+          </w:tcPr>
+          <w:p>
+            <w:pPr>
+              <w:spacing w:after="40"/>
+            </w:pPr>
+            <w:r>
+              <w:rPr>
+                <w:rFonts w:ascii="Montserrat" w:hAnsi="Montserrat" w:eastAsia="Montserrat"/>
+                <w:b w:val="0"/>
+                <w:i w:val="0"/>
+                <w:color w:val="2C3E50"/>
+                <w:sz w:val="19"/>
+              </w:rPr>
+              <w:t>US$ 2.655</w:t>
+            </w:r>
+          </w:p>
+        </w:tc>
+        <w:tc>
+          <w:tcPr>
+            <w:tcW w:type="dxa" w:w="2551"/>
+            <w:tcMar>
+              <w:top w:w="124" w:type="dxa"/>
+              <w:left w:w="124" w:type="dxa"/>
+              <w:bottom w:w="124" w:type="dxa"/>
+              <w:right w:w="124" w:type="dxa"/>
+            </w:tcMar>
+            <w:shd w:val="clear" w:color="auto" w:fill="FFFFFF"/>
+            <w:tcBorders>
+              <w:top w:val="nil"/>
+              <w:left w:val="nil"/>
+              <w:bottom w:val="single" w:sz="4" w:color="D9DEE4"/>
+              <w:right w:val="nil"/>
+            </w:tcBorders>
+          </w:tcPr>
+          <w:p>
+            <w:pPr>
+              <w:spacing w:after="40"/>
+            </w:pPr>
+            <w:r>
+              <w:rPr>
+                <w:rFonts w:ascii="Montserrat" w:hAnsi="Montserrat" w:eastAsia="Montserrat"/>
+                <w:b w:val="0"/>
+                <w:i w:val="0"/>
+                <w:color w:val="2C3E50"/>
+                <w:sz w:val="19"/>
+              </w:rPr>
+              <w:t>US$ 318,60</w:t>
             </w:r>
           </w:p>
         </w:tc>
@@ -16740,7 +17271,7 @@
       <w:r>
         <w:drawing>
           <wp:inline xmlns:a="http://schemas.openxmlformats.org/drawingml/2006/main" xmlns:pic="http://schemas.openxmlformats.org/drawingml/2006/picture">
-            <wp:extent cx="6120000" cy="1989000"/>
+            <wp:extent cx="6120000" cy="1300500"/>
             <wp:docPr id="8" name="Picture 8"/>
             <wp:cNvGraphicFramePr>
               <a:graphicFrameLocks noChangeAspect="1"/>
@@ -16761,7 +17292,7 @@
                   <pic:spPr>
                     <a:xfrm>
                       <a:off x="0" y="0"/>
-                      <a:ext cx="6120000" cy="1989000"/>
+                      <a:ext cx="6120000" cy="1300500"/>
                     </a:xfrm>
                     <a:prstGeom prst="rect"/>
                   </pic:spPr>
@@ -16785,7 +17316,23 @@
           <w:color w:val="7A8794"/>
           <w:sz w:val="17"/>
         </w:rPr>
-        <w:t>Figura 7 · Comisión por venta (8% sobre el precio sin IVA).</w:t>
+        <w:t>Figura 7 · Comisión del mes según cantidad de ventas (ejemplo con Solución Modular).</w:t>
+      </w:r>
+    </w:p>
+    <w:p>
+      <w:pPr>
+        <w:pStyle w:val="Heading2"/>
+        <w:spacing w:before="200" w:after="80"/>
+      </w:pPr>
+      <w:r>
+        <w:rPr>
+          <w:rFonts w:ascii="Playfair Display" w:hAnsi="Playfair Display" w:eastAsia="Playfair Display"/>
+          <w:b/>
+          <w:i w:val="0"/>
+          <w:color w:val="1B365D"/>
+          <w:sz w:val="28"/>
+        </w:rPr>
+        <w:t>Cuándo se paga y cuándo se descuenta</w:t>
       </w:r>
     </w:p>
     <w:tbl>
@@ -16796,16 +17343,14 @@
         <w:tblLook w:firstColumn="1" w:firstRow="1" w:lastColumn="0" w:lastRow="0" w:noHBand="0" w:noVBand="1" w:val="04A0"/>
       </w:tblPr>
       <w:tblGrid>
-        <w:gridCol w:w="1949"/>
-        <w:gridCol w:w="1949"/>
-        <w:gridCol w:w="1949"/>
-        <w:gridCol w:w="1949"/>
-        <w:gridCol w:w="1949"/>
+        <w:gridCol w:w="3249"/>
+        <w:gridCol w:w="3249"/>
+        <w:gridCol w:w="3249"/>
       </w:tblGrid>
       <w:tr>
         <w:tc>
           <w:tcPr>
-            <w:tcW w:type="dxa" w:w="1928"/>
+            <w:tcW w:type="dxa" w:w="2835"/>
             <w:tcMar>
               <w:top w:w="124" w:type="dxa"/>
               <w:left w:w="124" w:type="dxa"/>
@@ -16832,7 +17377,7 @@
         </w:tc>
         <w:tc>
           <w:tcPr>
-            <w:tcW w:type="dxa" w:w="794"/>
+            <w:tcW w:type="dxa" w:w="4252"/>
             <w:tcMar>
               <w:top w:w="124" w:type="dxa"/>
               <w:left w:w="124" w:type="dxa"/>
@@ -16853,13 +17398,13 @@
                 <w:color w:val="FFFFFF"/>
                 <w:sz w:val="18"/>
               </w:rPr>
-              <w:t>%</w:t>
+              <w:t>Cuándo se paga</w:t>
             </w:r>
           </w:p>
         </w:tc>
         <w:tc>
           <w:tcPr>
-            <w:tcW w:type="dxa" w:w="1474"/>
+            <w:tcW w:type="dxa" w:w="2551"/>
             <w:tcMar>
               <w:top w:w="124" w:type="dxa"/>
               <w:left w:w="124" w:type="dxa"/>
@@ -16880,60 +17425,6 @@
                 <w:color w:val="FFFFFF"/>
                 <w:sz w:val="18"/>
               </w:rPr>
-              <w:t>Comisión (sin IVA)</w:t>
-            </w:r>
-          </w:p>
-        </w:tc>
-        <w:tc>
-          <w:tcPr>
-            <w:tcW w:type="dxa" w:w="3175"/>
-            <w:tcMar>
-              <w:top w:w="124" w:type="dxa"/>
-              <w:left w:w="124" w:type="dxa"/>
-              <w:bottom w:w="124" w:type="dxa"/>
-              <w:right w:w="124" w:type="dxa"/>
-            </w:tcMar>
-            <w:shd w:val="clear" w:color="auto" w:fill="1B365D"/>
-          </w:tcPr>
-          <w:p>
-            <w:pPr>
-              <w:spacing w:after="40"/>
-            </w:pPr>
-            <w:r>
-              <w:rPr>
-                <w:rFonts w:ascii="Montserrat" w:hAnsi="Montserrat" w:eastAsia="Montserrat"/>
-                <w:b/>
-                <w:i w:val="0"/>
-                <w:color w:val="FFFFFF"/>
-                <w:sz w:val="18"/>
-              </w:rPr>
-              <w:t>Cuándo se paga</w:t>
-            </w:r>
-          </w:p>
-        </w:tc>
-        <w:tc>
-          <w:tcPr>
-            <w:tcW w:type="dxa" w:w="2268"/>
-            <w:tcMar>
-              <w:top w:w="124" w:type="dxa"/>
-              <w:left w:w="124" w:type="dxa"/>
-              <w:bottom w:w="124" w:type="dxa"/>
-              <w:right w:w="124" w:type="dxa"/>
-            </w:tcMar>
-            <w:shd w:val="clear" w:color="auto" w:fill="1B365D"/>
-          </w:tcPr>
-          <w:p>
-            <w:pPr>
-              <w:spacing w:after="40"/>
-            </w:pPr>
-            <w:r>
-              <w:rPr>
-                <w:rFonts w:ascii="Montserrat" w:hAnsi="Montserrat" w:eastAsia="Montserrat"/>
-                <w:b/>
-                <w:i w:val="0"/>
-                <w:color w:val="FFFFFF"/>
-                <w:sz w:val="18"/>
-              </w:rPr>
               <w:t>Estorno</w:t>
             </w:r>
           </w:p>
@@ -16942,7 +17433,7 @@
       <w:tr>
         <w:tc>
           <w:tcPr>
-            <w:tcW w:type="dxa" w:w="1928"/>
+            <w:tcW w:type="dxa" w:w="2835"/>
             <w:tcMar>
               <w:top w:w="124" w:type="dxa"/>
               <w:left w:w="124" w:type="dxa"/>
@@ -16975,7 +17466,7 @@
         </w:tc>
         <w:tc>
           <w:tcPr>
-            <w:tcW w:type="dxa" w:w="794"/>
+            <w:tcW w:type="dxa" w:w="4252"/>
             <w:tcMar>
               <w:top w:w="124" w:type="dxa"/>
               <w:left w:w="124" w:type="dxa"/>
@@ -17002,13 +17493,13 @@
                 <w:color w:val="2C3E50"/>
                 <w:sz w:val="19"/>
               </w:rPr>
-              <w:t>8%</w:t>
+              <w:t>Pago único al pagar el cliente la 3ª cuota</w:t>
             </w:r>
           </w:p>
         </w:tc>
         <w:tc>
           <w:tcPr>
-            <w:tcW w:type="dxa" w:w="1474"/>
+            <w:tcW w:type="dxa" w:w="2551"/>
             <w:tcMar>
               <w:top w:w="124" w:type="dxa"/>
               <w:left w:w="124" w:type="dxa"/>
@@ -17035,13 +17526,116 @@
                 <w:color w:val="2C3E50"/>
                 <w:sz w:val="19"/>
               </w:rPr>
-              <w:t>US$ 70,80</w:t>
+              <w:t>Si cancela antes de la 12ª cuota</w:t>
+            </w:r>
+          </w:p>
+        </w:tc>
+      </w:tr>
+      <w:tr>
+        <w:tc>
+          <w:tcPr>
+            <w:tcW w:type="dxa" w:w="2835"/>
+            <w:tcMar>
+              <w:top w:w="124" w:type="dxa"/>
+              <w:left w:w="124" w:type="dxa"/>
+              <w:bottom w:w="124" w:type="dxa"/>
+              <w:right w:w="124" w:type="dxa"/>
+            </w:tcMar>
+            <w:shd w:val="clear" w:color="auto" w:fill="F4F7FA"/>
+            <w:tcBorders>
+              <w:top w:val="nil"/>
+              <w:left w:val="nil"/>
+              <w:bottom w:val="single" w:sz="4" w:color="D9DEE4"/>
+              <w:right w:val="nil"/>
+            </w:tcBorders>
+          </w:tcPr>
+          <w:p>
+            <w:pPr>
+              <w:spacing w:after="40"/>
+            </w:pPr>
+            <w:r>
+              <w:rPr>
+                <w:rFonts w:ascii="Montserrat" w:hAnsi="Montserrat" w:eastAsia="Montserrat"/>
+                <w:b/>
+                <w:i w:val="0"/>
+                <w:color w:val="1B365D"/>
+                <w:sz w:val="19"/>
+              </w:rPr>
+              <w:t>Jardines de Cenizas</w:t>
             </w:r>
           </w:p>
         </w:tc>
         <w:tc>
           <w:tcPr>
-            <w:tcW w:type="dxa" w:w="3175"/>
+            <w:tcW w:type="dxa" w:w="4252"/>
+            <w:tcMar>
+              <w:top w:w="124" w:type="dxa"/>
+              <w:left w:w="124" w:type="dxa"/>
+              <w:bottom w:w="124" w:type="dxa"/>
+              <w:right w:w="124" w:type="dxa"/>
+            </w:tcMar>
+            <w:shd w:val="clear" w:color="auto" w:fill="F4F7FA"/>
+            <w:tcBorders>
+              <w:top w:val="nil"/>
+              <w:left w:val="nil"/>
+              <w:bottom w:val="single" w:sz="4" w:color="D9DEE4"/>
+              <w:right w:val="nil"/>
+            </w:tcBorders>
+          </w:tcPr>
+          <w:p>
+            <w:pPr>
+              <w:spacing w:after="40"/>
+            </w:pPr>
+            <w:r>
+              <w:rPr>
+                <w:rFonts w:ascii="Montserrat" w:hAnsi="Montserrat" w:eastAsia="Montserrat"/>
+                <w:b w:val="0"/>
+                <w:i w:val="0"/>
+                <w:color w:val="2C3E50"/>
+                <w:sz w:val="19"/>
+              </w:rPr>
+              <w:t>Contado: mes siguiente · Financiado: proporcional a lo cobrado</w:t>
+            </w:r>
+          </w:p>
+        </w:tc>
+        <w:tc>
+          <w:tcPr>
+            <w:tcW w:type="dxa" w:w="2551"/>
+            <w:tcMar>
+              <w:top w:w="124" w:type="dxa"/>
+              <w:left w:w="124" w:type="dxa"/>
+              <w:bottom w:w="124" w:type="dxa"/>
+              <w:right w:w="124" w:type="dxa"/>
+            </w:tcMar>
+            <w:shd w:val="clear" w:color="auto" w:fill="F4F7FA"/>
+            <w:tcBorders>
+              <w:top w:val="nil"/>
+              <w:left w:val="nil"/>
+              <w:bottom w:val="single" w:sz="4" w:color="D9DEE4"/>
+              <w:right w:val="nil"/>
+            </w:tcBorders>
+          </w:tcPr>
+          <w:p>
+            <w:pPr>
+              <w:spacing w:after="40"/>
+            </w:pPr>
+            <w:r>
+              <w:rPr>
+                <w:rFonts w:ascii="Montserrat" w:hAnsi="Montserrat" w:eastAsia="Montserrat"/>
+                <w:b w:val="0"/>
+                <w:i w:val="0"/>
+                <w:color w:val="2C3E50"/>
+                <w:sz w:val="19"/>
+              </w:rPr>
+              <w:t>Cancelación en 90 días</w:t>
+            </w:r>
+          </w:p>
+        </w:tc>
+      </w:tr>
+      <w:tr>
+        <w:tc>
+          <w:tcPr>
+            <w:tcW w:type="dxa" w:w="2835"/>
             <w:tcMar>
               <w:top w:w="124" w:type="dxa"/>
               <w:left w:w="124" w:type="dxa"/>
@@ -17063,18 +17657,18 @@
             <w:r>
               <w:rPr>
                 <w:rFonts w:ascii="Montserrat" w:hAnsi="Montserrat" w:eastAsia="Montserrat"/>
-                <w:b w:val="0"/>
-                <w:i w:val="0"/>
-                <w:color w:val="2C3E50"/>
+                <w:b/>
+                <w:i w:val="0"/>
+                <w:color w:val="1B365D"/>
                 <w:sz w:val="19"/>
               </w:rPr>
-              <w:t>Pago único al pagar el cliente la 3ª cuota</w:t>
+              <w:t>Jardín de Mascotas</w:t>
             </w:r>
           </w:p>
         </w:tc>
         <w:tc>
           <w:tcPr>
-            <w:tcW w:type="dxa" w:w="2268"/>
+            <w:tcW w:type="dxa" w:w="4252"/>
             <w:tcMar>
               <w:top w:w="124" w:type="dxa"/>
               <w:left w:w="124" w:type="dxa"/>
@@ -17101,7 +17695,40 @@
                 <w:color w:val="2C3E50"/>
                 <w:sz w:val="19"/>
               </w:rPr>
-              <w:t>Si cancela antes de la 12ª cuota</w:t>
+              <w:t>Mes siguiente al pago</w:t>
+            </w:r>
+          </w:p>
+        </w:tc>
+        <w:tc>
+          <w:tcPr>
+            <w:tcW w:type="dxa" w:w="2551"/>
+            <w:tcMar>
+              <w:top w:w="124" w:type="dxa"/>
+              <w:left w:w="124" w:type="dxa"/>
+              <w:bottom w:w="124" w:type="dxa"/>
+              <w:right w:w="124" w:type="dxa"/>
+            </w:tcMar>
+            <w:shd w:val="clear" w:color="auto" w:fill="FFFFFF"/>
+            <w:tcBorders>
+              <w:top w:val="nil"/>
+              <w:left w:val="nil"/>
+              <w:bottom w:val="single" w:sz="4" w:color="D9DEE4"/>
+              <w:right w:val="nil"/>
+            </w:tcBorders>
+          </w:tcPr>
+          <w:p>
+            <w:pPr>
+              <w:spacing w:after="40"/>
+            </w:pPr>
+            <w:r>
+              <w:rPr>
+                <w:rFonts w:ascii="Montserrat" w:hAnsi="Montserrat" w:eastAsia="Montserrat"/>
+                <w:b w:val="0"/>
+                <w:i w:val="0"/>
+                <w:color w:val="2C3E50"/>
+                <w:sz w:val="19"/>
+              </w:rPr>
+              <w:t>Cancelación en 90 días</w:t>
             </w:r>
           </w:p>
         </w:tc>
@@ -17109,7 +17736,7 @@
       <w:tr>
         <w:tc>
           <w:tcPr>
-            <w:tcW w:type="dxa" w:w="1928"/>
+            <w:tcW w:type="dxa" w:w="2835"/>
             <w:tcMar>
               <w:top w:w="124" w:type="dxa"/>
               <w:left w:w="124" w:type="dxa"/>
@@ -17136,13 +17763,13 @@
                 <w:color w:val="1B365D"/>
                 <w:sz w:val="19"/>
               </w:rPr>
-              <w:t>Jardín Individual</w:t>
+              <w:t>Columbarios (portafolio existente)</w:t>
             </w:r>
           </w:p>
         </w:tc>
         <w:tc>
           <w:tcPr>
-            <w:tcW w:type="dxa" w:w="794"/>
+            <w:tcW w:type="dxa" w:w="4252"/>
             <w:tcMar>
               <w:top w:w="124" w:type="dxa"/>
               <w:left w:w="124" w:type="dxa"/>
@@ -17169,13 +17796,13 @@
                 <w:color w:val="2C3E50"/>
                 <w:sz w:val="19"/>
               </w:rPr>
-              <w:t>8%</w:t>
+              <w:t>Contado: mes siguiente · Financiado: proporcional a lo cobrado</w:t>
             </w:r>
           </w:p>
         </w:tc>
         <w:tc>
           <w:tcPr>
-            <w:tcW w:type="dxa" w:w="1474"/>
+            <w:tcW w:type="dxa" w:w="2551"/>
             <w:tcMar>
               <w:top w:w="124" w:type="dxa"/>
               <w:left w:w="124" w:type="dxa"/>
@@ -17202,1075 +17829,7 @@
                 <w:color w:val="2C3E50"/>
                 <w:sz w:val="19"/>
               </w:rPr>
-              <w:t>US$ 42,48</w:t>
-            </w:r>
-          </w:p>
-        </w:tc>
-        <w:tc>
-          <w:tcPr>
-            <w:tcW w:type="dxa" w:w="3175"/>
-            <w:tcMar>
-              <w:top w:w="124" w:type="dxa"/>
-              <w:left w:w="124" w:type="dxa"/>
-              <w:bottom w:w="124" w:type="dxa"/>
-              <w:right w:w="124" w:type="dxa"/>
-            </w:tcMar>
-            <w:shd w:val="clear" w:color="auto" w:fill="F4F7FA"/>
-            <w:tcBorders>
-              <w:top w:val="nil"/>
-              <w:left w:val="nil"/>
-              <w:bottom w:val="single" w:sz="4" w:color="D9DEE4"/>
-              <w:right w:val="nil"/>
-            </w:tcBorders>
-          </w:tcPr>
-          <w:p>
-            <w:pPr>
-              <w:spacing w:after="40"/>
-            </w:pPr>
-            <w:r>
-              <w:rPr>
-                <w:rFonts w:ascii="Montserrat" w:hAnsi="Montserrat" w:eastAsia="Montserrat"/>
-                <w:b w:val="0"/>
-                <w:i w:val="0"/>
-                <w:color w:val="2C3E50"/>
-                <w:sz w:val="19"/>
-              </w:rPr>
-              <w:t>Contado: mes siguiente · Financiado: proporcional a lo cobrado</w:t>
-            </w:r>
-          </w:p>
-        </w:tc>
-        <w:tc>
-          <w:tcPr>
-            <w:tcW w:type="dxa" w:w="2268"/>
-            <w:tcMar>
-              <w:top w:w="124" w:type="dxa"/>
-              <w:left w:w="124" w:type="dxa"/>
-              <w:bottom w:w="124" w:type="dxa"/>
-              <w:right w:w="124" w:type="dxa"/>
-            </w:tcMar>
-            <w:shd w:val="clear" w:color="auto" w:fill="F4F7FA"/>
-            <w:tcBorders>
-              <w:top w:val="nil"/>
-              <w:left w:val="nil"/>
-              <w:bottom w:val="single" w:sz="4" w:color="D9DEE4"/>
-              <w:right w:val="nil"/>
-            </w:tcBorders>
-          </w:tcPr>
-          <w:p>
-            <w:pPr>
-              <w:spacing w:after="40"/>
-            </w:pPr>
-            <w:r>
-              <w:rPr>
-                <w:rFonts w:ascii="Montserrat" w:hAnsi="Montserrat" w:eastAsia="Montserrat"/>
-                <w:b w:val="0"/>
-                <w:i w:val="0"/>
-                <w:color w:val="2C3E50"/>
-                <w:sz w:val="19"/>
-              </w:rPr>
               <w:t>Cancelación en 90 días</w:t>
-            </w:r>
-          </w:p>
-        </w:tc>
-      </w:tr>
-      <w:tr>
-        <w:tc>
-          <w:tcPr>
-            <w:tcW w:type="dxa" w:w="1928"/>
-            <w:tcMar>
-              <w:top w:w="124" w:type="dxa"/>
-              <w:left w:w="124" w:type="dxa"/>
-              <w:bottom w:w="124" w:type="dxa"/>
-              <w:right w:w="124" w:type="dxa"/>
-            </w:tcMar>
-            <w:shd w:val="clear" w:color="auto" w:fill="FFFFFF"/>
-            <w:tcBorders>
-              <w:top w:val="nil"/>
-              <w:left w:val="nil"/>
-              <w:bottom w:val="single" w:sz="4" w:color="D9DEE4"/>
-              <w:right w:val="nil"/>
-            </w:tcBorders>
-          </w:tcPr>
-          <w:p>
-            <w:pPr>
-              <w:spacing w:after="40"/>
-            </w:pPr>
-            <w:r>
-              <w:rPr>
-                <w:rFonts w:ascii="Montserrat" w:hAnsi="Montserrat" w:eastAsia="Montserrat"/>
-                <w:b/>
-                <w:i w:val="0"/>
-                <w:color w:val="1B365D"/>
-                <w:sz w:val="19"/>
-              </w:rPr>
-              <w:t>Jardín Familiar</w:t>
-            </w:r>
-          </w:p>
-        </w:tc>
-        <w:tc>
-          <w:tcPr>
-            <w:tcW w:type="dxa" w:w="794"/>
-            <w:tcMar>
-              <w:top w:w="124" w:type="dxa"/>
-              <w:left w:w="124" w:type="dxa"/>
-              <w:bottom w:w="124" w:type="dxa"/>
-              <w:right w:w="124" w:type="dxa"/>
-            </w:tcMar>
-            <w:shd w:val="clear" w:color="auto" w:fill="FFFFFF"/>
-            <w:tcBorders>
-              <w:top w:val="nil"/>
-              <w:left w:val="nil"/>
-              <w:bottom w:val="single" w:sz="4" w:color="D9DEE4"/>
-              <w:right w:val="nil"/>
-            </w:tcBorders>
-          </w:tcPr>
-          <w:p>
-            <w:pPr>
-              <w:spacing w:after="40"/>
-            </w:pPr>
-            <w:r>
-              <w:rPr>
-                <w:rFonts w:ascii="Montserrat" w:hAnsi="Montserrat" w:eastAsia="Montserrat"/>
-                <w:b w:val="0"/>
-                <w:i w:val="0"/>
-                <w:color w:val="2C3E50"/>
-                <w:sz w:val="19"/>
-              </w:rPr>
-              <w:t>8%</w:t>
-            </w:r>
-          </w:p>
-        </w:tc>
-        <w:tc>
-          <w:tcPr>
-            <w:tcW w:type="dxa" w:w="1474"/>
-            <w:tcMar>
-              <w:top w:w="124" w:type="dxa"/>
-              <w:left w:w="124" w:type="dxa"/>
-              <w:bottom w:w="124" w:type="dxa"/>
-              <w:right w:w="124" w:type="dxa"/>
-            </w:tcMar>
-            <w:shd w:val="clear" w:color="auto" w:fill="FFFFFF"/>
-            <w:tcBorders>
-              <w:top w:val="nil"/>
-              <w:left w:val="nil"/>
-              <w:bottom w:val="single" w:sz="4" w:color="D9DEE4"/>
-              <w:right w:val="nil"/>
-            </w:tcBorders>
-          </w:tcPr>
-          <w:p>
-            <w:pPr>
-              <w:spacing w:after="40"/>
-            </w:pPr>
-            <w:r>
-              <w:rPr>
-                <w:rFonts w:ascii="Montserrat" w:hAnsi="Montserrat" w:eastAsia="Montserrat"/>
-                <w:b w:val="0"/>
-                <w:i w:val="0"/>
-                <w:color w:val="2C3E50"/>
-                <w:sz w:val="19"/>
-              </w:rPr>
-              <w:t>US$ 141,59</w:t>
-            </w:r>
-          </w:p>
-        </w:tc>
-        <w:tc>
-          <w:tcPr>
-            <w:tcW w:type="dxa" w:w="3175"/>
-            <w:tcMar>
-              <w:top w:w="124" w:type="dxa"/>
-              <w:left w:w="124" w:type="dxa"/>
-              <w:bottom w:w="124" w:type="dxa"/>
-              <w:right w:w="124" w:type="dxa"/>
-            </w:tcMar>
-            <w:shd w:val="clear" w:color="auto" w:fill="FFFFFF"/>
-            <w:tcBorders>
-              <w:top w:val="nil"/>
-              <w:left w:val="nil"/>
-              <w:bottom w:val="single" w:sz="4" w:color="D9DEE4"/>
-              <w:right w:val="nil"/>
-            </w:tcBorders>
-          </w:tcPr>
-          <w:p>
-            <w:pPr>
-              <w:spacing w:after="40"/>
-            </w:pPr>
-            <w:r>
-              <w:rPr>
-                <w:rFonts w:ascii="Montserrat" w:hAnsi="Montserrat" w:eastAsia="Montserrat"/>
-                <w:b w:val="0"/>
-                <w:i w:val="0"/>
-                <w:color w:val="2C3E50"/>
-                <w:sz w:val="19"/>
-              </w:rPr>
-              <w:t>Contado: mes siguiente · Financiado: proporcional a lo cobrado</w:t>
-            </w:r>
-          </w:p>
-        </w:tc>
-        <w:tc>
-          <w:tcPr>
-            <w:tcW w:type="dxa" w:w="2268"/>
-            <w:tcMar>
-              <w:top w:w="124" w:type="dxa"/>
-              <w:left w:w="124" w:type="dxa"/>
-              <w:bottom w:w="124" w:type="dxa"/>
-              <w:right w:w="124" w:type="dxa"/>
-            </w:tcMar>
-            <w:shd w:val="clear" w:color="auto" w:fill="FFFFFF"/>
-            <w:tcBorders>
-              <w:top w:val="nil"/>
-              <w:left w:val="nil"/>
-              <w:bottom w:val="single" w:sz="4" w:color="D9DEE4"/>
-              <w:right w:val="nil"/>
-            </w:tcBorders>
-          </w:tcPr>
-          <w:p>
-            <w:pPr>
-              <w:spacing w:after="40"/>
-            </w:pPr>
-            <w:r>
-              <w:rPr>
-                <w:rFonts w:ascii="Montserrat" w:hAnsi="Montserrat" w:eastAsia="Montserrat"/>
-                <w:b w:val="0"/>
-                <w:i w:val="0"/>
-                <w:color w:val="2C3E50"/>
-                <w:sz w:val="19"/>
-              </w:rPr>
-              <w:t>Cancelación en 90 días</w:t>
-            </w:r>
-          </w:p>
-        </w:tc>
-      </w:tr>
-      <w:tr>
-        <w:tc>
-          <w:tcPr>
-            <w:tcW w:type="dxa" w:w="1928"/>
-            <w:tcMar>
-              <w:top w:w="124" w:type="dxa"/>
-              <w:left w:w="124" w:type="dxa"/>
-              <w:bottom w:w="124" w:type="dxa"/>
-              <w:right w:w="124" w:type="dxa"/>
-            </w:tcMar>
-            <w:shd w:val="clear" w:color="auto" w:fill="F4F7FA"/>
-            <w:tcBorders>
-              <w:top w:val="nil"/>
-              <w:left w:val="nil"/>
-              <w:bottom w:val="single" w:sz="4" w:color="D9DEE4"/>
-              <w:right w:val="nil"/>
-            </w:tcBorders>
-          </w:tcPr>
-          <w:p>
-            <w:pPr>
-              <w:spacing w:after="40"/>
-            </w:pPr>
-            <w:r>
-              <w:rPr>
-                <w:rFonts w:ascii="Montserrat" w:hAnsi="Montserrat" w:eastAsia="Montserrat"/>
-                <w:b/>
-                <w:i w:val="0"/>
-                <w:color w:val="1B365D"/>
-                <w:sz w:val="19"/>
-              </w:rPr>
-              <w:t>Jardín Ecológico</w:t>
-            </w:r>
-          </w:p>
-        </w:tc>
-        <w:tc>
-          <w:tcPr>
-            <w:tcW w:type="dxa" w:w="794"/>
-            <w:tcMar>
-              <w:top w:w="124" w:type="dxa"/>
-              <w:left w:w="124" w:type="dxa"/>
-              <w:bottom w:w="124" w:type="dxa"/>
-              <w:right w:w="124" w:type="dxa"/>
-            </w:tcMar>
-            <w:shd w:val="clear" w:color="auto" w:fill="F4F7FA"/>
-            <w:tcBorders>
-              <w:top w:val="nil"/>
-              <w:left w:val="nil"/>
-              <w:bottom w:val="single" w:sz="4" w:color="D9DEE4"/>
-              <w:right w:val="nil"/>
-            </w:tcBorders>
-          </w:tcPr>
-          <w:p>
-            <w:pPr>
-              <w:spacing w:after="40"/>
-            </w:pPr>
-            <w:r>
-              <w:rPr>
-                <w:rFonts w:ascii="Montserrat" w:hAnsi="Montserrat" w:eastAsia="Montserrat"/>
-                <w:b w:val="0"/>
-                <w:i w:val="0"/>
-                <w:color w:val="2C3E50"/>
-                <w:sz w:val="19"/>
-              </w:rPr>
-              <w:t>8%</w:t>
-            </w:r>
-          </w:p>
-        </w:tc>
-        <w:tc>
-          <w:tcPr>
-            <w:tcW w:type="dxa" w:w="1474"/>
-            <w:tcMar>
-              <w:top w:w="124" w:type="dxa"/>
-              <w:left w:w="124" w:type="dxa"/>
-              <w:bottom w:w="124" w:type="dxa"/>
-              <w:right w:w="124" w:type="dxa"/>
-            </w:tcMar>
-            <w:shd w:val="clear" w:color="auto" w:fill="F4F7FA"/>
-            <w:tcBorders>
-              <w:top w:val="nil"/>
-              <w:left w:val="nil"/>
-              <w:bottom w:val="single" w:sz="4" w:color="D9DEE4"/>
-              <w:right w:val="nil"/>
-            </w:tcBorders>
-          </w:tcPr>
-          <w:p>
-            <w:pPr>
-              <w:spacing w:after="40"/>
-            </w:pPr>
-            <w:r>
-              <w:rPr>
-                <w:rFonts w:ascii="Montserrat" w:hAnsi="Montserrat" w:eastAsia="Montserrat"/>
-                <w:b w:val="0"/>
-                <w:i w:val="0"/>
-                <w:color w:val="2C3E50"/>
-                <w:sz w:val="19"/>
-              </w:rPr>
-              <w:t>US$ 53,10</w:t>
-            </w:r>
-          </w:p>
-        </w:tc>
-        <w:tc>
-          <w:tcPr>
-            <w:tcW w:type="dxa" w:w="3175"/>
-            <w:tcMar>
-              <w:top w:w="124" w:type="dxa"/>
-              <w:left w:w="124" w:type="dxa"/>
-              <w:bottom w:w="124" w:type="dxa"/>
-              <w:right w:w="124" w:type="dxa"/>
-            </w:tcMar>
-            <w:shd w:val="clear" w:color="auto" w:fill="F4F7FA"/>
-            <w:tcBorders>
-              <w:top w:val="nil"/>
-              <w:left w:val="nil"/>
-              <w:bottom w:val="single" w:sz="4" w:color="D9DEE4"/>
-              <w:right w:val="nil"/>
-            </w:tcBorders>
-          </w:tcPr>
-          <w:p>
-            <w:pPr>
-              <w:spacing w:after="40"/>
-            </w:pPr>
-            <w:r>
-              <w:rPr>
-                <w:rFonts w:ascii="Montserrat" w:hAnsi="Montserrat" w:eastAsia="Montserrat"/>
-                <w:b w:val="0"/>
-                <w:i w:val="0"/>
-                <w:color w:val="2C3E50"/>
-                <w:sz w:val="19"/>
-              </w:rPr>
-              <w:t>Contado: mes siguiente · Financiado: proporcional a lo cobrado</w:t>
-            </w:r>
-          </w:p>
-        </w:tc>
-        <w:tc>
-          <w:tcPr>
-            <w:tcW w:type="dxa" w:w="2268"/>
-            <w:tcMar>
-              <w:top w:w="124" w:type="dxa"/>
-              <w:left w:w="124" w:type="dxa"/>
-              <w:bottom w:w="124" w:type="dxa"/>
-              <w:right w:w="124" w:type="dxa"/>
-            </w:tcMar>
-            <w:shd w:val="clear" w:color="auto" w:fill="F4F7FA"/>
-            <w:tcBorders>
-              <w:top w:val="nil"/>
-              <w:left w:val="nil"/>
-              <w:bottom w:val="single" w:sz="4" w:color="D9DEE4"/>
-              <w:right w:val="nil"/>
-            </w:tcBorders>
-          </w:tcPr>
-          <w:p>
-            <w:pPr>
-              <w:spacing w:after="40"/>
-            </w:pPr>
-            <w:r>
-              <w:rPr>
-                <w:rFonts w:ascii="Montserrat" w:hAnsi="Montserrat" w:eastAsia="Montserrat"/>
-                <w:b w:val="0"/>
-                <w:i w:val="0"/>
-                <w:color w:val="2C3E50"/>
-                <w:sz w:val="19"/>
-              </w:rPr>
-              <w:t>Cancelación en 90 días</w:t>
-            </w:r>
-          </w:p>
-        </w:tc>
-      </w:tr>
-      <w:tr>
-        <w:tc>
-          <w:tcPr>
-            <w:tcW w:type="dxa" w:w="1928"/>
-            <w:tcMar>
-              <w:top w:w="124" w:type="dxa"/>
-              <w:left w:w="124" w:type="dxa"/>
-              <w:bottom w:w="124" w:type="dxa"/>
-              <w:right w:w="124" w:type="dxa"/>
-            </w:tcMar>
-            <w:shd w:val="clear" w:color="auto" w:fill="FFFFFF"/>
-            <w:tcBorders>
-              <w:top w:val="nil"/>
-              <w:left w:val="nil"/>
-              <w:bottom w:val="single" w:sz="4" w:color="D9DEE4"/>
-              <w:right w:val="nil"/>
-            </w:tcBorders>
-          </w:tcPr>
-          <w:p>
-            <w:pPr>
-              <w:spacing w:after="40"/>
-            </w:pPr>
-            <w:r>
-              <w:rPr>
-                <w:rFonts w:ascii="Montserrat" w:hAnsi="Montserrat" w:eastAsia="Montserrat"/>
-                <w:b/>
-                <w:i w:val="0"/>
-                <w:color w:val="1B365D"/>
-                <w:sz w:val="19"/>
-              </w:rPr>
-              <w:t>Mascotas · solo espacio</w:t>
-            </w:r>
-          </w:p>
-        </w:tc>
-        <w:tc>
-          <w:tcPr>
-            <w:tcW w:type="dxa" w:w="794"/>
-            <w:tcMar>
-              <w:top w:w="124" w:type="dxa"/>
-              <w:left w:w="124" w:type="dxa"/>
-              <w:bottom w:w="124" w:type="dxa"/>
-              <w:right w:w="124" w:type="dxa"/>
-            </w:tcMar>
-            <w:shd w:val="clear" w:color="auto" w:fill="FFFFFF"/>
-            <w:tcBorders>
-              <w:top w:val="nil"/>
-              <w:left w:val="nil"/>
-              <w:bottom w:val="single" w:sz="4" w:color="D9DEE4"/>
-              <w:right w:val="nil"/>
-            </w:tcBorders>
-          </w:tcPr>
-          <w:p>
-            <w:pPr>
-              <w:spacing w:after="40"/>
-            </w:pPr>
-            <w:r>
-              <w:rPr>
-                <w:rFonts w:ascii="Montserrat" w:hAnsi="Montserrat" w:eastAsia="Montserrat"/>
-                <w:b w:val="0"/>
-                <w:i w:val="0"/>
-                <w:color w:val="2C3E50"/>
-                <w:sz w:val="19"/>
-              </w:rPr>
-              <w:t>8%</w:t>
-            </w:r>
-          </w:p>
-        </w:tc>
-        <w:tc>
-          <w:tcPr>
-            <w:tcW w:type="dxa" w:w="1474"/>
-            <w:tcMar>
-              <w:top w:w="124" w:type="dxa"/>
-              <w:left w:w="124" w:type="dxa"/>
-              <w:bottom w:w="124" w:type="dxa"/>
-              <w:right w:w="124" w:type="dxa"/>
-            </w:tcMar>
-            <w:shd w:val="clear" w:color="auto" w:fill="FFFFFF"/>
-            <w:tcBorders>
-              <w:top w:val="nil"/>
-              <w:left w:val="nil"/>
-              <w:bottom w:val="single" w:sz="4" w:color="D9DEE4"/>
-              <w:right w:val="nil"/>
-            </w:tcBorders>
-          </w:tcPr>
-          <w:p>
-            <w:pPr>
-              <w:spacing w:after="40"/>
-            </w:pPr>
-            <w:r>
-              <w:rPr>
-                <w:rFonts w:ascii="Montserrat" w:hAnsi="Montserrat" w:eastAsia="Montserrat"/>
-                <w:b w:val="0"/>
-                <w:i w:val="0"/>
-                <w:color w:val="2C3E50"/>
-                <w:sz w:val="19"/>
-              </w:rPr>
-              <w:t>US$ 28,32</w:t>
-            </w:r>
-          </w:p>
-        </w:tc>
-        <w:tc>
-          <w:tcPr>
-            <w:tcW w:type="dxa" w:w="3175"/>
-            <w:tcMar>
-              <w:top w:w="124" w:type="dxa"/>
-              <w:left w:w="124" w:type="dxa"/>
-              <w:bottom w:w="124" w:type="dxa"/>
-              <w:right w:w="124" w:type="dxa"/>
-            </w:tcMar>
-            <w:shd w:val="clear" w:color="auto" w:fill="FFFFFF"/>
-            <w:tcBorders>
-              <w:top w:val="nil"/>
-              <w:left w:val="nil"/>
-              <w:bottom w:val="single" w:sz="4" w:color="D9DEE4"/>
-              <w:right w:val="nil"/>
-            </w:tcBorders>
-          </w:tcPr>
-          <w:p>
-            <w:pPr>
-              <w:spacing w:after="40"/>
-            </w:pPr>
-            <w:r>
-              <w:rPr>
-                <w:rFonts w:ascii="Montserrat" w:hAnsi="Montserrat" w:eastAsia="Montserrat"/>
-                <w:b w:val="0"/>
-                <w:i w:val="0"/>
-                <w:color w:val="2C3E50"/>
-                <w:sz w:val="19"/>
-              </w:rPr>
-              <w:t>Mes siguiente al pago</w:t>
-            </w:r>
-          </w:p>
-        </w:tc>
-        <w:tc>
-          <w:tcPr>
-            <w:tcW w:type="dxa" w:w="2268"/>
-            <w:tcMar>
-              <w:top w:w="124" w:type="dxa"/>
-              <w:left w:w="124" w:type="dxa"/>
-              <w:bottom w:w="124" w:type="dxa"/>
-              <w:right w:w="124" w:type="dxa"/>
-            </w:tcMar>
-            <w:shd w:val="clear" w:color="auto" w:fill="FFFFFF"/>
-            <w:tcBorders>
-              <w:top w:val="nil"/>
-              <w:left w:val="nil"/>
-              <w:bottom w:val="single" w:sz="4" w:color="D9DEE4"/>
-              <w:right w:val="nil"/>
-            </w:tcBorders>
-          </w:tcPr>
-          <w:p>
-            <w:pPr>
-              <w:spacing w:after="40"/>
-            </w:pPr>
-            <w:r>
-              <w:rPr>
-                <w:rFonts w:ascii="Montserrat" w:hAnsi="Montserrat" w:eastAsia="Montserrat"/>
-                <w:b w:val="0"/>
-                <w:i w:val="0"/>
-                <w:color w:val="2C3E50"/>
-                <w:sz w:val="19"/>
-              </w:rPr>
-              <w:t>Cancelación en 90 días</w:t>
-            </w:r>
-          </w:p>
-        </w:tc>
-      </w:tr>
-      <w:tr>
-        <w:tc>
-          <w:tcPr>
-            <w:tcW w:type="dxa" w:w="1928"/>
-            <w:tcMar>
-              <w:top w:w="124" w:type="dxa"/>
-              <w:left w:w="124" w:type="dxa"/>
-              <w:bottom w:w="124" w:type="dxa"/>
-              <w:right w:w="124" w:type="dxa"/>
-            </w:tcMar>
-            <w:shd w:val="clear" w:color="auto" w:fill="F4F7FA"/>
-            <w:tcBorders>
-              <w:top w:val="nil"/>
-              <w:left w:val="nil"/>
-              <w:bottom w:val="single" w:sz="4" w:color="D9DEE4"/>
-              <w:right w:val="nil"/>
-            </w:tcBorders>
-          </w:tcPr>
-          <w:p>
-            <w:pPr>
-              <w:spacing w:after="40"/>
-            </w:pPr>
-            <w:r>
-              <w:rPr>
-                <w:rFonts w:ascii="Montserrat" w:hAnsi="Montserrat" w:eastAsia="Montserrat"/>
-                <w:b/>
-                <w:i w:val="0"/>
-                <w:color w:val="1B365D"/>
-                <w:sz w:val="19"/>
-              </w:rPr>
-              <w:t>Mascotas · jardín + cremación</w:t>
-            </w:r>
-          </w:p>
-        </w:tc>
-        <w:tc>
-          <w:tcPr>
-            <w:tcW w:type="dxa" w:w="794"/>
-            <w:tcMar>
-              <w:top w:w="124" w:type="dxa"/>
-              <w:left w:w="124" w:type="dxa"/>
-              <w:bottom w:w="124" w:type="dxa"/>
-              <w:right w:w="124" w:type="dxa"/>
-            </w:tcMar>
-            <w:shd w:val="clear" w:color="auto" w:fill="F4F7FA"/>
-            <w:tcBorders>
-              <w:top w:val="nil"/>
-              <w:left w:val="nil"/>
-              <w:bottom w:val="single" w:sz="4" w:color="D9DEE4"/>
-              <w:right w:val="nil"/>
-            </w:tcBorders>
-          </w:tcPr>
-          <w:p>
-            <w:pPr>
-              <w:spacing w:after="40"/>
-            </w:pPr>
-            <w:r>
-              <w:rPr>
-                <w:rFonts w:ascii="Montserrat" w:hAnsi="Montserrat" w:eastAsia="Montserrat"/>
-                <w:b w:val="0"/>
-                <w:i w:val="0"/>
-                <w:color w:val="2C3E50"/>
-                <w:sz w:val="19"/>
-              </w:rPr>
-              <w:t>8%</w:t>
-            </w:r>
-          </w:p>
-        </w:tc>
-        <w:tc>
-          <w:tcPr>
-            <w:tcW w:type="dxa" w:w="1474"/>
-            <w:tcMar>
-              <w:top w:w="124" w:type="dxa"/>
-              <w:left w:w="124" w:type="dxa"/>
-              <w:bottom w:w="124" w:type="dxa"/>
-              <w:right w:w="124" w:type="dxa"/>
-            </w:tcMar>
-            <w:shd w:val="clear" w:color="auto" w:fill="F4F7FA"/>
-            <w:tcBorders>
-              <w:top w:val="nil"/>
-              <w:left w:val="nil"/>
-              <w:bottom w:val="single" w:sz="4" w:color="D9DEE4"/>
-              <w:right w:val="nil"/>
-            </w:tcBorders>
-          </w:tcPr>
-          <w:p>
-            <w:pPr>
-              <w:spacing w:after="40"/>
-            </w:pPr>
-            <w:r>
-              <w:rPr>
-                <w:rFonts w:ascii="Montserrat" w:hAnsi="Montserrat" w:eastAsia="Montserrat"/>
-                <w:b w:val="0"/>
-                <w:i w:val="0"/>
-                <w:color w:val="2C3E50"/>
-                <w:sz w:val="19"/>
-              </w:rPr>
-              <w:t>US$ 38,94</w:t>
-            </w:r>
-          </w:p>
-        </w:tc>
-        <w:tc>
-          <w:tcPr>
-            <w:tcW w:type="dxa" w:w="3175"/>
-            <w:tcMar>
-              <w:top w:w="124" w:type="dxa"/>
-              <w:left w:w="124" w:type="dxa"/>
-              <w:bottom w:w="124" w:type="dxa"/>
-              <w:right w:w="124" w:type="dxa"/>
-            </w:tcMar>
-            <w:shd w:val="clear" w:color="auto" w:fill="F4F7FA"/>
-            <w:tcBorders>
-              <w:top w:val="nil"/>
-              <w:left w:val="nil"/>
-              <w:bottom w:val="single" w:sz="4" w:color="D9DEE4"/>
-              <w:right w:val="nil"/>
-            </w:tcBorders>
-          </w:tcPr>
-          <w:p>
-            <w:pPr>
-              <w:spacing w:after="40"/>
-            </w:pPr>
-            <w:r>
-              <w:rPr>
-                <w:rFonts w:ascii="Montserrat" w:hAnsi="Montserrat" w:eastAsia="Montserrat"/>
-                <w:b w:val="0"/>
-                <w:i w:val="0"/>
-                <w:color w:val="2C3E50"/>
-                <w:sz w:val="19"/>
-              </w:rPr>
-              <w:t>Mes siguiente al pago</w:t>
-            </w:r>
-          </w:p>
-        </w:tc>
-        <w:tc>
-          <w:tcPr>
-            <w:tcW w:type="dxa" w:w="2268"/>
-            <w:tcMar>
-              <w:top w:w="124" w:type="dxa"/>
-              <w:left w:w="124" w:type="dxa"/>
-              <w:bottom w:w="124" w:type="dxa"/>
-              <w:right w:w="124" w:type="dxa"/>
-            </w:tcMar>
-            <w:shd w:val="clear" w:color="auto" w:fill="F4F7FA"/>
-            <w:tcBorders>
-              <w:top w:val="nil"/>
-              <w:left w:val="nil"/>
-              <w:bottom w:val="single" w:sz="4" w:color="D9DEE4"/>
-              <w:right w:val="nil"/>
-            </w:tcBorders>
-          </w:tcPr>
-          <w:p>
-            <w:pPr>
-              <w:spacing w:after="40"/>
-            </w:pPr>
-            <w:r>
-              <w:rPr>
-                <w:rFonts w:ascii="Montserrat" w:hAnsi="Montserrat" w:eastAsia="Montserrat"/>
-                <w:b w:val="0"/>
-                <w:i w:val="0"/>
-                <w:color w:val="2C3E50"/>
-                <w:sz w:val="19"/>
-              </w:rPr>
-              <w:t>Cancelación en 90 días</w:t>
-            </w:r>
-          </w:p>
-        </w:tc>
-      </w:tr>
-      <w:tr>
-        <w:tc>
-          <w:tcPr>
-            <w:tcW w:type="dxa" w:w="1928"/>
-            <w:tcMar>
-              <w:top w:w="124" w:type="dxa"/>
-              <w:left w:w="124" w:type="dxa"/>
-              <w:bottom w:w="124" w:type="dxa"/>
-              <w:right w:w="124" w:type="dxa"/>
-            </w:tcMar>
-            <w:shd w:val="clear" w:color="auto" w:fill="FBF3E1"/>
-            <w:tcBorders>
-              <w:top w:val="nil"/>
-              <w:left w:val="nil"/>
-              <w:bottom w:val="single" w:sz="4" w:color="D9DEE4"/>
-              <w:right w:val="nil"/>
-            </w:tcBorders>
-          </w:tcPr>
-          <w:p>
-            <w:pPr>
-              <w:spacing w:after="40"/>
-            </w:pPr>
-            <w:r>
-              <w:rPr>
-                <w:rFonts w:ascii="Montserrat" w:hAnsi="Montserrat" w:eastAsia="Montserrat"/>
-                <w:b/>
-                <w:i w:val="0"/>
-                <w:color w:val="1B365D"/>
-                <w:sz w:val="19"/>
-              </w:rPr>
-              <w:t>Jardín Ceremonial</w:t>
-            </w:r>
-          </w:p>
-        </w:tc>
-        <w:tc>
-          <w:tcPr>
-            <w:tcW w:type="dxa" w:w="794"/>
-            <w:tcMar>
-              <w:top w:w="124" w:type="dxa"/>
-              <w:left w:w="124" w:type="dxa"/>
-              <w:bottom w:w="124" w:type="dxa"/>
-              <w:right w:w="124" w:type="dxa"/>
-            </w:tcMar>
-            <w:shd w:val="clear" w:color="auto" w:fill="FBF3E1"/>
-            <w:tcBorders>
-              <w:top w:val="nil"/>
-              <w:left w:val="nil"/>
-              <w:bottom w:val="single" w:sz="4" w:color="D9DEE4"/>
-              <w:right w:val="nil"/>
-            </w:tcBorders>
-          </w:tcPr>
-          <w:p>
-            <w:pPr>
-              <w:spacing w:after="40"/>
-            </w:pPr>
-            <w:r>
-              <w:rPr>
-                <w:rFonts w:ascii="Montserrat" w:hAnsi="Montserrat" w:eastAsia="Montserrat"/>
-                <w:b w:val="0"/>
-                <w:i w:val="0"/>
-                <w:color w:val="2C3E50"/>
-                <w:sz w:val="19"/>
-              </w:rPr>
-              <w:t>A definir</w:t>
-            </w:r>
-          </w:p>
-        </w:tc>
-        <w:tc>
-          <w:tcPr>
-            <w:tcW w:type="dxa" w:w="1474"/>
-            <w:tcMar>
-              <w:top w:w="124" w:type="dxa"/>
-              <w:left w:w="124" w:type="dxa"/>
-              <w:bottom w:w="124" w:type="dxa"/>
-              <w:right w:w="124" w:type="dxa"/>
-            </w:tcMar>
-            <w:shd w:val="clear" w:color="auto" w:fill="FBF3E1"/>
-            <w:tcBorders>
-              <w:top w:val="nil"/>
-              <w:left w:val="nil"/>
-              <w:bottom w:val="single" w:sz="4" w:color="D9DEE4"/>
-              <w:right w:val="nil"/>
-            </w:tcBorders>
-          </w:tcPr>
-          <w:p>
-            <w:pPr>
-              <w:spacing w:after="40"/>
-            </w:pPr>
-            <w:r>
-              <w:rPr>
-                <w:rFonts w:ascii="Montserrat" w:hAnsi="Montserrat" w:eastAsia="Montserrat"/>
-                <w:b w:val="0"/>
-                <w:i w:val="0"/>
-                <w:color w:val="2C3E50"/>
-                <w:sz w:val="19"/>
-              </w:rPr>
-              <w:t>—</w:t>
-            </w:r>
-          </w:p>
-        </w:tc>
-        <w:tc>
-          <w:tcPr>
-            <w:tcW w:type="dxa" w:w="3175"/>
-            <w:tcMar>
-              <w:top w:w="124" w:type="dxa"/>
-              <w:left w:w="124" w:type="dxa"/>
-              <w:bottom w:w="124" w:type="dxa"/>
-              <w:right w:w="124" w:type="dxa"/>
-            </w:tcMar>
-            <w:shd w:val="clear" w:color="auto" w:fill="FBF3E1"/>
-            <w:tcBorders>
-              <w:top w:val="nil"/>
-              <w:left w:val="nil"/>
-              <w:bottom w:val="single" w:sz="4" w:color="D9DEE4"/>
-              <w:right w:val="nil"/>
-            </w:tcBorders>
-          </w:tcPr>
-          <w:p>
-            <w:pPr>
-              <w:spacing w:after="40"/>
-            </w:pPr>
-            <w:r>
-              <w:rPr>
-                <w:rFonts w:ascii="Montserrat" w:hAnsi="Montserrat" w:eastAsia="Montserrat"/>
-                <w:b w:val="0"/>
-                <w:i w:val="0"/>
-                <w:color w:val="2C3E50"/>
-                <w:sz w:val="19"/>
-              </w:rPr>
-              <w:t>—</w:t>
-            </w:r>
-          </w:p>
-        </w:tc>
-        <w:tc>
-          <w:tcPr>
-            <w:tcW w:type="dxa" w:w="2268"/>
-            <w:tcMar>
-              <w:top w:w="124" w:type="dxa"/>
-              <w:left w:w="124" w:type="dxa"/>
-              <w:bottom w:w="124" w:type="dxa"/>
-              <w:right w:w="124" w:type="dxa"/>
-            </w:tcMar>
-            <w:shd w:val="clear" w:color="auto" w:fill="FBF3E1"/>
-            <w:tcBorders>
-              <w:top w:val="nil"/>
-              <w:left w:val="nil"/>
-              <w:bottom w:val="single" w:sz="4" w:color="D9DEE4"/>
-              <w:right w:val="nil"/>
-            </w:tcBorders>
-          </w:tcPr>
-          <w:p>
-            <w:pPr>
-              <w:spacing w:after="40"/>
-            </w:pPr>
-            <w:r>
-              <w:rPr>
-                <w:rFonts w:ascii="Montserrat" w:hAnsi="Montserrat" w:eastAsia="Montserrat"/>
-                <w:b w:val="0"/>
-                <w:i w:val="0"/>
-                <w:color w:val="2C3E50"/>
-                <w:sz w:val="19"/>
-              </w:rPr>
-              <w:t>—</w:t>
-            </w:r>
-          </w:p>
-        </w:tc>
-      </w:tr>
-      <w:tr>
-        <w:tc>
-          <w:tcPr>
-            <w:tcW w:type="dxa" w:w="1928"/>
-            <w:tcMar>
-              <w:top w:w="124" w:type="dxa"/>
-              <w:left w:w="124" w:type="dxa"/>
-              <w:bottom w:w="124" w:type="dxa"/>
-              <w:right w:w="124" w:type="dxa"/>
-            </w:tcMar>
-            <w:shd w:val="clear" w:color="auto" w:fill="FBF3E1"/>
-            <w:tcBorders>
-              <w:top w:val="nil"/>
-              <w:left w:val="nil"/>
-              <w:bottom w:val="single" w:sz="4" w:color="D9DEE4"/>
-              <w:right w:val="nil"/>
-            </w:tcBorders>
-          </w:tcPr>
-          <w:p>
-            <w:pPr>
-              <w:spacing w:after="40"/>
-            </w:pPr>
-            <w:r>
-              <w:rPr>
-                <w:rFonts w:ascii="Montserrat" w:hAnsi="Montserrat" w:eastAsia="Montserrat"/>
-                <w:b/>
-                <w:i w:val="0"/>
-                <w:color w:val="1B365D"/>
-                <w:sz w:val="19"/>
-              </w:rPr>
-              <w:t>Portafolio existente (columbarios)</w:t>
-            </w:r>
-          </w:p>
-        </w:tc>
-        <w:tc>
-          <w:tcPr>
-            <w:tcW w:type="dxa" w:w="794"/>
-            <w:tcMar>
-              <w:top w:w="124" w:type="dxa"/>
-              <w:left w:w="124" w:type="dxa"/>
-              <w:bottom w:w="124" w:type="dxa"/>
-              <w:right w:w="124" w:type="dxa"/>
-            </w:tcMar>
-            <w:shd w:val="clear" w:color="auto" w:fill="FBF3E1"/>
-            <w:tcBorders>
-              <w:top w:val="nil"/>
-              <w:left w:val="nil"/>
-              <w:bottom w:val="single" w:sz="4" w:color="D9DEE4"/>
-              <w:right w:val="nil"/>
-            </w:tcBorders>
-          </w:tcPr>
-          <w:p>
-            <w:pPr>
-              <w:spacing w:after="40"/>
-            </w:pPr>
-            <w:r>
-              <w:rPr>
-                <w:rFonts w:ascii="Montserrat" w:hAnsi="Montserrat" w:eastAsia="Montserrat"/>
-                <w:b w:val="0"/>
-                <w:i w:val="0"/>
-                <w:color w:val="2C3E50"/>
-                <w:sz w:val="19"/>
-              </w:rPr>
-              <w:t>A definir</w:t>
-            </w:r>
-          </w:p>
-        </w:tc>
-        <w:tc>
-          <w:tcPr>
-            <w:tcW w:type="dxa" w:w="1474"/>
-            <w:tcMar>
-              <w:top w:w="124" w:type="dxa"/>
-              <w:left w:w="124" w:type="dxa"/>
-              <w:bottom w:w="124" w:type="dxa"/>
-              <w:right w:w="124" w:type="dxa"/>
-            </w:tcMar>
-            <w:shd w:val="clear" w:color="auto" w:fill="FBF3E1"/>
-            <w:tcBorders>
-              <w:top w:val="nil"/>
-              <w:left w:val="nil"/>
-              <w:bottom w:val="single" w:sz="4" w:color="D9DEE4"/>
-              <w:right w:val="nil"/>
-            </w:tcBorders>
-          </w:tcPr>
-          <w:p>
-            <w:pPr>
-              <w:spacing w:after="40"/>
-            </w:pPr>
-            <w:r>
-              <w:rPr>
-                <w:rFonts w:ascii="Montserrat" w:hAnsi="Montserrat" w:eastAsia="Montserrat"/>
-                <w:b w:val="0"/>
-                <w:i w:val="0"/>
-                <w:color w:val="2C3E50"/>
-                <w:sz w:val="19"/>
-              </w:rPr>
-              <w:t>—</w:t>
-            </w:r>
-          </w:p>
-        </w:tc>
-        <w:tc>
-          <w:tcPr>
-            <w:tcW w:type="dxa" w:w="3175"/>
-            <w:tcMar>
-              <w:top w:w="124" w:type="dxa"/>
-              <w:left w:w="124" w:type="dxa"/>
-              <w:bottom w:w="124" w:type="dxa"/>
-              <w:right w:w="124" w:type="dxa"/>
-            </w:tcMar>
-            <w:shd w:val="clear" w:color="auto" w:fill="FBF3E1"/>
-            <w:tcBorders>
-              <w:top w:val="nil"/>
-              <w:left w:val="nil"/>
-              <w:bottom w:val="single" w:sz="4" w:color="D9DEE4"/>
-              <w:right w:val="nil"/>
-            </w:tcBorders>
-          </w:tcPr>
-          <w:p>
-            <w:pPr>
-              <w:spacing w:after="40"/>
-            </w:pPr>
-            <w:r>
-              <w:rPr>
-                <w:rFonts w:ascii="Montserrat" w:hAnsi="Montserrat" w:eastAsia="Montserrat"/>
-                <w:b w:val="0"/>
-                <w:i w:val="0"/>
-                <w:color w:val="2C3E50"/>
-                <w:sz w:val="19"/>
-              </w:rPr>
-              <w:t>Sistema de comisión propio, en preparación</w:t>
-            </w:r>
-          </w:p>
-        </w:tc>
-        <w:tc>
-          <w:tcPr>
-            <w:tcW w:type="dxa" w:w="2268"/>
-            <w:tcMar>
-              <w:top w:w="124" w:type="dxa"/>
-              <w:left w:w="124" w:type="dxa"/>
-              <w:bottom w:w="124" w:type="dxa"/>
-              <w:right w:w="124" w:type="dxa"/>
-            </w:tcMar>
-            <w:shd w:val="clear" w:color="auto" w:fill="FBF3E1"/>
-            <w:tcBorders>
-              <w:top w:val="nil"/>
-              <w:left w:val="nil"/>
-              <w:bottom w:val="single" w:sz="4" w:color="D9DEE4"/>
-              <w:right w:val="nil"/>
-            </w:tcBorders>
-          </w:tcPr>
-          <w:p>
-            <w:pPr>
-              <w:spacing w:after="40"/>
-            </w:pPr>
-            <w:r>
-              <w:rPr>
-                <w:rFonts w:ascii="Montserrat" w:hAnsi="Montserrat" w:eastAsia="Montserrat"/>
-                <w:b w:val="0"/>
-                <w:i w:val="0"/>
-                <w:color w:val="2C3E50"/>
-                <w:sz w:val="19"/>
-              </w:rPr>
-              <w:t>—</w:t>
             </w:r>
           </w:p>
         </w:tc>
@@ -18320,7 +17879,7 @@
           <w:color w:val="2C3E50"/>
           <w:sz w:val="21"/>
         </w:rPr>
-        <w:t>Base de cálculo: valor efectivamente cobrado al cliente, sin IVA (13%).</w:t>
+        <w:t>1 venta en el mes = 8%; 2 ventas = 10%; 3 o más = 12%, sobre toda la facturación del mes.</w:t>
       </w:r>
     </w:p>
     <w:p>
@@ -18346,7 +17905,7 @@
           <w:color w:val="2C3E50"/>
           <w:sz w:val="21"/>
         </w:rPr>
-        <w:t>Comisión única de 8% para todos los productos.</w:t>
+        <w:t>Cuenta cualquier producto de cremación (nuevos y columbarios): cada contrato es 1 venta.</w:t>
       </w:r>
     </w:p>
     <w:p>
@@ -18372,7 +17931,7 @@
           <w:color w:val="2C3E50"/>
           <w:sz w:val="21"/>
         </w:rPr>
-        <w:t>No generan comisión: cuotas de mantenimiento anual (US$ 15 / US$ 24).</w:t>
+        <w:t>Base de cálculo: facturación sin IVA (13%), neta de descuentos; se paga sobre lo cobrado.</w:t>
       </w:r>
     </w:p>
     <w:p>
@@ -18398,7 +17957,7 @@
           <w:color w:val="2C3E50"/>
           <w:sz w:val="21"/>
         </w:rPr>
-        <w:t>Bono de venta combinada: US$ 15 al vender la Solución Modular junto con cualquier jardín.</w:t>
+        <w:t>Mismo criterio para call center, contratados y freelancers. Sin bonos adicionales.</w:t>
       </w:r>
     </w:p>
     <w:p>
@@ -18424,7 +17983,7 @@
           <w:color w:val="2C3E50"/>
           <w:sz w:val="21"/>
         </w:rPr>
-        <w:t>Acelerador Día de los Muertos (opcional): +2 pp en Individual y Ecológico hasta el 30/11/2026.</w:t>
+        <w:t>Venta compartida (call center agenda, otro cierra): 1 venta para ambos; comisión 30% / 70%.</w:t>
       </w:r>
     </w:p>
     <w:p>
@@ -18450,7 +18009,7 @@
           <w:color w:val="2C3E50"/>
           <w:sz w:val="21"/>
         </w:rPr>
-        <w:t>Estorno: la comisión se descuenta de los pagos siguientes al asesor.</w:t>
+        <w:t>No cuentan ni comisionan: cuotas de mantenimiento anual (US$ 15 / US$ 24).</w:t>
       </w:r>
     </w:p>
     <w:p>
@@ -18476,7 +18035,7 @@
           <w:color w:val="2C3E50"/>
           <w:sz w:val="21"/>
         </w:rPr>
-        <w:t>Portafolio existente (columbarios): la comisión se definirá en un sistema propio, en preparación.</w:t>
+        <w:t>Estorno: la comisión se descuenta de los pagos siguientes al asesor; ventas anuladas no cuentan.</w:t>
       </w:r>
     </w:p>
     <w:p>

</xml_diff>

<commit_message>
Comisiones: nombre "Política de comisiones de los productos de cremación"
Quita las menciones a "aprobada"/"Propuesta" y renombra la pestaña de la ficha técnica a "Política de Comisiones".

Co-Authored-By: Claude Opus 5.5 <noreply@anthropic.com>
Claude-Session: https://claude.ai/code/session_0111i7vn9WWo4QxCQbucWbrF
</commit_message>
<xml_diff>
--- a/playbook/salida/Playbook_Comercial_Cremacion_Vangrupo.docx
+++ b/playbook/salida/Playbook_Comercial_Cremacion_Vangrupo.docx
@@ -285,7 +285,7 @@
                 <w:color w:val="2C3E50"/>
                 <w:sz w:val="20"/>
               </w:rPr>
-              <w:t>Política de comisiones 2026 (aprobada): 1 venta en el mes = 8%, 2 ventas = 10%, 3 o más = 12% sobre la facturación.</w:t>
+              <w:t>Política de comisiones de los productos de cremación: 1 venta en el mes = 8%, 2 ventas = 10%, 3 o más = 12% sobre la facturación.</w:t>
             </w:r>
           </w:p>
           <w:p>
@@ -830,7 +830,7 @@
                 <w:color w:val="1B365D"/>
                 <w:sz w:val="24"/>
               </w:rPr>
-              <w:t>Política de comisiones 2026</w:t>
+              <w:t>Política de comisiones de los productos de cremación</w:t>
             </w:r>
           </w:p>
         </w:tc>
@@ -16649,7 +16649,7 @@
           <w:color w:val="1B365D"/>
           <w:sz w:val="48"/>
         </w:rPr>
-        <w:t>Política de comisiones 2026</w:t>
+        <w:t>Política de comisiones de los productos de cremación</w:t>
       </w:r>
     </w:p>
     <w:p>
@@ -16721,7 +16721,7 @@
                 <w:color w:val="2C3E50"/>
                 <w:sz w:val="21"/>
               </w:rPr>
-              <w:t>Política de comisiones 2026, aprobada. El porcentaje depende de cuántas ventas de cremación cierra el asesor en el mes (cualquier producto: Solución Modular, jardines o columbarios) y se aplica sobre toda la facturación del mes, sin IVA.</w:t>
+              <w:t>Vigente en 2026 para todos los productos de cremación. El porcentaje depende de cuántas ventas de cremación cierra el asesor en el mes (cualquier producto: Solución Modular, jardines o columbarios) y se aplica sobre toda la facturación del mes, sin IVA.</w:t>
             </w:r>
           </w:p>
         </w:tc>

</xml_diff>

<commit_message>
Playbook: todo el portafolio de cremación y sin producto por equipo
Incluye los columbarios existentes en la introducción, perfiles, objeciones, herramientas y checklist; la sección de equipos ya no asigna productos por canal.

Co-Authored-By: Claude Opus 5.5 <noreply@anthropic.com>
Claude-Session: https://claude.ai/code/session_0111i7vn9WWo4QxCQbucWbrF
</commit_message>
<xml_diff>
--- a/playbook/salida/Playbook_Comercial_Cremacion_Vangrupo.docx
+++ b/playbook/salida/Playbook_Comercial_Cremacion_Vangrupo.docx
@@ -120,7 +120,7 @@
                 <w:color w:val="E8EDF3"/>
                 <w:sz w:val="32"/>
               </w:rPr>
-              <w:t>Portafolio de Cremación y Jardines de Cenizas</w:t>
+              <w:t>Portafolio de Cremación: lanzamientos y columbarios</w:t>
             </w:r>
           </w:p>
           <w:p>
@@ -211,7 +211,7 @@
           <w:color w:val="2C3E50"/>
           <w:sz w:val="21"/>
         </w:rPr>
-        <w:t>Este playbook es la referencia única del equipo comercial para el portafolio de cremación y jardines de cenizas. Reúne reglas, precios, discurso por producto, manejo de objeciones y política de comisiones. Se revisa cada trimestre con la Gerencia Comercial. Si algo cambia en la Ficha Técnica, este documento se actualiza.</w:t>
+        <w:t>Este playbook es la referencia única del equipo comercial para todo el portafolio de cremación: los lanzamientos de Finados (Solución Modular y jardines de cenizas) y los columbarios que ya vendemos. Reúne reglas, precios, discurso por producto, manejo de objeciones y política de comisiones. Se revisa cada trimestre con la Gerencia Comercial. Si algo cambia en la Ficha Técnica, este documento se actualiza.</w:t>
       </w:r>
     </w:p>
     <w:tbl>
@@ -953,7 +953,7 @@
           <w:color w:val="2C3E50"/>
           <w:sz w:val="21"/>
         </w:rPr>
-        <w:t>En La Auxiliadora, Hogar de las Memorias y Parque Memorial Las Colinas, empresas de Vangrupo, no vendemos nichos, parcelas ni servicios: acompañamos a las familias salvadoreñas a honrar la memoria de quienes aman. La cremación es una decisión cada vez más elegida, y nuestros nuevos jardines de cenizas responden a una pregunta que muchas familias se hacen y pocas se atreven a decir: "¿y después de la cremación, dónde las visitamos?".</w:t>
+        <w:t>En La Auxiliadora, Hogar de las Memorias y Parque Memorial Las Colinas, empresas de Vangrupo, no vendemos nichos, parcelas ni servicios: acompañamos a las familias salvadoreñas a honrar la memoria de quienes aman. La cremación es una decisión cada vez más elegida, y nuestros nuevos jardines de cenizas responden a una pregunta que muchas familias se hacen y pocas se atreven a decir: "¿y después de la cremación, dónde las visitamos?". A los nuevos jardines se suman los columbarios que ya ofrecemos en El Hogar de las Memorias y en el mausoleo Bella Vista.</w:t>
       </w:r>
     </w:p>
     <w:p>
@@ -1087,7 +1087,7 @@
                 <w:color w:val="2C3E50"/>
                 <w:sz w:val="20"/>
               </w:rPr>
-              <w:t>La familia tiene un sitio físico, digno y verde para visitar y recordar.</w:t>
+              <w:t>La familia tiene un sitio físico y digno para visitar y recordar: un jardín o un columbario.</w:t>
             </w:r>
           </w:p>
         </w:tc>
@@ -1758,7 +1758,7 @@
                 <w:color w:val="2C3E50"/>
                 <w:sz w:val="19"/>
               </w:rPr>
-              <w:t>Solución Modular · Jardín Individual · Jardín Familiar</w:t>
+              <w:t>Solución Modular · Jardín Individual o Familiar · Columbario Mármol o Cristal, Ónix u Obra de Arte</w:t>
             </w:r>
           </w:p>
         </w:tc>
@@ -1925,7 +1925,7 @@
                 <w:color w:val="2C3E50"/>
                 <w:sz w:val="19"/>
               </w:rPr>
-              <w:t>Solución Modular · Jardín Familiar</w:t>
+              <w:t>Solución Modular · Jardín Familiar · Columbario Supremo Plus</w:t>
             </w:r>
           </w:p>
         </w:tc>
@@ -2092,7 +2092,7 @@
                 <w:color w:val="2C3E50"/>
                 <w:sz w:val="19"/>
               </w:rPr>
-              <w:t>Jardín Individual · Jardín Ecológico</w:t>
+              <w:t>Supremo Plus o Bella Vista (incluyen la cremación) · Jardín Individual o Ecológico</w:t>
             </w:r>
           </w:p>
         </w:tc>
@@ -2688,7 +2688,7 @@
           <w:color w:val="1B365D"/>
           <w:sz w:val="28"/>
         </w:rPr>
-        <w:t>Qué producto lleva cada equipo</w:t>
+        <w:t>Equipos de venta</w:t>
       </w:r>
     </w:p>
     <w:p>
@@ -2699,7 +2699,7 @@
       <w:r>
         <w:drawing>
           <wp:inline xmlns:a="http://schemas.openxmlformats.org/drawingml/2006/main" xmlns:pic="http://schemas.openxmlformats.org/drawingml/2006/picture">
-            <wp:extent cx="6120000" cy="2062312"/>
+            <wp:extent cx="6120000" cy="1753125"/>
             <wp:docPr id="5" name="Picture 5"/>
             <wp:cNvGraphicFramePr>
               <a:graphicFrameLocks noChangeAspect="1"/>
@@ -2720,7 +2720,7 @@
                   <pic:spPr>
                     <a:xfrm>
                       <a:off x="0" y="0"/>
-                      <a:ext cx="6120000" cy="2062312"/>
+                      <a:ext cx="6120000" cy="1753125"/>
                     </a:xfrm>
                     <a:prstGeom prst="rect"/>
                   </pic:spPr>
@@ -2744,7 +2744,7 @@
           <w:color w:val="7A8794"/>
           <w:sz w:val="17"/>
         </w:rPr>
-        <w:t>Figura 4 · Enfoque de producto por canal.</w:t>
+        <w:t>Figura 4 · Todos los equipos venden todo el portafolio de cremación (Solución Modular, jardines de cenizas y columbarios), con la misma política de comisiones.</w:t>
       </w:r>
     </w:p>
     <w:p>
@@ -11992,7 +11992,7 @@
                 <w:color w:val="2C3E50"/>
                 <w:sz w:val="20"/>
               </w:rPr>
-              <w:t>La Iglesia Católica permite la cremación desde 1963. Lo que pide es que las cenizas reposen en un lugar dedicado, como el cementerio, y no en casa ni dispersas. Nuestros jardines cumplen exactamente con eso.</w:t>
+              <w:t>La Iglesia Católica permite la cremación desde 1963. Lo que pide es que las cenizas reposen en un lugar dedicado, como el cementerio, y no en casa ni dispersas. Nuestros jardines y columbarios cumplen exactamente con eso.</w:t>
             </w:r>
           </w:p>
         </w:tc>
@@ -12548,7 +12548,7 @@
                 <w:color w:val="2C3E50"/>
                 <w:sz w:val="20"/>
               </w:rPr>
-              <w:t>En la urgencia los costos son mayores y se pagan de golpe. Hoy fija el precio y lo paga en cuotas: la Solución Modular se paga en hasta 120 meses.</w:t>
+              <w:t>En la urgencia los costos son mayores y se pagan de golpe. Hoy fija el precio y lo paga en cuotas: la Solución Modular y los columbarios se pagan en hasta 120 meses.</w:t>
             </w:r>
           </w:p>
         </w:tc>
@@ -13104,7 +13104,7 @@
                 <w:color w:val="2C3E50"/>
                 <w:sz w:val="20"/>
               </w:rPr>
-              <w:t>En el jardín toda la familia puede visitarlas, quedan protegidas ante mudanzas o cambios, y tienen un lugar con su nombre.</w:t>
+              <w:t>En el jardín o en el columbario toda la familia puede visitarlas, quedan protegidas ante mudanzas o cambios, y tienen un lugar con su nombre.</w:t>
             </w:r>
           </w:p>
         </w:tc>
@@ -13181,7 +13181,7 @@
                 <w:color w:val="2C3E50"/>
                 <w:sz w:val="20"/>
               </w:rPr>
-              <w:t>"¿Le gustaría visitar el jardín antes de decidir?"</w:t>
+              <w:t>"¿Le gustaría visitar el jardín o el columbario antes de decidir?"</w:t>
             </w:r>
           </w:p>
         </w:tc>
@@ -13660,7 +13660,7 @@
                 <w:color w:val="2C3E50"/>
                 <w:sz w:val="20"/>
               </w:rPr>
-              <w:t>Somos La Auxiliadora, Hogar de las Memorias y Las Colinas, empresas de Vangrupo con trayectoria en El Salvador. El contrato es transparente y puede visitar el jardín cuando quiera.</w:t>
+              <w:t>Somos La Auxiliadora, Hogar de las Memorias y Las Colinas, empresas de Vangrupo con trayectoria en El Salvador. El contrato es transparente y puede visitar el jardín o el columbario cuando quiera.</w:t>
             </w:r>
           </w:p>
         </w:tc>
@@ -18319,7 +18319,7 @@
                 <w:color w:val="1B365D"/>
                 <w:sz w:val="19"/>
               </w:rPr>
-              <w:t>Visita al jardín</w:t>
+              <w:t>Visita al jardín o al columbario</w:t>
             </w:r>
           </w:p>
         </w:tc>
@@ -18630,7 +18630,7 @@
           <w:color w:val="2C3E50"/>
           <w:sz w:val="21"/>
         </w:rPr>
-        <w:t>Expliqué la cuota de mantenimiento y el plazo (30 años renovables o 3 años), según el caso.</w:t>
+        <w:t>Expliqué la cuota de mantenimiento y el plazo (30 años renovables o 3 años) o, en columbarios, la ubicación (definida o a futuro).</w:t>
       </w:r>
     </w:p>
     <w:p>

</xml_diff>

<commit_message>
Playbook: figura del portafolio con lanzamientos y columbarios
Co-Authored-By: Claude Opus 5.5 <noreply@anthropic.com>
Claude-Session: https://claude.ai/code/session_0111i7vn9WWo4QxCQbucWbrF
</commit_message>
<xml_diff>
--- a/playbook/salida/Playbook_Comercial_Cremacion_Vangrupo.docx
+++ b/playbook/salida/Playbook_Comercial_Cremacion_Vangrupo.docx
@@ -964,7 +964,7 @@
       <w:r>
         <w:drawing>
           <wp:inline xmlns:a="http://schemas.openxmlformats.org/drawingml/2006/main" xmlns:pic="http://schemas.openxmlformats.org/drawingml/2006/picture">
-            <wp:extent cx="6120000" cy="2766750"/>
+            <wp:extent cx="6120000" cy="2428875"/>
             <wp:docPr id="2" name="Picture 2"/>
             <wp:cNvGraphicFramePr>
               <a:graphicFrameLocks noChangeAspect="1"/>
@@ -985,7 +985,7 @@
                   <pic:spPr>
                     <a:xfrm>
                       <a:off x="0" y="0"/>
-                      <a:ext cx="6120000" cy="2766750"/>
+                      <a:ext cx="6120000" cy="2428875"/>
                     </a:xfrm>
                     <a:prstGeom prst="rect"/>
                   </pic:spPr>

</xml_diff>